<commit_message>
Add Digital Transformation article, SVG client logos, DEPLOYMENT.md, insights filtering, and article docs
</commit_message>
<xml_diff>
--- a/docs/Articles.docx
+++ b/docs/Articles.docx
@@ -28,7 +28,7 @@
     <w:p>
       <w:r>
         <w:pict w14:anchorId="4F4810A4">
-          <v:rect id="_x0000_i1054" style="width:0;height:0" o:hralign="center" o:hrstd="t" o:hr="t" fillcolor="#a0a0a0" stroked="f"/>
+          <v:rect id="_x0000_i1025" style="width:0;height:0" o:hralign="center" o:hrstd="t" o:hr="t" fillcolor="#a0a0a0" stroked="f"/>
         </w:pict>
       </w:r>
     </w:p>
@@ -58,7 +58,7 @@
     <w:p>
       <w:r>
         <w:pict w14:anchorId="1AB34C41">
-          <v:rect id="_x0000_i1055" style="width:0;height:0" o:hralign="center" o:hrstd="t" o:hr="t" fillcolor="#a0a0a0" stroked="f"/>
+          <v:rect id="_x0000_i1026" style="width:0;height:0" o:hralign="center" o:hrstd="t" o:hr="t" fillcolor="#a0a0a0" stroked="f"/>
         </w:pict>
       </w:r>
     </w:p>
@@ -67,322 +67,767 @@
         <w:rPr>
           <w:b/>
           <w:bCs/>
+          <w:highlight w:val="green"/>
         </w:rPr>
       </w:pPr>
       <w:r>
         <w:rPr>
           <w:b/>
           <w:bCs/>
+          <w:highlight w:val="green"/>
         </w:rPr>
         <w:t>Brief #1</w:t>
       </w:r>
     </w:p>
     <w:p>
-      <w:r>
+      <w:pPr>
+        <w:rPr>
+          <w:highlight w:val="green"/>
+        </w:rPr>
+      </w:pPr>
+      <w:r>
+        <w:rPr>
+          <w:highlight w:val="green"/>
+        </w:rPr>
         <w:t>====================================================</w:t>
       </w:r>
     </w:p>
     <w:p>
+      <w:pPr>
+        <w:rPr>
+          <w:highlight w:val="green"/>
+        </w:rPr>
+      </w:pPr>
       <w:r>
         <w:rPr>
           <w:rFonts w:ascii="Segoe UI Emoji" w:hAnsi="Segoe UI Emoji" w:cs="Segoe UI Emoji"/>
+          <w:highlight w:val="green"/>
         </w:rPr>
         <w:t>📋</w:t>
       </w:r>
       <w:r>
+        <w:rPr>
+          <w:highlight w:val="green"/>
+        </w:rPr>
         <w:t xml:space="preserve"> NEW ARTICLE BRIEF</w:t>
       </w:r>
     </w:p>
     <w:p>
-      <w:r>
+      <w:pPr>
+        <w:rPr>
+          <w:highlight w:val="green"/>
+        </w:rPr>
+      </w:pPr>
+      <w:r>
+        <w:rPr>
+          <w:highlight w:val="green"/>
+        </w:rPr>
         <w:t>====================================================</w:t>
       </w:r>
     </w:p>
-    <w:p/>
-    <w:p>
-      <w:r>
+    <w:p>
+      <w:pPr>
+        <w:rPr>
+          <w:highlight w:val="green"/>
+        </w:rPr>
+      </w:pPr>
+    </w:p>
+    <w:p>
+      <w:pPr>
+        <w:rPr>
+          <w:highlight w:val="green"/>
+        </w:rPr>
+      </w:pPr>
+      <w:r>
+        <w:rPr>
+          <w:highlight w:val="green"/>
+        </w:rPr>
         <w:t xml:space="preserve">Title Idea       </w:t>
       </w:r>
       <w:proofErr w:type="gramStart"/>
       <w:r>
-        <w:t xml:space="preserve">  :</w:t>
-      </w:r>
-      <w:proofErr w:type="gramEnd"/>
-      <w:r>
+        <w:rPr>
+          <w:highlight w:val="green"/>
+        </w:rPr>
+        <w:t xml:space="preserve">  :</w:t>
+      </w:r>
+      <w:proofErr w:type="gramEnd"/>
+      <w:r>
+        <w:rPr>
+          <w:highlight w:val="green"/>
+        </w:rPr>
         <w:t xml:space="preserve"> The MENA M&amp;A Boom: What Business</w:t>
       </w:r>
     </w:p>
     <w:p>
-      <w:r>
+      <w:pPr>
+        <w:rPr>
+          <w:highlight w:val="green"/>
+        </w:rPr>
+      </w:pPr>
+      <w:r>
+        <w:rPr>
+          <w:highlight w:val="green"/>
+        </w:rPr>
         <w:t xml:space="preserve">                     Owners Need to Know Before Selling</w:t>
       </w:r>
     </w:p>
-    <w:p/>
-    <w:p>
-      <w:r>
+    <w:p>
+      <w:pPr>
+        <w:rPr>
+          <w:highlight w:val="green"/>
+        </w:rPr>
+      </w:pPr>
+    </w:p>
+    <w:p>
+      <w:pPr>
+        <w:rPr>
+          <w:highlight w:val="green"/>
+        </w:rPr>
+      </w:pPr>
+      <w:r>
+        <w:rPr>
+          <w:highlight w:val="green"/>
+        </w:rPr>
         <w:t xml:space="preserve">Primary Service  </w:t>
       </w:r>
       <w:proofErr w:type="gramStart"/>
       <w:r>
-        <w:t xml:space="preserve">  :</w:t>
-      </w:r>
-      <w:proofErr w:type="gramEnd"/>
-      <w:r>
+        <w:rPr>
+          <w:highlight w:val="green"/>
+        </w:rPr>
+        <w:t xml:space="preserve">  :</w:t>
+      </w:r>
+      <w:proofErr w:type="gramEnd"/>
+      <w:r>
+        <w:rPr>
+          <w:highlight w:val="green"/>
+        </w:rPr>
         <w:t xml:space="preserve"> M&amp;A Advisory</w:t>
       </w:r>
     </w:p>
-    <w:p/>
-    <w:p>
-      <w:r>
+    <w:p>
+      <w:pPr>
+        <w:rPr>
+          <w:highlight w:val="green"/>
+        </w:rPr>
+      </w:pPr>
+    </w:p>
+    <w:p>
+      <w:pPr>
+        <w:rPr>
+          <w:highlight w:val="green"/>
+        </w:rPr>
+      </w:pPr>
+      <w:r>
+        <w:rPr>
+          <w:highlight w:val="green"/>
+        </w:rPr>
         <w:t xml:space="preserve">Target Audience  </w:t>
       </w:r>
       <w:proofErr w:type="gramStart"/>
       <w:r>
-        <w:t xml:space="preserve">  :</w:t>
-      </w:r>
-      <w:proofErr w:type="gramEnd"/>
-      <w:r>
+        <w:rPr>
+          <w:highlight w:val="green"/>
+        </w:rPr>
+        <w:t xml:space="preserve">  :</w:t>
+      </w:r>
+      <w:proofErr w:type="gramEnd"/>
+      <w:r>
+        <w:rPr>
+          <w:highlight w:val="green"/>
+        </w:rPr>
         <w:t xml:space="preserve"> Business owners and CEOs of mid-to-</w:t>
       </w:r>
     </w:p>
     <w:p>
-      <w:r>
+      <w:pPr>
+        <w:rPr>
+          <w:highlight w:val="green"/>
+        </w:rPr>
+      </w:pPr>
+      <w:r>
+        <w:rPr>
+          <w:highlight w:val="green"/>
+        </w:rPr>
         <w:t xml:space="preserve">                     large companies in the GCC</w:t>
       </w:r>
     </w:p>
     <w:p>
-      <w:r>
+      <w:pPr>
+        <w:rPr>
+          <w:highlight w:val="green"/>
+        </w:rPr>
+      </w:pPr>
+      <w:r>
+        <w:rPr>
+          <w:highlight w:val="green"/>
+        </w:rPr>
         <w:t xml:space="preserve">                     considering an exit or merger</w:t>
       </w:r>
     </w:p>
-    <w:p/>
-    <w:p>
-      <w:r>
+    <w:p>
+      <w:pPr>
+        <w:rPr>
+          <w:highlight w:val="green"/>
+        </w:rPr>
+      </w:pPr>
+    </w:p>
+    <w:p>
+      <w:pPr>
+        <w:rPr>
+          <w:highlight w:val="green"/>
+        </w:rPr>
+      </w:pPr>
+      <w:r>
+        <w:rPr>
+          <w:highlight w:val="green"/>
+        </w:rPr>
         <w:t xml:space="preserve">MENA Country </w:t>
       </w:r>
       <w:proofErr w:type="gramStart"/>
       <w:r>
+        <w:rPr>
+          <w:highlight w:val="green"/>
+        </w:rPr>
         <w:t>Focus :</w:t>
       </w:r>
       <w:proofErr w:type="gramEnd"/>
       <w:r>
+        <w:rPr>
+          <w:highlight w:val="green"/>
+        </w:rPr>
         <w:t xml:space="preserve"> Pan-MENA (Primary focus: UAE &amp; KSA)</w:t>
       </w:r>
     </w:p>
-    <w:p/>
-    <w:p>
-      <w:r>
+    <w:p>
+      <w:pPr>
+        <w:rPr>
+          <w:highlight w:val="green"/>
+        </w:rPr>
+      </w:pPr>
+    </w:p>
+    <w:p>
+      <w:pPr>
+        <w:rPr>
+          <w:highlight w:val="green"/>
+        </w:rPr>
+      </w:pPr>
+      <w:r>
+        <w:rPr>
+          <w:highlight w:val="green"/>
+        </w:rPr>
         <w:t xml:space="preserve">Primary Keyword  </w:t>
       </w:r>
       <w:proofErr w:type="gramStart"/>
       <w:r>
-        <w:t xml:space="preserve">  :</w:t>
-      </w:r>
-      <w:proofErr w:type="gramEnd"/>
-      <w:r>
+        <w:rPr>
+          <w:highlight w:val="green"/>
+        </w:rPr>
+        <w:t xml:space="preserve">  :</w:t>
+      </w:r>
+      <w:proofErr w:type="gramEnd"/>
+      <w:r>
+        <w:rPr>
+          <w:highlight w:val="green"/>
+        </w:rPr>
         <w:t xml:space="preserve"> "M&amp;A advisory MENA 2025"</w:t>
       </w:r>
     </w:p>
-    <w:p/>
-    <w:p>
-      <w:r>
+    <w:p>
+      <w:pPr>
+        <w:rPr>
+          <w:highlight w:val="green"/>
+        </w:rPr>
+      </w:pPr>
+    </w:p>
+    <w:p>
+      <w:pPr>
+        <w:rPr>
+          <w:highlight w:val="green"/>
+        </w:rPr>
+      </w:pPr>
+      <w:r>
+        <w:rPr>
+          <w:highlight w:val="green"/>
+        </w:rPr>
         <w:t xml:space="preserve">Secondary </w:t>
       </w:r>
       <w:proofErr w:type="gramStart"/>
       <w:r>
+        <w:rPr>
+          <w:highlight w:val="green"/>
+        </w:rPr>
         <w:t>Keywords :</w:t>
       </w:r>
       <w:proofErr w:type="gramEnd"/>
       <w:r>
+        <w:rPr>
+          <w:highlight w:val="green"/>
+        </w:rPr>
         <w:t xml:space="preserve"> business valuation Middle East,</w:t>
       </w:r>
     </w:p>
     <w:p>
-      <w:r>
+      <w:pPr>
+        <w:rPr>
+          <w:highlight w:val="green"/>
+        </w:rPr>
+      </w:pPr>
+      <w:r>
+        <w:rPr>
+          <w:highlight w:val="green"/>
+        </w:rPr>
         <w:t xml:space="preserve">                     mergers and acquisitions GCC,</w:t>
       </w:r>
     </w:p>
     <w:p>
-      <w:r>
+      <w:pPr>
+        <w:rPr>
+          <w:highlight w:val="green"/>
+        </w:rPr>
+      </w:pPr>
+      <w:r>
+        <w:rPr>
+          <w:highlight w:val="green"/>
+        </w:rPr>
         <w:t xml:space="preserve">                     sell a business UAE</w:t>
       </w:r>
     </w:p>
-    <w:p/>
-    <w:p>
-      <w:r>
+    <w:p>
+      <w:pPr>
+        <w:rPr>
+          <w:highlight w:val="green"/>
+        </w:rPr>
+      </w:pPr>
+    </w:p>
+    <w:p>
+      <w:pPr>
+        <w:rPr>
+          <w:highlight w:val="green"/>
+        </w:rPr>
+      </w:pPr>
+      <w:r>
+        <w:rPr>
+          <w:highlight w:val="green"/>
+        </w:rPr>
         <w:t xml:space="preserve">Long-Tail </w:t>
       </w:r>
       <w:proofErr w:type="gramStart"/>
       <w:r>
+        <w:rPr>
+          <w:highlight w:val="green"/>
+        </w:rPr>
         <w:t>Keywords :</w:t>
       </w:r>
       <w:proofErr w:type="gramEnd"/>
       <w:r>
+        <w:rPr>
+          <w:highlight w:val="green"/>
+        </w:rPr>
         <w:t xml:space="preserve"> how to prepare for M&amp;A in Saudi</w:t>
       </w:r>
     </w:p>
     <w:p>
-      <w:r>
+      <w:pPr>
+        <w:rPr>
+          <w:highlight w:val="green"/>
+        </w:rPr>
+      </w:pPr>
+      <w:r>
+        <w:rPr>
+          <w:highlight w:val="green"/>
+        </w:rPr>
         <w:t xml:space="preserve">                     Arabia,</w:t>
       </w:r>
     </w:p>
     <w:p>
-      <w:r>
+      <w:pPr>
+        <w:rPr>
+          <w:highlight w:val="green"/>
+        </w:rPr>
+      </w:pPr>
+      <w:r>
+        <w:rPr>
+          <w:highlight w:val="green"/>
+        </w:rPr>
         <w:t xml:space="preserve">                     what to know before selling </w:t>
       </w:r>
       <w:proofErr w:type="gramStart"/>
       <w:r>
+        <w:rPr>
+          <w:highlight w:val="green"/>
+        </w:rPr>
         <w:t>your</w:t>
       </w:r>
       <w:proofErr w:type="gramEnd"/>
     </w:p>
     <w:p>
-      <w:r>
+      <w:pPr>
+        <w:rPr>
+          <w:highlight w:val="green"/>
+        </w:rPr>
+      </w:pPr>
+      <w:r>
+        <w:rPr>
+          <w:highlight w:val="green"/>
+        </w:rPr>
         <w:t xml:space="preserve">                     business in the UAE,</w:t>
       </w:r>
     </w:p>
     <w:p>
-      <w:r>
+      <w:pPr>
+        <w:rPr>
+          <w:highlight w:val="green"/>
+        </w:rPr>
+      </w:pPr>
+      <w:r>
+        <w:rPr>
+          <w:highlight w:val="green"/>
+        </w:rPr>
         <w:lastRenderedPageBreak/>
         <w:t xml:space="preserve">                     M&amp;A deal process Middle East</w:t>
       </w:r>
     </w:p>
-    <w:p/>
-    <w:p>
-      <w:r>
+    <w:p>
+      <w:pPr>
+        <w:rPr>
+          <w:highlight w:val="green"/>
+        </w:rPr>
+      </w:pPr>
+    </w:p>
+    <w:p>
+      <w:pPr>
+        <w:rPr>
+          <w:highlight w:val="green"/>
+        </w:rPr>
+      </w:pPr>
+      <w:r>
+        <w:rPr>
+          <w:highlight w:val="green"/>
+        </w:rPr>
         <w:t xml:space="preserve">Article Tone     </w:t>
       </w:r>
       <w:proofErr w:type="gramStart"/>
       <w:r>
-        <w:t xml:space="preserve">  :</w:t>
-      </w:r>
-      <w:proofErr w:type="gramEnd"/>
-      <w:r>
+        <w:rPr>
+          <w:highlight w:val="green"/>
+        </w:rPr>
+        <w:t xml:space="preserve">  :</w:t>
+      </w:r>
+      <w:proofErr w:type="gramEnd"/>
+      <w:r>
+        <w:rPr>
+          <w:highlight w:val="green"/>
+        </w:rPr>
         <w:t xml:space="preserve"> Thought Leadership</w:t>
       </w:r>
     </w:p>
-    <w:p/>
-    <w:p>
-      <w:r>
+    <w:p>
+      <w:pPr>
+        <w:rPr>
+          <w:highlight w:val="green"/>
+        </w:rPr>
+      </w:pPr>
+    </w:p>
+    <w:p>
+      <w:pPr>
+        <w:rPr>
+          <w:highlight w:val="green"/>
+        </w:rPr>
+      </w:pPr>
+      <w:r>
+        <w:rPr>
+          <w:highlight w:val="green"/>
+        </w:rPr>
         <w:t xml:space="preserve">Word Count       </w:t>
       </w:r>
       <w:proofErr w:type="gramStart"/>
       <w:r>
-        <w:t xml:space="preserve">  :</w:t>
-      </w:r>
-      <w:proofErr w:type="gramEnd"/>
-      <w:r>
+        <w:rPr>
+          <w:highlight w:val="green"/>
+        </w:rPr>
+        <w:t xml:space="preserve">  :</w:t>
+      </w:r>
+      <w:proofErr w:type="gramEnd"/>
+      <w:r>
+        <w:rPr>
+          <w:highlight w:val="green"/>
+        </w:rPr>
         <w:t xml:space="preserve"> 2,000 words</w:t>
       </w:r>
     </w:p>
-    <w:p/>
-    <w:p>
-      <w:r>
+    <w:p>
+      <w:pPr>
+        <w:rPr>
+          <w:highlight w:val="green"/>
+        </w:rPr>
+      </w:pPr>
+    </w:p>
+    <w:p>
+      <w:pPr>
+        <w:rPr>
+          <w:highlight w:val="green"/>
+        </w:rPr>
+      </w:pPr>
+      <w:r>
+        <w:rPr>
+          <w:highlight w:val="green"/>
+        </w:rPr>
         <w:t xml:space="preserve">Internal Links   </w:t>
       </w:r>
       <w:proofErr w:type="gramStart"/>
       <w:r>
-        <w:t xml:space="preserve">  :</w:t>
-      </w:r>
-      <w:proofErr w:type="gramEnd"/>
-      <w:r>
+        <w:rPr>
+          <w:highlight w:val="green"/>
+        </w:rPr>
+        <w:t xml:space="preserve">  :</w:t>
+      </w:r>
+      <w:proofErr w:type="gramEnd"/>
+      <w:r>
+        <w:rPr>
+          <w:highlight w:val="green"/>
+        </w:rPr>
         <w:t xml:space="preserve"> M&amp;A Advisory service page</w:t>
       </w:r>
     </w:p>
-    <w:p/>
-    <w:p>
-      <w:r>
+    <w:p>
+      <w:pPr>
+        <w:rPr>
+          <w:highlight w:val="green"/>
+        </w:rPr>
+      </w:pPr>
+    </w:p>
+    <w:p>
+      <w:pPr>
+        <w:rPr>
+          <w:highlight w:val="green"/>
+        </w:rPr>
+      </w:pPr>
+      <w:r>
+        <w:rPr>
+          <w:highlight w:val="green"/>
+        </w:rPr>
         <w:t xml:space="preserve">CTA Goal         </w:t>
       </w:r>
       <w:proofErr w:type="gramStart"/>
       <w:r>
-        <w:t xml:space="preserve">  :</w:t>
-      </w:r>
-      <w:proofErr w:type="gramEnd"/>
-      <w:r>
+        <w:rPr>
+          <w:highlight w:val="green"/>
+        </w:rPr>
+        <w:t xml:space="preserve">  :</w:t>
+      </w:r>
+      <w:proofErr w:type="gramEnd"/>
+      <w:r>
+        <w:rPr>
+          <w:highlight w:val="green"/>
+        </w:rPr>
         <w:t xml:space="preserve"> Book a consultation</w:t>
       </w:r>
     </w:p>
-    <w:p/>
-    <w:p>
-      <w:r>
+    <w:p>
+      <w:pPr>
+        <w:rPr>
+          <w:highlight w:val="green"/>
+        </w:rPr>
+      </w:pPr>
+    </w:p>
+    <w:p>
+      <w:pPr>
+        <w:rPr>
+          <w:highlight w:val="green"/>
+        </w:rPr>
+      </w:pPr>
+      <w:r>
+        <w:rPr>
+          <w:highlight w:val="green"/>
+        </w:rPr>
         <w:t xml:space="preserve">Extra Notes      </w:t>
       </w:r>
       <w:proofErr w:type="gramStart"/>
       <w:r>
-        <w:t xml:space="preserve">  :</w:t>
-      </w:r>
-      <w:proofErr w:type="gramEnd"/>
-      <w:r>
+        <w:rPr>
+          <w:highlight w:val="green"/>
+        </w:rPr>
+        <w:t xml:space="preserve">  :</w:t>
+      </w:r>
+      <w:proofErr w:type="gramEnd"/>
+      <w:r>
+        <w:rPr>
+          <w:highlight w:val="green"/>
+        </w:rPr>
         <w:t xml:space="preserve"> Reference EY MENA M&amp;A Insights 2025</w:t>
       </w:r>
     </w:p>
     <w:p>
-      <w:r>
+      <w:pPr>
+        <w:rPr>
+          <w:highlight w:val="green"/>
+        </w:rPr>
+      </w:pPr>
+      <w:r>
+        <w:rPr>
+          <w:highlight w:val="green"/>
+        </w:rPr>
         <w:t xml:space="preserve">                     report showing 884 deals totaling</w:t>
       </w:r>
     </w:p>
     <w:p>
-      <w:r>
+      <w:pPr>
+        <w:rPr>
+          <w:highlight w:val="green"/>
+        </w:rPr>
+      </w:pPr>
+      <w:r>
+        <w:rPr>
+          <w:highlight w:val="green"/>
+        </w:rPr>
         <w:t xml:space="preserve">                     $106.1B — a 26% YoY rise. Mention</w:t>
       </w:r>
     </w:p>
     <w:p>
-      <w:r>
+      <w:pPr>
+        <w:rPr>
+          <w:highlight w:val="green"/>
+        </w:rPr>
+      </w:pPr>
+      <w:r>
+        <w:rPr>
+          <w:highlight w:val="green"/>
+        </w:rPr>
         <w:t xml:space="preserve">                     sovereign wealth fund activity</w:t>
       </w:r>
     </w:p>
     <w:p>
-      <w:r>
+      <w:pPr>
+        <w:rPr>
+          <w:highlight w:val="green"/>
+        </w:rPr>
+      </w:pPr>
+      <w:r>
+        <w:rPr>
+          <w:highlight w:val="green"/>
+        </w:rPr>
         <w:t xml:space="preserve">                     (ADIA, Mubadala, PIF) and the surge</w:t>
       </w:r>
     </w:p>
     <w:p>
-      <w:r>
+      <w:pPr>
+        <w:rPr>
+          <w:highlight w:val="green"/>
+        </w:rPr>
+      </w:pPr>
+      <w:r>
+        <w:rPr>
+          <w:highlight w:val="green"/>
+        </w:rPr>
         <w:t xml:space="preserve">                     in cross-border deals driven by</w:t>
       </w:r>
     </w:p>
     <w:p>
-      <w:r>
+      <w:pPr>
+        <w:rPr>
+          <w:highlight w:val="green"/>
+        </w:rPr>
+      </w:pPr>
+      <w:r>
+        <w:rPr>
+          <w:highlight w:val="green"/>
+        </w:rPr>
         <w:t xml:space="preserve">                     Vision 2030. Note that UAE and KSA</w:t>
       </w:r>
     </w:p>
     <w:p>
-      <w:r>
+      <w:pPr>
+        <w:rPr>
+          <w:highlight w:val="green"/>
+        </w:rPr>
+      </w:pPr>
+      <w:r>
+        <w:rPr>
+          <w:highlight w:val="green"/>
+        </w:rPr>
         <w:t xml:space="preserve">                     captured 59% of MENA investments.</w:t>
       </w:r>
     </w:p>
-    <w:p/>
-    <w:p>
-      <w:r>
+    <w:p>
+      <w:pPr>
+        <w:rPr>
+          <w:highlight w:val="green"/>
+        </w:rPr>
+      </w:pPr>
+    </w:p>
+    <w:p>
+      <w:pPr>
+        <w:rPr>
+          <w:highlight w:val="green"/>
+        </w:rPr>
+      </w:pPr>
+      <w:r>
+        <w:rPr>
+          <w:highlight w:val="green"/>
+        </w:rPr>
         <w:t>====================================================</w:t>
       </w:r>
     </w:p>
     <w:p>
+      <w:pPr>
+        <w:rPr>
+          <w:highlight w:val="green"/>
+        </w:rPr>
+      </w:pPr>
       <w:r>
         <w:rPr>
           <w:rFonts w:ascii="Segoe UI Emoji" w:hAnsi="Segoe UI Emoji" w:cs="Segoe UI Emoji"/>
+          <w:highlight w:val="green"/>
         </w:rPr>
         <w:t>▶</w:t>
       </w:r>
       <w:r>
+        <w:rPr>
+          <w:highlight w:val="green"/>
+        </w:rPr>
         <w:t xml:space="preserve"> Please generate the full article following</w:t>
       </w:r>
     </w:p>
     <w:p>
-      <w:r>
+      <w:pPr>
+        <w:rPr>
+          <w:highlight w:val="green"/>
+        </w:rPr>
+      </w:pPr>
+      <w:r>
+        <w:rPr>
+          <w:highlight w:val="green"/>
+        </w:rPr>
         <w:t xml:space="preserve">  the project instructions.</w:t>
       </w:r>
     </w:p>
     <w:p>
-      <w:r>
+      <w:pPr>
+        <w:rPr>
+          <w:highlight w:val="green"/>
+        </w:rPr>
+      </w:pPr>
+      <w:r>
+        <w:rPr>
+          <w:highlight w:val="green"/>
+        </w:rPr>
         <w:t>====================================================</w:t>
       </w:r>
     </w:p>
     <w:p>
-      <w:r>
+      <w:pPr>
+        <w:rPr>
+          <w:highlight w:val="green"/>
+        </w:rPr>
+      </w:pPr>
+      <w:r>
+        <w:rPr>
+          <w:highlight w:val="green"/>
+        </w:rPr>
         <w:pict w14:anchorId="6B8129EF">
-          <v:rect id="_x0000_i1056" style="width:0;height:0" o:hralign="center" o:hrstd="t" o:hr="t" fillcolor="#a0a0a0" stroked="f"/>
+          <v:rect id="_x0000_i1027" style="width:0;height:0" o:hralign="center" o:hrstd="t" o:hr="t" fillcolor="#a0a0a0" stroked="f"/>
         </w:pict>
       </w:r>
     </w:p>
@@ -391,366 +836,860 @@
         <w:rPr>
           <w:b/>
           <w:bCs/>
+          <w:highlight w:val="green"/>
         </w:rPr>
       </w:pPr>
       <w:r>
         <w:rPr>
           <w:b/>
           <w:bCs/>
+          <w:highlight w:val="green"/>
         </w:rPr>
         <w:t>Brief #2</w:t>
       </w:r>
     </w:p>
     <w:p>
-      <w:r>
+      <w:pPr>
+        <w:rPr>
+          <w:highlight w:val="green"/>
+        </w:rPr>
+      </w:pPr>
+      <w:r>
+        <w:rPr>
+          <w:highlight w:val="green"/>
+        </w:rPr>
         <w:t>text</w:t>
       </w:r>
     </w:p>
     <w:p>
-      <w:r>
+      <w:pPr>
+        <w:rPr>
+          <w:highlight w:val="green"/>
+        </w:rPr>
+      </w:pPr>
+      <w:r>
+        <w:rPr>
+          <w:highlight w:val="green"/>
+        </w:rPr>
         <w:t>====================================================</w:t>
       </w:r>
     </w:p>
     <w:p>
+      <w:pPr>
+        <w:rPr>
+          <w:highlight w:val="green"/>
+        </w:rPr>
+      </w:pPr>
       <w:r>
         <w:rPr>
           <w:rFonts w:ascii="Segoe UI Emoji" w:hAnsi="Segoe UI Emoji" w:cs="Segoe UI Emoji"/>
+          <w:highlight w:val="green"/>
         </w:rPr>
         <w:t>📋</w:t>
       </w:r>
       <w:r>
+        <w:rPr>
+          <w:highlight w:val="green"/>
+        </w:rPr>
         <w:t xml:space="preserve"> NEW ARTICLE BRIEF</w:t>
       </w:r>
     </w:p>
     <w:p>
-      <w:r>
+      <w:pPr>
+        <w:rPr>
+          <w:highlight w:val="green"/>
+        </w:rPr>
+      </w:pPr>
+      <w:r>
+        <w:rPr>
+          <w:highlight w:val="green"/>
+        </w:rPr>
         <w:t>====================================================</w:t>
       </w:r>
     </w:p>
-    <w:p/>
-    <w:p>
-      <w:r>
+    <w:p>
+      <w:pPr>
+        <w:rPr>
+          <w:highlight w:val="green"/>
+        </w:rPr>
+      </w:pPr>
+    </w:p>
+    <w:p>
+      <w:pPr>
+        <w:rPr>
+          <w:highlight w:val="green"/>
+        </w:rPr>
+      </w:pPr>
+      <w:r>
+        <w:rPr>
+          <w:highlight w:val="green"/>
+        </w:rPr>
         <w:lastRenderedPageBreak/>
         <w:t xml:space="preserve">Title Idea       </w:t>
       </w:r>
       <w:proofErr w:type="gramStart"/>
       <w:r>
-        <w:t xml:space="preserve">  :</w:t>
-      </w:r>
-      <w:proofErr w:type="gramEnd"/>
-      <w:r>
+        <w:rPr>
+          <w:highlight w:val="green"/>
+        </w:rPr>
+        <w:t xml:space="preserve">  :</w:t>
+      </w:r>
+      <w:proofErr w:type="gramEnd"/>
+      <w:r>
+        <w:rPr>
+          <w:highlight w:val="green"/>
+        </w:rPr>
         <w:t xml:space="preserve"> Cross-Border M&amp;A in the GCC:</w:t>
       </w:r>
     </w:p>
     <w:p>
-      <w:r>
+      <w:pPr>
+        <w:rPr>
+          <w:highlight w:val="green"/>
+        </w:rPr>
+      </w:pPr>
+      <w:r>
+        <w:rPr>
+          <w:highlight w:val="green"/>
+        </w:rPr>
         <w:t xml:space="preserve">                     Navigating Regulatory Frameworks</w:t>
       </w:r>
     </w:p>
     <w:p>
-      <w:r>
+      <w:pPr>
+        <w:rPr>
+          <w:highlight w:val="green"/>
+        </w:rPr>
+      </w:pPr>
+      <w:r>
+        <w:rPr>
+          <w:highlight w:val="green"/>
+        </w:rPr>
         <w:t xml:space="preserve">                     in UAE, KSA &amp; Egypt</w:t>
       </w:r>
     </w:p>
-    <w:p/>
-    <w:p>
-      <w:r>
+    <w:p>
+      <w:pPr>
+        <w:rPr>
+          <w:highlight w:val="green"/>
+        </w:rPr>
+      </w:pPr>
+    </w:p>
+    <w:p>
+      <w:pPr>
+        <w:rPr>
+          <w:highlight w:val="green"/>
+        </w:rPr>
+      </w:pPr>
+      <w:r>
+        <w:rPr>
+          <w:highlight w:val="green"/>
+        </w:rPr>
         <w:t xml:space="preserve">Primary Service  </w:t>
       </w:r>
       <w:proofErr w:type="gramStart"/>
       <w:r>
-        <w:t xml:space="preserve">  :</w:t>
-      </w:r>
-      <w:proofErr w:type="gramEnd"/>
-      <w:r>
+        <w:rPr>
+          <w:highlight w:val="green"/>
+        </w:rPr>
+        <w:t xml:space="preserve">  :</w:t>
+      </w:r>
+      <w:proofErr w:type="gramEnd"/>
+      <w:r>
+        <w:rPr>
+          <w:highlight w:val="green"/>
+        </w:rPr>
         <w:t xml:space="preserve"> M&amp;A Advisory</w:t>
       </w:r>
     </w:p>
-    <w:p/>
-    <w:p>
-      <w:r>
+    <w:p>
+      <w:pPr>
+        <w:rPr>
+          <w:highlight w:val="green"/>
+        </w:rPr>
+      </w:pPr>
+    </w:p>
+    <w:p>
+      <w:pPr>
+        <w:rPr>
+          <w:highlight w:val="green"/>
+        </w:rPr>
+      </w:pPr>
+      <w:r>
+        <w:rPr>
+          <w:highlight w:val="green"/>
+        </w:rPr>
         <w:t xml:space="preserve">Target Audience  </w:t>
       </w:r>
       <w:proofErr w:type="gramStart"/>
       <w:r>
-        <w:t xml:space="preserve">  :</w:t>
-      </w:r>
-      <w:proofErr w:type="gramEnd"/>
-      <w:r>
+        <w:rPr>
+          <w:highlight w:val="green"/>
+        </w:rPr>
+        <w:t xml:space="preserve">  :</w:t>
+      </w:r>
+      <w:proofErr w:type="gramEnd"/>
+      <w:r>
+        <w:rPr>
+          <w:highlight w:val="green"/>
+        </w:rPr>
         <w:t xml:space="preserve"> CFOs, legal counsel, and M&amp;A</w:t>
       </w:r>
     </w:p>
     <w:p>
-      <w:r>
+      <w:pPr>
+        <w:rPr>
+          <w:highlight w:val="green"/>
+        </w:rPr>
+      </w:pPr>
+      <w:r>
+        <w:rPr>
+          <w:highlight w:val="green"/>
+        </w:rPr>
         <w:t xml:space="preserve">                     directors at multinational firms</w:t>
       </w:r>
     </w:p>
     <w:p>
-      <w:r>
+      <w:pPr>
+        <w:rPr>
+          <w:highlight w:val="green"/>
+        </w:rPr>
+      </w:pPr>
+      <w:r>
+        <w:rPr>
+          <w:highlight w:val="green"/>
+        </w:rPr>
         <w:t xml:space="preserve">                     entering the GCC market</w:t>
       </w:r>
     </w:p>
-    <w:p/>
-    <w:p>
-      <w:r>
+    <w:p>
+      <w:pPr>
+        <w:rPr>
+          <w:highlight w:val="green"/>
+        </w:rPr>
+      </w:pPr>
+    </w:p>
+    <w:p>
+      <w:pPr>
+        <w:rPr>
+          <w:highlight w:val="green"/>
+        </w:rPr>
+      </w:pPr>
+      <w:r>
+        <w:rPr>
+          <w:highlight w:val="green"/>
+        </w:rPr>
         <w:t xml:space="preserve">MENA Country </w:t>
       </w:r>
       <w:proofErr w:type="gramStart"/>
       <w:r>
+        <w:rPr>
+          <w:highlight w:val="green"/>
+        </w:rPr>
         <w:t>Focus :</w:t>
       </w:r>
       <w:proofErr w:type="gramEnd"/>
       <w:r>
+        <w:rPr>
+          <w:highlight w:val="green"/>
+        </w:rPr>
         <w:t xml:space="preserve"> UAE, Saudi Arabia, Egypt</w:t>
       </w:r>
     </w:p>
-    <w:p/>
-    <w:p>
-      <w:r>
+    <w:p>
+      <w:pPr>
+        <w:rPr>
+          <w:highlight w:val="green"/>
+        </w:rPr>
+      </w:pPr>
+    </w:p>
+    <w:p>
+      <w:pPr>
+        <w:rPr>
+          <w:highlight w:val="green"/>
+        </w:rPr>
+      </w:pPr>
+      <w:r>
+        <w:rPr>
+          <w:highlight w:val="green"/>
+        </w:rPr>
         <w:t xml:space="preserve">Primary Keyword  </w:t>
       </w:r>
       <w:proofErr w:type="gramStart"/>
       <w:r>
-        <w:t xml:space="preserve">  :</w:t>
-      </w:r>
-      <w:proofErr w:type="gramEnd"/>
-      <w:r>
+        <w:rPr>
+          <w:highlight w:val="green"/>
+        </w:rPr>
+        <w:t xml:space="preserve">  :</w:t>
+      </w:r>
+      <w:proofErr w:type="gramEnd"/>
+      <w:r>
+        <w:rPr>
+          <w:highlight w:val="green"/>
+        </w:rPr>
         <w:t xml:space="preserve"> "cross-border M&amp;A GCC regulations"</w:t>
       </w:r>
     </w:p>
-    <w:p/>
-    <w:p>
-      <w:r>
+    <w:p>
+      <w:pPr>
+        <w:rPr>
+          <w:highlight w:val="green"/>
+        </w:rPr>
+      </w:pPr>
+    </w:p>
+    <w:p>
+      <w:pPr>
+        <w:rPr>
+          <w:highlight w:val="green"/>
+        </w:rPr>
+      </w:pPr>
+      <w:r>
+        <w:rPr>
+          <w:highlight w:val="green"/>
+        </w:rPr>
         <w:t xml:space="preserve">Secondary </w:t>
       </w:r>
       <w:proofErr w:type="gramStart"/>
       <w:r>
+        <w:rPr>
+          <w:highlight w:val="green"/>
+        </w:rPr>
         <w:t>Keywords :</w:t>
       </w:r>
       <w:proofErr w:type="gramEnd"/>
       <w:r>
+        <w:rPr>
+          <w:highlight w:val="green"/>
+        </w:rPr>
         <w:t xml:space="preserve"> M&amp;A regulatory compliance UAE,</w:t>
       </w:r>
     </w:p>
     <w:p>
-      <w:r>
+      <w:pPr>
+        <w:rPr>
+          <w:highlight w:val="green"/>
+        </w:rPr>
+      </w:pPr>
+      <w:r>
+        <w:rPr>
+          <w:highlight w:val="green"/>
+        </w:rPr>
         <w:t xml:space="preserve">                     foreign investment rules Saudi</w:t>
       </w:r>
     </w:p>
     <w:p>
-      <w:r>
+      <w:pPr>
+        <w:rPr>
+          <w:highlight w:val="green"/>
+        </w:rPr>
+      </w:pPr>
+      <w:r>
+        <w:rPr>
+          <w:highlight w:val="green"/>
+        </w:rPr>
         <w:t xml:space="preserve">                     Arabia,</w:t>
       </w:r>
     </w:p>
     <w:p>
-      <w:r>
+      <w:pPr>
+        <w:rPr>
+          <w:highlight w:val="green"/>
+        </w:rPr>
+      </w:pPr>
+      <w:r>
+        <w:rPr>
+          <w:highlight w:val="green"/>
+        </w:rPr>
         <w:t xml:space="preserve">                     Egypt M&amp;A legal framework</w:t>
       </w:r>
     </w:p>
-    <w:p/>
-    <w:p>
-      <w:r>
+    <w:p>
+      <w:pPr>
+        <w:rPr>
+          <w:highlight w:val="green"/>
+        </w:rPr>
+      </w:pPr>
+    </w:p>
+    <w:p>
+      <w:pPr>
+        <w:rPr>
+          <w:highlight w:val="green"/>
+        </w:rPr>
+      </w:pPr>
+      <w:r>
+        <w:rPr>
+          <w:highlight w:val="green"/>
+        </w:rPr>
         <w:t xml:space="preserve">Long-Tail </w:t>
       </w:r>
       <w:proofErr w:type="gramStart"/>
       <w:r>
+        <w:rPr>
+          <w:highlight w:val="green"/>
+        </w:rPr>
         <w:t>Keywords :</w:t>
       </w:r>
       <w:proofErr w:type="gramEnd"/>
       <w:r>
+        <w:rPr>
+          <w:highlight w:val="green"/>
+        </w:rPr>
         <w:t xml:space="preserve"> how to navigate M&amp;A regulations</w:t>
       </w:r>
     </w:p>
     <w:p>
-      <w:r>
+      <w:pPr>
+        <w:rPr>
+          <w:highlight w:val="green"/>
+        </w:rPr>
+      </w:pPr>
+      <w:r>
+        <w:rPr>
+          <w:highlight w:val="green"/>
+        </w:rPr>
         <w:t xml:space="preserve">                     in the UAE and Saudi Arabia,</w:t>
       </w:r>
     </w:p>
     <w:p>
-      <w:r>
+      <w:pPr>
+        <w:rPr>
+          <w:highlight w:val="green"/>
+        </w:rPr>
+      </w:pPr>
+      <w:r>
+        <w:rPr>
+          <w:highlight w:val="green"/>
+        </w:rPr>
         <w:t xml:space="preserve">                     foreign ownership rules for M&amp;A</w:t>
       </w:r>
     </w:p>
     <w:p>
-      <w:r>
+      <w:pPr>
+        <w:rPr>
+          <w:highlight w:val="green"/>
+        </w:rPr>
+      </w:pPr>
+      <w:r>
+        <w:rPr>
+          <w:highlight w:val="green"/>
+        </w:rPr>
         <w:t xml:space="preserve">                     in Egypt,</w:t>
       </w:r>
     </w:p>
     <w:p>
-      <w:r>
+      <w:pPr>
+        <w:rPr>
+          <w:highlight w:val="green"/>
+        </w:rPr>
+      </w:pPr>
+      <w:r>
+        <w:rPr>
+          <w:highlight w:val="green"/>
+        </w:rPr>
         <w:t xml:space="preserve">                     cross-border acquisition process</w:t>
       </w:r>
     </w:p>
     <w:p>
-      <w:r>
+      <w:pPr>
+        <w:rPr>
+          <w:highlight w:val="green"/>
+        </w:rPr>
+      </w:pPr>
+      <w:r>
+        <w:rPr>
+          <w:highlight w:val="green"/>
+        </w:rPr>
         <w:t xml:space="preserve">                     GCC 2025</w:t>
       </w:r>
     </w:p>
-    <w:p/>
-    <w:p>
-      <w:r>
+    <w:p>
+      <w:pPr>
+        <w:rPr>
+          <w:highlight w:val="green"/>
+        </w:rPr>
+      </w:pPr>
+    </w:p>
+    <w:p>
+      <w:pPr>
+        <w:rPr>
+          <w:highlight w:val="green"/>
+        </w:rPr>
+      </w:pPr>
+      <w:r>
+        <w:rPr>
+          <w:highlight w:val="green"/>
+        </w:rPr>
         <w:t xml:space="preserve">Article Tone     </w:t>
       </w:r>
       <w:proofErr w:type="gramStart"/>
       <w:r>
-        <w:t xml:space="preserve">  :</w:t>
-      </w:r>
-      <w:proofErr w:type="gramEnd"/>
-      <w:r>
+        <w:rPr>
+          <w:highlight w:val="green"/>
+        </w:rPr>
+        <w:t xml:space="preserve">  :</w:t>
+      </w:r>
+      <w:proofErr w:type="gramEnd"/>
+      <w:r>
+        <w:rPr>
+          <w:highlight w:val="green"/>
+        </w:rPr>
         <w:t xml:space="preserve"> Educational / Data-Driven</w:t>
       </w:r>
     </w:p>
-    <w:p/>
-    <w:p>
-      <w:r>
+    <w:p>
+      <w:pPr>
+        <w:rPr>
+          <w:highlight w:val="green"/>
+        </w:rPr>
+      </w:pPr>
+    </w:p>
+    <w:p>
+      <w:pPr>
+        <w:rPr>
+          <w:highlight w:val="green"/>
+        </w:rPr>
+      </w:pPr>
+      <w:r>
+        <w:rPr>
+          <w:highlight w:val="green"/>
+        </w:rPr>
         <w:t xml:space="preserve">Word Count       </w:t>
       </w:r>
       <w:proofErr w:type="gramStart"/>
       <w:r>
-        <w:t xml:space="preserve">  :</w:t>
-      </w:r>
-      <w:proofErr w:type="gramEnd"/>
-      <w:r>
+        <w:rPr>
+          <w:highlight w:val="green"/>
+        </w:rPr>
+        <w:t xml:space="preserve">  :</w:t>
+      </w:r>
+      <w:proofErr w:type="gramEnd"/>
+      <w:r>
+        <w:rPr>
+          <w:highlight w:val="green"/>
+        </w:rPr>
         <w:t xml:space="preserve"> 2,200 words</w:t>
       </w:r>
     </w:p>
-    <w:p/>
-    <w:p>
-      <w:r>
+    <w:p>
+      <w:pPr>
+        <w:rPr>
+          <w:highlight w:val="green"/>
+        </w:rPr>
+      </w:pPr>
+    </w:p>
+    <w:p>
+      <w:pPr>
+        <w:rPr>
+          <w:highlight w:val="green"/>
+        </w:rPr>
+      </w:pPr>
+      <w:r>
+        <w:rPr>
+          <w:highlight w:val="green"/>
+        </w:rPr>
         <w:lastRenderedPageBreak/>
         <w:t xml:space="preserve">Internal Links   </w:t>
       </w:r>
       <w:proofErr w:type="gramStart"/>
       <w:r>
-        <w:t xml:space="preserve">  :</w:t>
-      </w:r>
-      <w:proofErr w:type="gramEnd"/>
-      <w:r>
+        <w:rPr>
+          <w:highlight w:val="green"/>
+        </w:rPr>
+        <w:t xml:space="preserve">  :</w:t>
+      </w:r>
+      <w:proofErr w:type="gramEnd"/>
+      <w:r>
+        <w:rPr>
+          <w:highlight w:val="green"/>
+        </w:rPr>
         <w:t xml:space="preserve"> M&amp;A Advisory service page,</w:t>
       </w:r>
     </w:p>
     <w:p>
-      <w:r>
+      <w:pPr>
+        <w:rPr>
+          <w:highlight w:val="green"/>
+        </w:rPr>
+      </w:pPr>
+      <w:r>
+        <w:rPr>
+          <w:highlight w:val="green"/>
+        </w:rPr>
         <w:t xml:space="preserve">                     Feasibility Studies service page</w:t>
       </w:r>
     </w:p>
-    <w:p/>
-    <w:p>
-      <w:r>
+    <w:p>
+      <w:pPr>
+        <w:rPr>
+          <w:highlight w:val="green"/>
+        </w:rPr>
+      </w:pPr>
+    </w:p>
+    <w:p>
+      <w:pPr>
+        <w:rPr>
+          <w:highlight w:val="green"/>
+        </w:rPr>
+      </w:pPr>
+      <w:r>
+        <w:rPr>
+          <w:highlight w:val="green"/>
+        </w:rPr>
         <w:t xml:space="preserve">CTA Goal         </w:t>
       </w:r>
       <w:proofErr w:type="gramStart"/>
       <w:r>
-        <w:t xml:space="preserve">  :</w:t>
-      </w:r>
-      <w:proofErr w:type="gramEnd"/>
-      <w:r>
+        <w:rPr>
+          <w:highlight w:val="green"/>
+        </w:rPr>
+        <w:t xml:space="preserve">  :</w:t>
+      </w:r>
+      <w:proofErr w:type="gramEnd"/>
+      <w:r>
+        <w:rPr>
+          <w:highlight w:val="green"/>
+        </w:rPr>
         <w:t xml:space="preserve"> Book a regulatory advisory</w:t>
       </w:r>
     </w:p>
     <w:p>
-      <w:r>
+      <w:pPr>
+        <w:rPr>
+          <w:highlight w:val="green"/>
+        </w:rPr>
+      </w:pPr>
+      <w:r>
+        <w:rPr>
+          <w:highlight w:val="green"/>
+        </w:rPr>
         <w:t xml:space="preserve">                     consultation</w:t>
       </w:r>
     </w:p>
-    <w:p/>
-    <w:p>
-      <w:r>
+    <w:p>
+      <w:pPr>
+        <w:rPr>
+          <w:highlight w:val="green"/>
+        </w:rPr>
+      </w:pPr>
+    </w:p>
+    <w:p>
+      <w:pPr>
+        <w:rPr>
+          <w:highlight w:val="green"/>
+        </w:rPr>
+      </w:pPr>
+      <w:r>
+        <w:rPr>
+          <w:highlight w:val="green"/>
+        </w:rPr>
         <w:t xml:space="preserve">Extra Notes      </w:t>
       </w:r>
       <w:proofErr w:type="gramStart"/>
       <w:r>
-        <w:t xml:space="preserve">  :</w:t>
-      </w:r>
-      <w:proofErr w:type="gramEnd"/>
-      <w:r>
+        <w:rPr>
+          <w:highlight w:val="green"/>
+        </w:rPr>
+        <w:t xml:space="preserve">  :</w:t>
+      </w:r>
+      <w:proofErr w:type="gramEnd"/>
+      <w:r>
+        <w:rPr>
+          <w:highlight w:val="green"/>
+        </w:rPr>
         <w:t xml:space="preserve"> Reference DIFC and ADGM frameworks</w:t>
       </w:r>
     </w:p>
     <w:p>
-      <w:r>
+      <w:pPr>
+        <w:rPr>
+          <w:highlight w:val="green"/>
+        </w:rPr>
+      </w:pPr>
+      <w:r>
+        <w:rPr>
+          <w:highlight w:val="green"/>
+        </w:rPr>
         <w:t xml:space="preserve">                     in UAE; Saudi Arabia's Foreign</w:t>
       </w:r>
     </w:p>
     <w:p>
-      <w:r>
+      <w:pPr>
+        <w:rPr>
+          <w:highlight w:val="green"/>
+        </w:rPr>
+      </w:pPr>
+      <w:r>
+        <w:rPr>
+          <w:highlight w:val="green"/>
+        </w:rPr>
         <w:t xml:space="preserve">                     Investment Law and SAMA </w:t>
       </w:r>
       <w:proofErr w:type="gramStart"/>
       <w:r>
+        <w:rPr>
+          <w:highlight w:val="green"/>
+        </w:rPr>
         <w:t>oversight;</w:t>
       </w:r>
       <w:proofErr w:type="gramEnd"/>
     </w:p>
     <w:p>
-      <w:r>
+      <w:pPr>
+        <w:rPr>
+          <w:highlight w:val="green"/>
+        </w:rPr>
+      </w:pPr>
+      <w:r>
+        <w:rPr>
+          <w:highlight w:val="green"/>
+        </w:rPr>
         <w:t xml:space="preserve">                     Egypt's FRA regulations. Note that</w:t>
       </w:r>
     </w:p>
     <w:p>
-      <w:r>
+      <w:pPr>
+        <w:rPr>
+          <w:highlight w:val="green"/>
+        </w:rPr>
+      </w:pPr>
+      <w:r>
+        <w:rPr>
+          <w:highlight w:val="green"/>
+        </w:rPr>
         <w:t xml:space="preserve">                     cross-border M&amp;A made up 54% of</w:t>
       </w:r>
     </w:p>
     <w:p>
-      <w:r>
+      <w:pPr>
+        <w:rPr>
+          <w:highlight w:val="green"/>
+        </w:rPr>
+      </w:pPr>
+      <w:r>
+        <w:rPr>
+          <w:highlight w:val="green"/>
+        </w:rPr>
         <w:t xml:space="preserve">                     volume and 61% of value in MENA</w:t>
       </w:r>
     </w:p>
     <w:p>
-      <w:r>
+      <w:pPr>
+        <w:rPr>
+          <w:highlight w:val="green"/>
+        </w:rPr>
+      </w:pPr>
+      <w:r>
+        <w:rPr>
+          <w:highlight w:val="green"/>
+        </w:rPr>
         <w:t xml:space="preserve">                     2025 per EY data. Highlight how</w:t>
       </w:r>
     </w:p>
     <w:p>
-      <w:r>
+      <w:pPr>
+        <w:rPr>
+          <w:highlight w:val="green"/>
+        </w:rPr>
+      </w:pPr>
+      <w:r>
+        <w:rPr>
+          <w:highlight w:val="green"/>
+        </w:rPr>
         <w:t xml:space="preserve">                     enabling regulations </w:t>
       </w:r>
       <w:proofErr w:type="gramStart"/>
       <w:r>
+        <w:rPr>
+          <w:highlight w:val="green"/>
+        </w:rPr>
         <w:t>have</w:t>
       </w:r>
       <w:proofErr w:type="gramEnd"/>
       <w:r>
+        <w:rPr>
+          <w:highlight w:val="green"/>
+        </w:rPr>
         <w:t xml:space="preserve"> fueled</w:t>
       </w:r>
     </w:p>
     <w:p>
-      <w:r>
+      <w:pPr>
+        <w:rPr>
+          <w:highlight w:val="green"/>
+        </w:rPr>
+      </w:pPr>
+      <w:r>
+        <w:rPr>
+          <w:highlight w:val="green"/>
+        </w:rPr>
         <w:t xml:space="preserve">                     deal growth.</w:t>
       </w:r>
     </w:p>
-    <w:p/>
-    <w:p>
-      <w:r>
+    <w:p>
+      <w:pPr>
+        <w:rPr>
+          <w:highlight w:val="green"/>
+        </w:rPr>
+      </w:pPr>
+    </w:p>
+    <w:p>
+      <w:pPr>
+        <w:rPr>
+          <w:highlight w:val="green"/>
+        </w:rPr>
+      </w:pPr>
+      <w:r>
+        <w:rPr>
+          <w:highlight w:val="green"/>
+        </w:rPr>
         <w:t>====================================================</w:t>
       </w:r>
     </w:p>
     <w:p>
+      <w:pPr>
+        <w:rPr>
+          <w:highlight w:val="green"/>
+        </w:rPr>
+      </w:pPr>
       <w:r>
         <w:rPr>
           <w:rFonts w:ascii="Segoe UI Emoji" w:hAnsi="Segoe UI Emoji" w:cs="Segoe UI Emoji"/>
+          <w:highlight w:val="green"/>
         </w:rPr>
         <w:t>▶</w:t>
       </w:r>
       <w:r>
+        <w:rPr>
+          <w:highlight w:val="green"/>
+        </w:rPr>
         <w:t xml:space="preserve"> Please generate the full article following</w:t>
       </w:r>
     </w:p>
     <w:p>
-      <w:r>
+      <w:pPr>
+        <w:rPr>
+          <w:highlight w:val="green"/>
+        </w:rPr>
+      </w:pPr>
+      <w:r>
+        <w:rPr>
+          <w:highlight w:val="green"/>
+        </w:rPr>
         <w:t xml:space="preserve">  the project instructions.</w:t>
       </w:r>
     </w:p>
     <w:p>
       <w:r>
+        <w:rPr>
+          <w:highlight w:val="green"/>
+        </w:rPr>
         <w:t>====================================================</w:t>
       </w:r>
     </w:p>
     <w:p>
       <w:r>
         <w:pict w14:anchorId="5532AB3C">
-          <v:rect id="_x0000_i1057" style="width:0;height:0" o:hralign="center" o:hrstd="t" o:hr="t" fillcolor="#a0a0a0" stroked="f"/>
+          <v:rect id="_x0000_i1028" style="width:0;height:0" o:hralign="center" o:hrstd="t" o:hr="t" fillcolor="#a0a0a0" stroked="f"/>
         </w:pict>
       </w:r>
     </w:p>
@@ -1126,7 +2065,7 @@
     <w:p>
       <w:r>
         <w:pict w14:anchorId="13E00EEA">
-          <v:rect id="_x0000_i1058" style="width:0;height:0" o:hralign="center" o:hrstd="t" o:hr="t" fillcolor="#a0a0a0" stroked="f"/>
+          <v:rect id="_x0000_i1029" style="width:0;height:0" o:hralign="center" o:hrstd="t" o:hr="t" fillcolor="#a0a0a0" stroked="f"/>
         </w:pict>
       </w:r>
     </w:p>
@@ -1466,7 +2405,7 @@
     <w:p>
       <w:r>
         <w:pict w14:anchorId="15A8F2FD">
-          <v:rect id="_x0000_i1059" style="width:0;height:0" o:hralign="center" o:hrstd="t" o:hr="t" fillcolor="#a0a0a0" stroked="f"/>
+          <v:rect id="_x0000_i1030" style="width:0;height:0" o:hralign="center" o:hrstd="t" o:hr="t" fillcolor="#a0a0a0" stroked="f"/>
         </w:pict>
       </w:r>
     </w:p>
@@ -1816,7 +2755,7 @@
     <w:p>
       <w:r>
         <w:pict w14:anchorId="0D7E8E6F">
-          <v:rect id="_x0000_i1060" style="width:0;height:0" o:hralign="center" o:hrstd="t" o:hr="t" fillcolor="#a0a0a0" stroked="f"/>
+          <v:rect id="_x0000_i1031" style="width:0;height:0" o:hralign="center" o:hrstd="t" o:hr="t" fillcolor="#a0a0a0" stroked="f"/>
         </w:pict>
       </w:r>
     </w:p>
@@ -2165,7 +3104,7 @@
     <w:p>
       <w:r>
         <w:pict w14:anchorId="4B2AE67B">
-          <v:rect id="_x0000_i1061" style="width:0;height:0" o:hralign="center" o:hrstd="t" o:hr="t" fillcolor="#a0a0a0" stroked="f"/>
+          <v:rect id="_x0000_i1032" style="width:0;height:0" o:hralign="center" o:hrstd="t" o:hr="t" fillcolor="#a0a0a0" stroked="f"/>
         </w:pict>
       </w:r>
     </w:p>
@@ -2523,7 +3462,7 @@
     <w:p>
       <w:r>
         <w:pict w14:anchorId="47D8D254">
-          <v:rect id="_x0000_i1062" style="width:0;height:0" o:hralign="center" o:hrstd="t" o:hr="t" fillcolor="#a0a0a0" stroked="f"/>
+          <v:rect id="_x0000_i1033" style="width:0;height:0" o:hralign="center" o:hrstd="t" o:hr="t" fillcolor="#a0a0a0" stroked="f"/>
         </w:pict>
       </w:r>
     </w:p>
@@ -2553,7 +3492,7 @@
     <w:p>
       <w:r>
         <w:pict w14:anchorId="6409AB98">
-          <v:rect id="_x0000_i1063" style="width:0;height:0" o:hralign="center" o:hrstd="t" o:hr="t" fillcolor="#a0a0a0" stroked="f"/>
+          <v:rect id="_x0000_i1034" style="width:0;height:0" o:hralign="center" o:hrstd="t" o:hr="t" fillcolor="#a0a0a0" stroked="f"/>
         </w:pict>
       </w:r>
     </w:p>
@@ -2562,353 +3501,846 @@
         <w:rPr>
           <w:b/>
           <w:bCs/>
+          <w:highlight w:val="green"/>
         </w:rPr>
       </w:pPr>
       <w:r>
         <w:rPr>
           <w:b/>
           <w:bCs/>
+          <w:highlight w:val="green"/>
         </w:rPr>
         <w:t>Brief #8</w:t>
       </w:r>
     </w:p>
     <w:p>
-      <w:r>
+      <w:pPr>
+        <w:rPr>
+          <w:highlight w:val="green"/>
+        </w:rPr>
+      </w:pPr>
+      <w:r>
+        <w:rPr>
+          <w:highlight w:val="green"/>
+        </w:rPr>
         <w:t>text</w:t>
       </w:r>
     </w:p>
     <w:p>
-      <w:r>
+      <w:pPr>
+        <w:rPr>
+          <w:highlight w:val="green"/>
+        </w:rPr>
+      </w:pPr>
+      <w:r>
+        <w:rPr>
+          <w:highlight w:val="green"/>
+        </w:rPr>
         <w:t>====================================================</w:t>
       </w:r>
     </w:p>
     <w:p>
+      <w:pPr>
+        <w:rPr>
+          <w:highlight w:val="green"/>
+        </w:rPr>
+      </w:pPr>
       <w:r>
         <w:rPr>
           <w:rFonts w:ascii="Segoe UI Emoji" w:hAnsi="Segoe UI Emoji" w:cs="Segoe UI Emoji"/>
+          <w:highlight w:val="green"/>
         </w:rPr>
         <w:t>📋</w:t>
       </w:r>
       <w:r>
+        <w:rPr>
+          <w:highlight w:val="green"/>
+        </w:rPr>
         <w:t xml:space="preserve"> NEW ARTICLE BRIEF</w:t>
       </w:r>
     </w:p>
     <w:p>
-      <w:r>
+      <w:pPr>
+        <w:rPr>
+          <w:highlight w:val="green"/>
+        </w:rPr>
+      </w:pPr>
+      <w:r>
+        <w:rPr>
+          <w:highlight w:val="green"/>
+        </w:rPr>
         <w:t>====================================================</w:t>
       </w:r>
     </w:p>
-    <w:p/>
-    <w:p>
-      <w:r>
+    <w:p>
+      <w:pPr>
+        <w:rPr>
+          <w:highlight w:val="green"/>
+        </w:rPr>
+      </w:pPr>
+    </w:p>
+    <w:p>
+      <w:pPr>
+        <w:rPr>
+          <w:highlight w:val="green"/>
+        </w:rPr>
+      </w:pPr>
+      <w:r>
+        <w:rPr>
+          <w:highlight w:val="green"/>
+        </w:rPr>
         <w:t xml:space="preserve">Title Idea       </w:t>
       </w:r>
       <w:proofErr w:type="gramStart"/>
       <w:r>
-        <w:t xml:space="preserve">  :</w:t>
-      </w:r>
-      <w:proofErr w:type="gramEnd"/>
-      <w:r>
+        <w:rPr>
+          <w:highlight w:val="green"/>
+        </w:rPr>
+        <w:t xml:space="preserve">  :</w:t>
+      </w:r>
+      <w:proofErr w:type="gramEnd"/>
+      <w:r>
+        <w:rPr>
+          <w:highlight w:val="green"/>
+        </w:rPr>
         <w:t xml:space="preserve"> Digital Transformation or Digital</w:t>
       </w:r>
     </w:p>
     <w:p>
-      <w:r>
+      <w:pPr>
+        <w:rPr>
+          <w:highlight w:val="green"/>
+        </w:rPr>
+      </w:pPr>
+      <w:r>
+        <w:rPr>
+          <w:highlight w:val="green"/>
+        </w:rPr>
         <w:t xml:space="preserve">                     Disruption? What MENA CEOs Must</w:t>
       </w:r>
     </w:p>
     <w:p>
-      <w:r>
+      <w:pPr>
+        <w:rPr>
+          <w:highlight w:val="green"/>
+        </w:rPr>
+      </w:pPr>
+      <w:r>
+        <w:rPr>
+          <w:highlight w:val="green"/>
+        </w:rPr>
         <w:t xml:space="preserve">                     Decide Now</w:t>
       </w:r>
     </w:p>
-    <w:p/>
-    <w:p>
-      <w:r>
+    <w:p>
+      <w:pPr>
+        <w:rPr>
+          <w:highlight w:val="green"/>
+        </w:rPr>
+      </w:pPr>
+    </w:p>
+    <w:p>
+      <w:pPr>
+        <w:rPr>
+          <w:highlight w:val="green"/>
+        </w:rPr>
+      </w:pPr>
+      <w:r>
+        <w:rPr>
+          <w:highlight w:val="green"/>
+        </w:rPr>
         <w:t xml:space="preserve">Primary Service  </w:t>
       </w:r>
       <w:proofErr w:type="gramStart"/>
       <w:r>
-        <w:t xml:space="preserve">  :</w:t>
-      </w:r>
-      <w:proofErr w:type="gramEnd"/>
-      <w:r>
+        <w:rPr>
+          <w:highlight w:val="green"/>
+        </w:rPr>
+        <w:t xml:space="preserve">  :</w:t>
+      </w:r>
+      <w:proofErr w:type="gramEnd"/>
+      <w:r>
+        <w:rPr>
+          <w:highlight w:val="green"/>
+        </w:rPr>
         <w:t xml:space="preserve"> Digital Transformation</w:t>
       </w:r>
     </w:p>
-    <w:p/>
-    <w:p>
-      <w:r>
+    <w:p>
+      <w:pPr>
+        <w:rPr>
+          <w:highlight w:val="green"/>
+        </w:rPr>
+      </w:pPr>
+    </w:p>
+    <w:p>
+      <w:pPr>
+        <w:rPr>
+          <w:highlight w:val="green"/>
+        </w:rPr>
+      </w:pPr>
+      <w:r>
+        <w:rPr>
+          <w:highlight w:val="green"/>
+        </w:rPr>
         <w:t xml:space="preserve">Target Audience  </w:t>
       </w:r>
       <w:proofErr w:type="gramStart"/>
       <w:r>
-        <w:t xml:space="preserve">  :</w:t>
-      </w:r>
-      <w:proofErr w:type="gramEnd"/>
-      <w:r>
+        <w:rPr>
+          <w:highlight w:val="green"/>
+        </w:rPr>
+        <w:t xml:space="preserve">  :</w:t>
+      </w:r>
+      <w:proofErr w:type="gramEnd"/>
+      <w:r>
+        <w:rPr>
+          <w:highlight w:val="green"/>
+        </w:rPr>
         <w:t xml:space="preserve"> CEOs and senior leadership of</w:t>
       </w:r>
     </w:p>
     <w:p>
-      <w:r>
+      <w:pPr>
+        <w:rPr>
+          <w:highlight w:val="green"/>
+        </w:rPr>
+      </w:pPr>
+      <w:r>
+        <w:rPr>
+          <w:highlight w:val="green"/>
+        </w:rPr>
         <w:t xml:space="preserve">                     mid-to-large enterprises across</w:t>
       </w:r>
     </w:p>
     <w:p>
-      <w:r>
+      <w:pPr>
+        <w:rPr>
+          <w:highlight w:val="green"/>
+        </w:rPr>
+      </w:pPr>
+      <w:r>
+        <w:rPr>
+          <w:highlight w:val="green"/>
+        </w:rPr>
         <w:t xml:space="preserve">                     the MENA region</w:t>
       </w:r>
     </w:p>
-    <w:p/>
-    <w:p>
-      <w:r>
+    <w:p>
+      <w:pPr>
+        <w:rPr>
+          <w:highlight w:val="green"/>
+        </w:rPr>
+      </w:pPr>
+    </w:p>
+    <w:p>
+      <w:pPr>
+        <w:rPr>
+          <w:highlight w:val="green"/>
+        </w:rPr>
+      </w:pPr>
+      <w:r>
+        <w:rPr>
+          <w:highlight w:val="green"/>
+        </w:rPr>
         <w:t xml:space="preserve">MENA Country </w:t>
       </w:r>
       <w:proofErr w:type="gramStart"/>
       <w:r>
+        <w:rPr>
+          <w:highlight w:val="green"/>
+        </w:rPr>
         <w:t>Focus :</w:t>
       </w:r>
       <w:proofErr w:type="gramEnd"/>
       <w:r>
+        <w:rPr>
+          <w:highlight w:val="green"/>
+        </w:rPr>
         <w:t xml:space="preserve"> Pan-MENA</w:t>
       </w:r>
     </w:p>
-    <w:p/>
-    <w:p>
-      <w:r>
+    <w:p>
+      <w:pPr>
+        <w:rPr>
+          <w:highlight w:val="green"/>
+        </w:rPr>
+      </w:pPr>
+    </w:p>
+    <w:p>
+      <w:pPr>
+        <w:rPr>
+          <w:highlight w:val="green"/>
+        </w:rPr>
+      </w:pPr>
+      <w:r>
+        <w:rPr>
+          <w:highlight w:val="green"/>
+        </w:rPr>
         <w:t xml:space="preserve">Primary Keyword  </w:t>
       </w:r>
       <w:proofErr w:type="gramStart"/>
       <w:r>
-        <w:t xml:space="preserve">  :</w:t>
-      </w:r>
-      <w:proofErr w:type="gramEnd"/>
-      <w:r>
+        <w:rPr>
+          <w:highlight w:val="green"/>
+        </w:rPr>
+        <w:t xml:space="preserve">  :</w:t>
+      </w:r>
+      <w:proofErr w:type="gramEnd"/>
+      <w:r>
+        <w:rPr>
+          <w:highlight w:val="green"/>
+        </w:rPr>
         <w:t xml:space="preserve"> "digital transformation MENA</w:t>
       </w:r>
     </w:p>
     <w:p>
-      <w:r>
+      <w:pPr>
+        <w:rPr>
+          <w:highlight w:val="green"/>
+        </w:rPr>
+      </w:pPr>
+      <w:r>
+        <w:rPr>
+          <w:highlight w:val="green"/>
+        </w:rPr>
         <w:t xml:space="preserve">                     strategy"</w:t>
       </w:r>
     </w:p>
-    <w:p/>
-    <w:p>
-      <w:r>
+    <w:p>
+      <w:pPr>
+        <w:rPr>
+          <w:highlight w:val="green"/>
+        </w:rPr>
+      </w:pPr>
+    </w:p>
+    <w:p>
+      <w:pPr>
+        <w:rPr>
+          <w:highlight w:val="green"/>
+        </w:rPr>
+      </w:pPr>
+      <w:r>
+        <w:rPr>
+          <w:highlight w:val="green"/>
+        </w:rPr>
         <w:t xml:space="preserve">Secondary </w:t>
       </w:r>
       <w:proofErr w:type="gramStart"/>
       <w:r>
+        <w:rPr>
+          <w:highlight w:val="green"/>
+        </w:rPr>
         <w:t>Keywords :</w:t>
       </w:r>
       <w:proofErr w:type="gramEnd"/>
       <w:r>
+        <w:rPr>
+          <w:highlight w:val="green"/>
+        </w:rPr>
         <w:t xml:space="preserve"> business digitalization Middle East,</w:t>
       </w:r>
     </w:p>
     <w:p>
-      <w:r>
+      <w:pPr>
+        <w:rPr>
+          <w:highlight w:val="green"/>
+        </w:rPr>
+      </w:pPr>
+      <w:r>
+        <w:rPr>
+          <w:highlight w:val="green"/>
+        </w:rPr>
         <w:t xml:space="preserve">                     digital disruption GCC,</w:t>
       </w:r>
     </w:p>
     <w:p>
-      <w:r>
+      <w:pPr>
+        <w:rPr>
+          <w:highlight w:val="green"/>
+        </w:rPr>
+      </w:pPr>
+      <w:r>
+        <w:rPr>
+          <w:highlight w:val="green"/>
+        </w:rPr>
         <w:t xml:space="preserve">                     CEO digital agenda MENA</w:t>
       </w:r>
     </w:p>
-    <w:p/>
-    <w:p>
-      <w:r>
+    <w:p>
+      <w:pPr>
+        <w:rPr>
+          <w:highlight w:val="green"/>
+        </w:rPr>
+      </w:pPr>
+    </w:p>
+    <w:p>
+      <w:pPr>
+        <w:rPr>
+          <w:highlight w:val="green"/>
+        </w:rPr>
+      </w:pPr>
+      <w:r>
+        <w:rPr>
+          <w:highlight w:val="green"/>
+        </w:rPr>
         <w:t xml:space="preserve">Long-Tail </w:t>
       </w:r>
       <w:proofErr w:type="gramStart"/>
       <w:r>
+        <w:rPr>
+          <w:highlight w:val="green"/>
+        </w:rPr>
         <w:t>Keywords :</w:t>
       </w:r>
       <w:proofErr w:type="gramEnd"/>
       <w:r>
+        <w:rPr>
+          <w:highlight w:val="green"/>
+        </w:rPr>
         <w:t xml:space="preserve"> how MENA CEOs should approach</w:t>
       </w:r>
     </w:p>
     <w:p>
-      <w:r>
+      <w:pPr>
+        <w:rPr>
+          <w:highlight w:val="green"/>
+        </w:rPr>
+      </w:pPr>
+      <w:r>
+        <w:rPr>
+          <w:highlight w:val="green"/>
+        </w:rPr>
         <w:lastRenderedPageBreak/>
         <w:t xml:space="preserve">                     digital transformation,</w:t>
       </w:r>
     </w:p>
     <w:p>
-      <w:r>
+      <w:pPr>
+        <w:rPr>
+          <w:highlight w:val="green"/>
+        </w:rPr>
+      </w:pPr>
+      <w:r>
+        <w:rPr>
+          <w:highlight w:val="green"/>
+        </w:rPr>
         <w:t xml:space="preserve">                     digital transformation strategy</w:t>
       </w:r>
     </w:p>
     <w:p>
-      <w:r>
+      <w:pPr>
+        <w:rPr>
+          <w:highlight w:val="green"/>
+        </w:rPr>
+      </w:pPr>
+      <w:r>
+        <w:rPr>
+          <w:highlight w:val="green"/>
+        </w:rPr>
         <w:t xml:space="preserve">                     for Middle East businesses,</w:t>
       </w:r>
     </w:p>
     <w:p>
-      <w:r>
+      <w:pPr>
+        <w:rPr>
+          <w:highlight w:val="green"/>
+        </w:rPr>
+      </w:pPr>
+      <w:r>
+        <w:rPr>
+          <w:highlight w:val="green"/>
+        </w:rPr>
         <w:t xml:space="preserve">                     technology disruption risks GCC</w:t>
       </w:r>
     </w:p>
     <w:p>
-      <w:r>
+      <w:pPr>
+        <w:rPr>
+          <w:highlight w:val="green"/>
+        </w:rPr>
+      </w:pPr>
+      <w:r>
+        <w:rPr>
+          <w:highlight w:val="green"/>
+        </w:rPr>
         <w:t xml:space="preserve">                     companies</w:t>
       </w:r>
     </w:p>
-    <w:p/>
-    <w:p>
-      <w:r>
+    <w:p>
+      <w:pPr>
+        <w:rPr>
+          <w:highlight w:val="green"/>
+        </w:rPr>
+      </w:pPr>
+    </w:p>
+    <w:p>
+      <w:pPr>
+        <w:rPr>
+          <w:highlight w:val="green"/>
+        </w:rPr>
+      </w:pPr>
+      <w:r>
+        <w:rPr>
+          <w:highlight w:val="green"/>
+        </w:rPr>
         <w:t xml:space="preserve">Article Tone     </w:t>
       </w:r>
       <w:proofErr w:type="gramStart"/>
       <w:r>
-        <w:t xml:space="preserve">  :</w:t>
-      </w:r>
-      <w:proofErr w:type="gramEnd"/>
-      <w:r>
+        <w:rPr>
+          <w:highlight w:val="green"/>
+        </w:rPr>
+        <w:t xml:space="preserve">  :</w:t>
+      </w:r>
+      <w:proofErr w:type="gramEnd"/>
+      <w:r>
+        <w:rPr>
+          <w:highlight w:val="green"/>
+        </w:rPr>
         <w:t xml:space="preserve"> Thought Leadership</w:t>
       </w:r>
     </w:p>
-    <w:p/>
-    <w:p>
-      <w:r>
+    <w:p>
+      <w:pPr>
+        <w:rPr>
+          <w:highlight w:val="green"/>
+        </w:rPr>
+      </w:pPr>
+    </w:p>
+    <w:p>
+      <w:pPr>
+        <w:rPr>
+          <w:highlight w:val="green"/>
+        </w:rPr>
+      </w:pPr>
+      <w:r>
+        <w:rPr>
+          <w:highlight w:val="green"/>
+        </w:rPr>
         <w:t xml:space="preserve">Word Count       </w:t>
       </w:r>
       <w:proofErr w:type="gramStart"/>
       <w:r>
-        <w:t xml:space="preserve">  :</w:t>
-      </w:r>
-      <w:proofErr w:type="gramEnd"/>
-      <w:r>
+        <w:rPr>
+          <w:highlight w:val="green"/>
+        </w:rPr>
+        <w:t xml:space="preserve">  :</w:t>
+      </w:r>
+      <w:proofErr w:type="gramEnd"/>
+      <w:r>
+        <w:rPr>
+          <w:highlight w:val="green"/>
+        </w:rPr>
         <w:t xml:space="preserve"> 2,000 words</w:t>
       </w:r>
     </w:p>
-    <w:p/>
-    <w:p>
-      <w:r>
+    <w:p>
+      <w:pPr>
+        <w:rPr>
+          <w:highlight w:val="green"/>
+        </w:rPr>
+      </w:pPr>
+    </w:p>
+    <w:p>
+      <w:pPr>
+        <w:rPr>
+          <w:highlight w:val="green"/>
+        </w:rPr>
+      </w:pPr>
+      <w:r>
+        <w:rPr>
+          <w:highlight w:val="green"/>
+        </w:rPr>
         <w:t xml:space="preserve">Internal Links   </w:t>
       </w:r>
       <w:proofErr w:type="gramStart"/>
       <w:r>
-        <w:t xml:space="preserve">  :</w:t>
-      </w:r>
-      <w:proofErr w:type="gramEnd"/>
-      <w:r>
+        <w:rPr>
+          <w:highlight w:val="green"/>
+        </w:rPr>
+        <w:t xml:space="preserve">  :</w:t>
+      </w:r>
+      <w:proofErr w:type="gramEnd"/>
+      <w:r>
+        <w:rPr>
+          <w:highlight w:val="green"/>
+        </w:rPr>
         <w:t xml:space="preserve"> Digital Transformation service page</w:t>
       </w:r>
     </w:p>
-    <w:p/>
-    <w:p>
-      <w:r>
+    <w:p>
+      <w:pPr>
+        <w:rPr>
+          <w:highlight w:val="green"/>
+        </w:rPr>
+      </w:pPr>
+    </w:p>
+    <w:p>
+      <w:pPr>
+        <w:rPr>
+          <w:highlight w:val="green"/>
+        </w:rPr>
+      </w:pPr>
+      <w:r>
+        <w:rPr>
+          <w:highlight w:val="green"/>
+        </w:rPr>
         <w:t xml:space="preserve">CTA Goal         </w:t>
       </w:r>
       <w:proofErr w:type="gramStart"/>
       <w:r>
-        <w:t xml:space="preserve">  :</w:t>
-      </w:r>
-      <w:proofErr w:type="gramEnd"/>
-      <w:r>
+        <w:rPr>
+          <w:highlight w:val="green"/>
+        </w:rPr>
+        <w:t xml:space="preserve">  :</w:t>
+      </w:r>
+      <w:proofErr w:type="gramEnd"/>
+      <w:r>
+        <w:rPr>
+          <w:highlight w:val="green"/>
+        </w:rPr>
         <w:t xml:space="preserve"> Book a digital transformation</w:t>
       </w:r>
     </w:p>
     <w:p>
-      <w:r>
+      <w:pPr>
+        <w:rPr>
+          <w:highlight w:val="green"/>
+        </w:rPr>
+      </w:pPr>
+      <w:r>
+        <w:rPr>
+          <w:highlight w:val="green"/>
+        </w:rPr>
         <w:t xml:space="preserve">                     advisory session</w:t>
       </w:r>
     </w:p>
-    <w:p/>
-    <w:p>
-      <w:r>
+    <w:p>
+      <w:pPr>
+        <w:rPr>
+          <w:highlight w:val="green"/>
+        </w:rPr>
+      </w:pPr>
+    </w:p>
+    <w:p>
+      <w:pPr>
+        <w:rPr>
+          <w:highlight w:val="green"/>
+        </w:rPr>
+      </w:pPr>
+      <w:r>
+        <w:rPr>
+          <w:highlight w:val="green"/>
+        </w:rPr>
         <w:t xml:space="preserve">Extra Notes      </w:t>
       </w:r>
       <w:proofErr w:type="gramStart"/>
       <w:r>
-        <w:t xml:space="preserve">  :</w:t>
-      </w:r>
-      <w:proofErr w:type="gramEnd"/>
-      <w:r>
+        <w:rPr>
+          <w:highlight w:val="green"/>
+        </w:rPr>
+        <w:t xml:space="preserve">  :</w:t>
+      </w:r>
+      <w:proofErr w:type="gramEnd"/>
+      <w:r>
+        <w:rPr>
+          <w:highlight w:val="green"/>
+        </w:rPr>
         <w:t xml:space="preserve"> Reference OECD's note that MENA's</w:t>
       </w:r>
     </w:p>
     <w:p>
-      <w:r>
+      <w:pPr>
+        <w:rPr>
+          <w:highlight w:val="green"/>
+        </w:rPr>
+      </w:pPr>
+      <w:r>
+        <w:rPr>
+          <w:highlight w:val="green"/>
+        </w:rPr>
         <w:t xml:space="preserve">                     innovation ecosystems remain</w:t>
       </w:r>
     </w:p>
     <w:p>
-      <w:r>
+      <w:pPr>
+        <w:rPr>
+          <w:highlight w:val="green"/>
+        </w:rPr>
+      </w:pPr>
+      <w:r>
+        <w:rPr>
+          <w:highlight w:val="green"/>
+        </w:rPr>
         <w:t xml:space="preserve">                     fragmented by barriers to talent</w:t>
       </w:r>
     </w:p>
     <w:p>
-      <w:r>
+      <w:pPr>
+        <w:rPr>
+          <w:highlight w:val="green"/>
+        </w:rPr>
+      </w:pPr>
+      <w:r>
+        <w:rPr>
+          <w:highlight w:val="green"/>
+        </w:rPr>
         <w:t xml:space="preserve">                     mobility and weak research-business</w:t>
       </w:r>
     </w:p>
     <w:p>
-      <w:r>
+      <w:pPr>
+        <w:rPr>
+          <w:highlight w:val="green"/>
+        </w:rPr>
+      </w:pPr>
+      <w:r>
+        <w:rPr>
+          <w:highlight w:val="green"/>
+        </w:rPr>
         <w:t xml:space="preserve">                     links. Highlight the two-speed</w:t>
       </w:r>
     </w:p>
     <w:p>
-      <w:r>
+      <w:pPr>
+        <w:rPr>
+          <w:highlight w:val="green"/>
+        </w:rPr>
+      </w:pPr>
+      <w:r>
+        <w:rPr>
+          <w:highlight w:val="green"/>
+        </w:rPr>
         <w:t xml:space="preserve">                     MENA dynamic — high-growth GCC vs.</w:t>
       </w:r>
     </w:p>
     <w:p>
-      <w:r>
+      <w:pPr>
+        <w:rPr>
+          <w:highlight w:val="green"/>
+        </w:rPr>
+      </w:pPr>
+      <w:r>
+        <w:rPr>
+          <w:highlight w:val="green"/>
+        </w:rPr>
         <w:t xml:space="preserve">                     cash-based markets like Iraq and</w:t>
       </w:r>
     </w:p>
     <w:p>
-      <w:r>
+      <w:pPr>
+        <w:rPr>
+          <w:highlight w:val="green"/>
+        </w:rPr>
+      </w:pPr>
+      <w:r>
+        <w:rPr>
+          <w:highlight w:val="green"/>
+        </w:rPr>
         <w:t xml:space="preserve">                     Lebanon. Encourage CEOs to define</w:t>
       </w:r>
     </w:p>
     <w:p>
-      <w:r>
+      <w:pPr>
+        <w:rPr>
+          <w:highlight w:val="green"/>
+        </w:rPr>
+      </w:pPr>
+      <w:r>
+        <w:rPr>
+          <w:highlight w:val="green"/>
+        </w:rPr>
         <w:t xml:space="preserve">                     their transformation roadmap before</w:t>
       </w:r>
     </w:p>
     <w:p>
-      <w:r>
+      <w:pPr>
+        <w:rPr>
+          <w:highlight w:val="green"/>
+        </w:rPr>
+      </w:pPr>
+      <w:r>
+        <w:rPr>
+          <w:highlight w:val="green"/>
+        </w:rPr>
         <w:t xml:space="preserve">                     disruption forces their hand.</w:t>
       </w:r>
     </w:p>
-    <w:p/>
-    <w:p>
-      <w:r>
+    <w:p>
+      <w:pPr>
+        <w:rPr>
+          <w:highlight w:val="green"/>
+        </w:rPr>
+      </w:pPr>
+    </w:p>
+    <w:p>
+      <w:pPr>
+        <w:rPr>
+          <w:highlight w:val="green"/>
+        </w:rPr>
+      </w:pPr>
+      <w:r>
+        <w:rPr>
+          <w:highlight w:val="green"/>
+        </w:rPr>
         <w:t>====================================================</w:t>
       </w:r>
     </w:p>
     <w:p>
+      <w:pPr>
+        <w:rPr>
+          <w:highlight w:val="green"/>
+        </w:rPr>
+      </w:pPr>
       <w:r>
         <w:rPr>
           <w:rFonts w:ascii="Segoe UI Emoji" w:hAnsi="Segoe UI Emoji" w:cs="Segoe UI Emoji"/>
+          <w:highlight w:val="green"/>
         </w:rPr>
         <w:t>▶</w:t>
       </w:r>
       <w:r>
+        <w:rPr>
+          <w:highlight w:val="green"/>
+        </w:rPr>
         <w:t xml:space="preserve"> Please generate the full article following</w:t>
       </w:r>
     </w:p>
     <w:p>
-      <w:r>
+      <w:pPr>
+        <w:rPr>
+          <w:highlight w:val="green"/>
+        </w:rPr>
+      </w:pPr>
+      <w:r>
+        <w:rPr>
+          <w:highlight w:val="green"/>
+        </w:rPr>
         <w:t xml:space="preserve">  the project instructions.</w:t>
       </w:r>
     </w:p>
     <w:p>
-      <w:r>
+      <w:pPr>
+        <w:rPr>
+          <w:highlight w:val="green"/>
+        </w:rPr>
+      </w:pPr>
+      <w:r>
+        <w:rPr>
+          <w:highlight w:val="green"/>
+        </w:rPr>
         <w:t>====================================================</w:t>
       </w:r>
     </w:p>
     <w:p>
       <w:r>
+        <w:rPr>
+          <w:highlight w:val="green"/>
+        </w:rPr>
         <w:lastRenderedPageBreak/>
         <w:pict w14:anchorId="6208C035">
-          <v:rect id="_x0000_i1064" style="width:0;height:0" o:hralign="center" o:hrstd="t" o:hr="t" fillcolor="#a0a0a0" stroked="f"/>
+          <v:rect id="_x0000_i1035" style="width:0;height:0" o:hralign="center" o:hrstd="t" o:hr="t" fillcolor="#a0a0a0" stroked="f"/>
         </w:pict>
       </w:r>
     </w:p>
@@ -3272,7 +4704,7 @@
     <w:p>
       <w:r>
         <w:pict w14:anchorId="04C290DE">
-          <v:rect id="_x0000_i1065" style="width:0;height:0" o:hralign="center" o:hrstd="t" o:hr="t" fillcolor="#a0a0a0" stroked="f"/>
+          <v:rect id="_x0000_i1036" style="width:0;height:0" o:hralign="center" o:hrstd="t" o:hr="t" fillcolor="#a0a0a0" stroked="f"/>
         </w:pict>
       </w:r>
     </w:p>
@@ -3650,7 +5082,7 @@
     <w:p>
       <w:r>
         <w:pict w14:anchorId="373C3F6F">
-          <v:rect id="_x0000_i1066" style="width:0;height:0" o:hralign="center" o:hrstd="t" o:hr="t" fillcolor="#a0a0a0" stroked="f"/>
+          <v:rect id="_x0000_i1037" style="width:0;height:0" o:hralign="center" o:hrstd="t" o:hr="t" fillcolor="#a0a0a0" stroked="f"/>
         </w:pict>
       </w:r>
     </w:p>
@@ -4004,7 +5436,7 @@
     <w:p>
       <w:r>
         <w:pict w14:anchorId="1D5A544D">
-          <v:rect id="_x0000_i1067" style="width:0;height:0" o:hralign="center" o:hrstd="t" o:hr="t" fillcolor="#a0a0a0" stroked="f"/>
+          <v:rect id="_x0000_i1038" style="width:0;height:0" o:hralign="center" o:hrstd="t" o:hr="t" fillcolor="#a0a0a0" stroked="f"/>
         </w:pict>
       </w:r>
     </w:p>
@@ -4359,7 +5791,7 @@
     <w:p>
       <w:r>
         <w:pict w14:anchorId="2D60D2AF">
-          <v:rect id="_x0000_i1068" style="width:0;height:0" o:hralign="center" o:hrstd="t" o:hr="t" fillcolor="#a0a0a0" stroked="f"/>
+          <v:rect id="_x0000_i1039" style="width:0;height:0" o:hralign="center" o:hrstd="t" o:hr="t" fillcolor="#a0a0a0" stroked="f"/>
         </w:pict>
       </w:r>
     </w:p>
@@ -4741,7 +6173,7 @@
     <w:p>
       <w:r>
         <w:pict w14:anchorId="767F4CB4">
-          <v:rect id="_x0000_i1069" style="width:0;height:0" o:hralign="center" o:hrstd="t" o:hr="t" fillcolor="#a0a0a0" stroked="f"/>
+          <v:rect id="_x0000_i1040" style="width:0;height:0" o:hralign="center" o:hrstd="t" o:hr="t" fillcolor="#a0a0a0" stroked="f"/>
         </w:pict>
       </w:r>
     </w:p>
@@ -5102,7 +6534,7 @@
     <w:p>
       <w:r>
         <w:pict w14:anchorId="0CAE7A06">
-          <v:rect id="_x0000_i1070" style="width:0;height:0" o:hralign="center" o:hrstd="t" o:hr="t" fillcolor="#a0a0a0" stroked="f"/>
+          <v:rect id="_x0000_i1041" style="width:0;height:0" o:hralign="center" o:hrstd="t" o:hr="t" fillcolor="#a0a0a0" stroked="f"/>
         </w:pict>
       </w:r>
     </w:p>
@@ -5132,7 +6564,7 @@
     <w:p>
       <w:r>
         <w:pict w14:anchorId="1C8BE98F">
-          <v:rect id="_x0000_i1071" style="width:0;height:0" o:hralign="center" o:hrstd="t" o:hr="t" fillcolor="#a0a0a0" stroked="f"/>
+          <v:rect id="_x0000_i1042" style="width:0;height:0" o:hralign="center" o:hrstd="t" o:hr="t" fillcolor="#a0a0a0" stroked="f"/>
         </w:pict>
       </w:r>
     </w:p>
@@ -5157,331 +6589,798 @@
       </w:r>
     </w:p>
     <w:p>
-      <w:r>
+      <w:pPr>
+        <w:rPr>
+          <w:highlight w:val="green"/>
+        </w:rPr>
+      </w:pPr>
+      <w:r>
+        <w:rPr>
+          <w:highlight w:val="green"/>
+        </w:rPr>
         <w:t>====================================================</w:t>
       </w:r>
     </w:p>
     <w:p>
+      <w:pPr>
+        <w:rPr>
+          <w:highlight w:val="green"/>
+        </w:rPr>
+      </w:pPr>
       <w:r>
         <w:rPr>
           <w:rFonts w:ascii="Segoe UI Emoji" w:hAnsi="Segoe UI Emoji" w:cs="Segoe UI Emoji"/>
+          <w:highlight w:val="green"/>
         </w:rPr>
         <w:t>📋</w:t>
       </w:r>
       <w:r>
+        <w:rPr>
+          <w:highlight w:val="green"/>
+        </w:rPr>
         <w:t xml:space="preserve"> NEW ARTICLE BRIEF</w:t>
       </w:r>
     </w:p>
     <w:p>
-      <w:r>
+      <w:pPr>
+        <w:rPr>
+          <w:highlight w:val="green"/>
+        </w:rPr>
+      </w:pPr>
+      <w:r>
+        <w:rPr>
+          <w:highlight w:val="green"/>
+        </w:rPr>
         <w:t>====================================================</w:t>
       </w:r>
     </w:p>
-    <w:p/>
-    <w:p>
-      <w:r>
+    <w:p>
+      <w:pPr>
+        <w:rPr>
+          <w:highlight w:val="green"/>
+        </w:rPr>
+      </w:pPr>
+    </w:p>
+    <w:p>
+      <w:pPr>
+        <w:rPr>
+          <w:highlight w:val="green"/>
+        </w:rPr>
+      </w:pPr>
+      <w:r>
+        <w:rPr>
+          <w:highlight w:val="green"/>
+        </w:rPr>
         <w:lastRenderedPageBreak/>
         <w:t xml:space="preserve">Title Idea       </w:t>
       </w:r>
       <w:proofErr w:type="gramStart"/>
       <w:r>
-        <w:t xml:space="preserve">  :</w:t>
-      </w:r>
-      <w:proofErr w:type="gramEnd"/>
-      <w:r>
+        <w:rPr>
+          <w:highlight w:val="green"/>
+        </w:rPr>
+        <w:t xml:space="preserve">  :</w:t>
+      </w:r>
+      <w:proofErr w:type="gramEnd"/>
+      <w:r>
+        <w:rPr>
+          <w:highlight w:val="green"/>
+        </w:rPr>
         <w:t xml:space="preserve"> What Is a Fractional CFO and Why</w:t>
       </w:r>
     </w:p>
     <w:p>
-      <w:r>
+      <w:pPr>
+        <w:rPr>
+          <w:highlight w:val="green"/>
+        </w:rPr>
+      </w:pPr>
+      <w:r>
+        <w:rPr>
+          <w:highlight w:val="green"/>
+        </w:rPr>
         <w:t xml:space="preserve">                     MENA SMEs Are Rapidly Embracing</w:t>
       </w:r>
     </w:p>
     <w:p>
-      <w:r>
+      <w:pPr>
+        <w:rPr>
+          <w:highlight w:val="green"/>
+        </w:rPr>
+      </w:pPr>
+      <w:r>
+        <w:rPr>
+          <w:highlight w:val="green"/>
+        </w:rPr>
         <w:t xml:space="preserve">                     the Model</w:t>
       </w:r>
     </w:p>
-    <w:p/>
-    <w:p>
-      <w:r>
+    <w:p>
+      <w:pPr>
+        <w:rPr>
+          <w:highlight w:val="green"/>
+        </w:rPr>
+      </w:pPr>
+    </w:p>
+    <w:p>
+      <w:pPr>
+        <w:rPr>
+          <w:highlight w:val="green"/>
+        </w:rPr>
+      </w:pPr>
+      <w:r>
+        <w:rPr>
+          <w:highlight w:val="green"/>
+        </w:rPr>
         <w:t xml:space="preserve">Primary Service  </w:t>
       </w:r>
       <w:proofErr w:type="gramStart"/>
       <w:r>
-        <w:t xml:space="preserve">  :</w:t>
-      </w:r>
-      <w:proofErr w:type="gramEnd"/>
-      <w:r>
+        <w:rPr>
+          <w:highlight w:val="green"/>
+        </w:rPr>
+        <w:t xml:space="preserve">  :</w:t>
+      </w:r>
+      <w:proofErr w:type="gramEnd"/>
+      <w:r>
+        <w:rPr>
+          <w:highlight w:val="green"/>
+        </w:rPr>
         <w:t xml:space="preserve"> Fractional CFO</w:t>
       </w:r>
     </w:p>
-    <w:p/>
-    <w:p>
-      <w:r>
+    <w:p>
+      <w:pPr>
+        <w:rPr>
+          <w:highlight w:val="green"/>
+        </w:rPr>
+      </w:pPr>
+    </w:p>
+    <w:p>
+      <w:pPr>
+        <w:rPr>
+          <w:highlight w:val="green"/>
+        </w:rPr>
+      </w:pPr>
+      <w:r>
+        <w:rPr>
+          <w:highlight w:val="green"/>
+        </w:rPr>
         <w:t xml:space="preserve">Target Audience  </w:t>
       </w:r>
       <w:proofErr w:type="gramStart"/>
       <w:r>
-        <w:t xml:space="preserve">  :</w:t>
-      </w:r>
-      <w:proofErr w:type="gramEnd"/>
-      <w:r>
+        <w:rPr>
+          <w:highlight w:val="green"/>
+        </w:rPr>
+        <w:t xml:space="preserve">  :</w:t>
+      </w:r>
+      <w:proofErr w:type="gramEnd"/>
+      <w:r>
+        <w:rPr>
+          <w:highlight w:val="green"/>
+        </w:rPr>
         <w:t xml:space="preserve"> SME owners, startup founders, and</w:t>
       </w:r>
     </w:p>
     <w:p>
-      <w:r>
+      <w:pPr>
+        <w:rPr>
+          <w:highlight w:val="green"/>
+        </w:rPr>
+      </w:pPr>
+      <w:r>
+        <w:rPr>
+          <w:highlight w:val="green"/>
+        </w:rPr>
         <w:t xml:space="preserve">                     entrepreneurs across MENA who lack</w:t>
       </w:r>
     </w:p>
     <w:p>
-      <w:r>
+      <w:pPr>
+        <w:rPr>
+          <w:highlight w:val="green"/>
+        </w:rPr>
+      </w:pPr>
+      <w:r>
+        <w:rPr>
+          <w:highlight w:val="green"/>
+        </w:rPr>
         <w:t xml:space="preserve">                     senior financial leadership</w:t>
       </w:r>
     </w:p>
-    <w:p/>
-    <w:p>
-      <w:r>
+    <w:p>
+      <w:pPr>
+        <w:rPr>
+          <w:highlight w:val="green"/>
+        </w:rPr>
+      </w:pPr>
+    </w:p>
+    <w:p>
+      <w:pPr>
+        <w:rPr>
+          <w:highlight w:val="green"/>
+        </w:rPr>
+      </w:pPr>
+      <w:r>
+        <w:rPr>
+          <w:highlight w:val="green"/>
+        </w:rPr>
         <w:t xml:space="preserve">MENA Country </w:t>
       </w:r>
       <w:proofErr w:type="gramStart"/>
       <w:r>
+        <w:rPr>
+          <w:highlight w:val="green"/>
+        </w:rPr>
         <w:t>Focus :</w:t>
       </w:r>
       <w:proofErr w:type="gramEnd"/>
       <w:r>
+        <w:rPr>
+          <w:highlight w:val="green"/>
+        </w:rPr>
         <w:t xml:space="preserve"> Pan-MENA (UAE, Egypt, Lebanon)</w:t>
       </w:r>
     </w:p>
-    <w:p/>
-    <w:p>
-      <w:r>
+    <w:p>
+      <w:pPr>
+        <w:rPr>
+          <w:highlight w:val="green"/>
+        </w:rPr>
+      </w:pPr>
+    </w:p>
+    <w:p>
+      <w:pPr>
+        <w:rPr>
+          <w:highlight w:val="green"/>
+        </w:rPr>
+      </w:pPr>
+      <w:r>
+        <w:rPr>
+          <w:highlight w:val="green"/>
+        </w:rPr>
         <w:t xml:space="preserve">Primary Keyword  </w:t>
       </w:r>
       <w:proofErr w:type="gramStart"/>
       <w:r>
-        <w:t xml:space="preserve">  :</w:t>
-      </w:r>
-      <w:proofErr w:type="gramEnd"/>
-      <w:r>
+        <w:rPr>
+          <w:highlight w:val="green"/>
+        </w:rPr>
+        <w:t xml:space="preserve">  :</w:t>
+      </w:r>
+      <w:proofErr w:type="gramEnd"/>
+      <w:r>
+        <w:rPr>
+          <w:highlight w:val="green"/>
+        </w:rPr>
         <w:t xml:space="preserve"> "fractional CFO MENA SME"</w:t>
       </w:r>
     </w:p>
-    <w:p/>
-    <w:p>
-      <w:r>
+    <w:p>
+      <w:pPr>
+        <w:rPr>
+          <w:highlight w:val="green"/>
+        </w:rPr>
+      </w:pPr>
+    </w:p>
+    <w:p>
+      <w:pPr>
+        <w:rPr>
+          <w:highlight w:val="green"/>
+        </w:rPr>
+      </w:pPr>
+      <w:r>
+        <w:rPr>
+          <w:highlight w:val="green"/>
+        </w:rPr>
         <w:t xml:space="preserve">Secondary </w:t>
       </w:r>
       <w:proofErr w:type="gramStart"/>
       <w:r>
+        <w:rPr>
+          <w:highlight w:val="green"/>
+        </w:rPr>
         <w:t>Keywords :</w:t>
       </w:r>
       <w:proofErr w:type="gramEnd"/>
       <w:r>
+        <w:rPr>
+          <w:highlight w:val="green"/>
+        </w:rPr>
         <w:t xml:space="preserve"> outsourced CFO Middle East,</w:t>
       </w:r>
     </w:p>
     <w:p>
-      <w:r>
+      <w:pPr>
+        <w:rPr>
+          <w:highlight w:val="green"/>
+        </w:rPr>
+      </w:pPr>
+      <w:r>
+        <w:rPr>
+          <w:highlight w:val="green"/>
+        </w:rPr>
         <w:t xml:space="preserve">                     part-time CFO services MENA,</w:t>
       </w:r>
     </w:p>
     <w:p>
-      <w:r>
+      <w:pPr>
+        <w:rPr>
+          <w:highlight w:val="green"/>
+        </w:rPr>
+      </w:pPr>
+      <w:r>
+        <w:rPr>
+          <w:highlight w:val="green"/>
+        </w:rPr>
         <w:t xml:space="preserve">                     SME financial leadership UAE</w:t>
       </w:r>
     </w:p>
-    <w:p/>
-    <w:p>
-      <w:r>
+    <w:p>
+      <w:pPr>
+        <w:rPr>
+          <w:highlight w:val="green"/>
+        </w:rPr>
+      </w:pPr>
+    </w:p>
+    <w:p>
+      <w:pPr>
+        <w:rPr>
+          <w:highlight w:val="green"/>
+        </w:rPr>
+      </w:pPr>
+      <w:r>
+        <w:rPr>
+          <w:highlight w:val="green"/>
+        </w:rPr>
         <w:t xml:space="preserve">Long-Tail </w:t>
       </w:r>
       <w:proofErr w:type="gramStart"/>
       <w:r>
+        <w:rPr>
+          <w:highlight w:val="green"/>
+        </w:rPr>
         <w:t>Keywords :</w:t>
       </w:r>
       <w:proofErr w:type="gramEnd"/>
       <w:r>
+        <w:rPr>
+          <w:highlight w:val="green"/>
+        </w:rPr>
         <w:t xml:space="preserve"> what is a fractional CFO and</w:t>
       </w:r>
     </w:p>
     <w:p>
-      <w:r>
+      <w:pPr>
+        <w:rPr>
+          <w:highlight w:val="green"/>
+        </w:rPr>
+      </w:pPr>
+      <w:r>
+        <w:rPr>
+          <w:highlight w:val="green"/>
+        </w:rPr>
         <w:t xml:space="preserve">                     do I need one in the Middle East,</w:t>
       </w:r>
     </w:p>
     <w:p>
-      <w:r>
+      <w:pPr>
+        <w:rPr>
+          <w:highlight w:val="green"/>
+        </w:rPr>
+      </w:pPr>
+      <w:r>
+        <w:rPr>
+          <w:highlight w:val="green"/>
+        </w:rPr>
         <w:t xml:space="preserve">                     outsourced CFO benefits for SMEs</w:t>
       </w:r>
     </w:p>
     <w:p>
-      <w:r>
+      <w:pPr>
+        <w:rPr>
+          <w:highlight w:val="green"/>
+        </w:rPr>
+      </w:pPr>
+      <w:r>
+        <w:rPr>
+          <w:highlight w:val="green"/>
+        </w:rPr>
         <w:t xml:space="preserve">                     in the UAE,</w:t>
       </w:r>
     </w:p>
     <w:p>
-      <w:r>
+      <w:pPr>
+        <w:rPr>
+          <w:highlight w:val="green"/>
+        </w:rPr>
+      </w:pPr>
+      <w:r>
+        <w:rPr>
+          <w:highlight w:val="green"/>
+        </w:rPr>
         <w:t xml:space="preserve">                     fractional CFO vs full-time CFO</w:t>
       </w:r>
     </w:p>
     <w:p>
-      <w:r>
+      <w:pPr>
+        <w:rPr>
+          <w:highlight w:val="green"/>
+        </w:rPr>
+      </w:pPr>
+      <w:r>
+        <w:rPr>
+          <w:highlight w:val="green"/>
+        </w:rPr>
         <w:t xml:space="preserve">                     MENA comparison</w:t>
       </w:r>
     </w:p>
-    <w:p/>
-    <w:p>
-      <w:r>
+    <w:p>
+      <w:pPr>
+        <w:rPr>
+          <w:highlight w:val="green"/>
+        </w:rPr>
+      </w:pPr>
+    </w:p>
+    <w:p>
+      <w:pPr>
+        <w:rPr>
+          <w:highlight w:val="green"/>
+        </w:rPr>
+      </w:pPr>
+      <w:r>
+        <w:rPr>
+          <w:highlight w:val="green"/>
+        </w:rPr>
         <w:t xml:space="preserve">Article Tone     </w:t>
       </w:r>
       <w:proofErr w:type="gramStart"/>
       <w:r>
-        <w:t xml:space="preserve">  :</w:t>
-      </w:r>
-      <w:proofErr w:type="gramEnd"/>
-      <w:r>
+        <w:rPr>
+          <w:highlight w:val="green"/>
+        </w:rPr>
+        <w:t xml:space="preserve">  :</w:t>
+      </w:r>
+      <w:proofErr w:type="gramEnd"/>
+      <w:r>
+        <w:rPr>
+          <w:highlight w:val="green"/>
+        </w:rPr>
         <w:t xml:space="preserve"> Educational</w:t>
       </w:r>
     </w:p>
-    <w:p/>
-    <w:p>
-      <w:r>
+    <w:p>
+      <w:pPr>
+        <w:rPr>
+          <w:highlight w:val="green"/>
+        </w:rPr>
+      </w:pPr>
+    </w:p>
+    <w:p>
+      <w:pPr>
+        <w:rPr>
+          <w:highlight w:val="green"/>
+        </w:rPr>
+      </w:pPr>
+      <w:r>
+        <w:rPr>
+          <w:highlight w:val="green"/>
+        </w:rPr>
         <w:t xml:space="preserve">Word Count       </w:t>
       </w:r>
       <w:proofErr w:type="gramStart"/>
       <w:r>
-        <w:t xml:space="preserve">  :</w:t>
-      </w:r>
-      <w:proofErr w:type="gramEnd"/>
-      <w:r>
+        <w:rPr>
+          <w:highlight w:val="green"/>
+        </w:rPr>
+        <w:t xml:space="preserve">  :</w:t>
+      </w:r>
+      <w:proofErr w:type="gramEnd"/>
+      <w:r>
+        <w:rPr>
+          <w:highlight w:val="green"/>
+        </w:rPr>
         <w:t xml:space="preserve"> 1,800 words</w:t>
       </w:r>
     </w:p>
-    <w:p/>
-    <w:p>
-      <w:r>
+    <w:p>
+      <w:pPr>
+        <w:rPr>
+          <w:highlight w:val="green"/>
+        </w:rPr>
+      </w:pPr>
+    </w:p>
+    <w:p>
+      <w:pPr>
+        <w:rPr>
+          <w:highlight w:val="green"/>
+        </w:rPr>
+      </w:pPr>
+      <w:r>
+        <w:rPr>
+          <w:highlight w:val="green"/>
+        </w:rPr>
         <w:t xml:space="preserve">Internal Links   </w:t>
       </w:r>
       <w:proofErr w:type="gramStart"/>
       <w:r>
-        <w:t xml:space="preserve">  :</w:t>
-      </w:r>
-      <w:proofErr w:type="gramEnd"/>
-      <w:r>
+        <w:rPr>
+          <w:highlight w:val="green"/>
+        </w:rPr>
+        <w:t xml:space="preserve">  :</w:t>
+      </w:r>
+      <w:proofErr w:type="gramEnd"/>
+      <w:r>
+        <w:rPr>
+          <w:highlight w:val="green"/>
+        </w:rPr>
         <w:t xml:space="preserve"> Fractional CFO service page</w:t>
       </w:r>
     </w:p>
-    <w:p/>
-    <w:p>
-      <w:r>
+    <w:p>
+      <w:pPr>
+        <w:rPr>
+          <w:highlight w:val="green"/>
+        </w:rPr>
+      </w:pPr>
+    </w:p>
+    <w:p>
+      <w:pPr>
+        <w:rPr>
+          <w:highlight w:val="green"/>
+        </w:rPr>
+      </w:pPr>
+      <w:r>
+        <w:rPr>
+          <w:highlight w:val="green"/>
+        </w:rPr>
         <w:t xml:space="preserve">CTA Goal         </w:t>
       </w:r>
       <w:proofErr w:type="gramStart"/>
       <w:r>
-        <w:t xml:space="preserve">  :</w:t>
-      </w:r>
-      <w:proofErr w:type="gramEnd"/>
-      <w:r>
+        <w:rPr>
+          <w:highlight w:val="green"/>
+        </w:rPr>
+        <w:t xml:space="preserve">  :</w:t>
+      </w:r>
+      <w:proofErr w:type="gramEnd"/>
+      <w:r>
+        <w:rPr>
+          <w:highlight w:val="green"/>
+        </w:rPr>
         <w:t xml:space="preserve"> Book a free Fractional CFO</w:t>
       </w:r>
     </w:p>
     <w:p>
-      <w:r>
+      <w:pPr>
+        <w:rPr>
+          <w:highlight w:val="green"/>
+        </w:rPr>
+      </w:pPr>
+      <w:r>
+        <w:rPr>
+          <w:highlight w:val="green"/>
+        </w:rPr>
         <w:t xml:space="preserve">                     discovery call</w:t>
       </w:r>
     </w:p>
-    <w:p/>
-    <w:p>
-      <w:r>
+    <w:p>
+      <w:pPr>
+        <w:rPr>
+          <w:highlight w:val="green"/>
+        </w:rPr>
+      </w:pPr>
+    </w:p>
+    <w:p>
+      <w:pPr>
+        <w:rPr>
+          <w:highlight w:val="green"/>
+        </w:rPr>
+      </w:pPr>
+      <w:r>
+        <w:rPr>
+          <w:highlight w:val="green"/>
+        </w:rPr>
         <w:t xml:space="preserve">Extra Notes      </w:t>
       </w:r>
       <w:proofErr w:type="gramStart"/>
       <w:r>
-        <w:t xml:space="preserve">  :</w:t>
-      </w:r>
-      <w:proofErr w:type="gramEnd"/>
-      <w:r>
+        <w:rPr>
+          <w:highlight w:val="green"/>
+        </w:rPr>
+        <w:t xml:space="preserve">  :</w:t>
+      </w:r>
+      <w:proofErr w:type="gramEnd"/>
+      <w:r>
+        <w:rPr>
+          <w:highlight w:val="green"/>
+        </w:rPr>
         <w:t xml:space="preserve"> Acknowledge Lebanon's financial</w:t>
       </w:r>
     </w:p>
     <w:p>
-      <w:r>
+      <w:pPr>
+        <w:rPr>
+          <w:highlight w:val="green"/>
+        </w:rPr>
+      </w:pPr>
+      <w:r>
+        <w:rPr>
+          <w:highlight w:val="green"/>
+        </w:rPr>
         <w:t xml:space="preserve">                     crisis context — where companies</w:t>
       </w:r>
     </w:p>
     <w:p>
-      <w:r>
+      <w:pPr>
+        <w:rPr>
+          <w:highlight w:val="green"/>
+        </w:rPr>
+      </w:pPr>
+      <w:r>
+        <w:rPr>
+          <w:highlight w:val="green"/>
+        </w:rPr>
         <w:t xml:space="preserve">                     need high-level financial guidance</w:t>
       </w:r>
     </w:p>
     <w:p>
-      <w:r>
+      <w:pPr>
+        <w:rPr>
+          <w:highlight w:val="green"/>
+        </w:rPr>
+      </w:pPr>
+      <w:r>
+        <w:rPr>
+          <w:highlight w:val="green"/>
+        </w:rPr>
         <w:t xml:space="preserve">                     but cannot afford full-time CFOs.</w:t>
       </w:r>
     </w:p>
     <w:p>
-      <w:r>
+      <w:pPr>
+        <w:rPr>
+          <w:highlight w:val="green"/>
+        </w:rPr>
+      </w:pPr>
+      <w:r>
+        <w:rPr>
+          <w:highlight w:val="green"/>
+        </w:rPr>
         <w:t xml:space="preserve">                     Reference OECD's finding that over</w:t>
       </w:r>
     </w:p>
     <w:p>
-      <w:r>
+      <w:pPr>
+        <w:rPr>
+          <w:highlight w:val="green"/>
+        </w:rPr>
+      </w:pPr>
+      <w:r>
+        <w:rPr>
+          <w:highlight w:val="green"/>
+        </w:rPr>
         <w:t xml:space="preserve">                     300 million young people will enter</w:t>
       </w:r>
     </w:p>
     <w:p>
-      <w:r>
+      <w:pPr>
+        <w:rPr>
+          <w:highlight w:val="green"/>
+        </w:rPr>
+      </w:pPr>
+      <w:r>
+        <w:rPr>
+          <w:highlight w:val="green"/>
+        </w:rPr>
         <w:t xml:space="preserve">                     MENA labor markets, driving a wave</w:t>
       </w:r>
     </w:p>
     <w:p>
-      <w:r>
+      <w:pPr>
+        <w:rPr>
+          <w:highlight w:val="green"/>
+        </w:rPr>
+      </w:pPr>
+      <w:r>
+        <w:rPr>
+          <w:highlight w:val="green"/>
+        </w:rPr>
         <w:t xml:space="preserve">                     of new business formation. Position</w:t>
       </w:r>
     </w:p>
     <w:p>
-      <w:r>
+      <w:pPr>
+        <w:rPr>
+          <w:highlight w:val="green"/>
+        </w:rPr>
+      </w:pPr>
+      <w:r>
+        <w:rPr>
+          <w:highlight w:val="green"/>
+        </w:rPr>
         <w:t xml:space="preserve">                     the Fractional CFO as the smart</w:t>
       </w:r>
     </w:p>
     <w:p>
-      <w:r>
+      <w:pPr>
+        <w:rPr>
+          <w:highlight w:val="green"/>
+        </w:rPr>
+      </w:pPr>
+      <w:r>
+        <w:rPr>
+          <w:highlight w:val="green"/>
+        </w:rPr>
         <w:t xml:space="preserve">                     solution for growth-stage companies.</w:t>
       </w:r>
     </w:p>
-    <w:p/>
-    <w:p>
-      <w:r>
+    <w:p>
+      <w:pPr>
+        <w:rPr>
+          <w:highlight w:val="green"/>
+        </w:rPr>
+      </w:pPr>
+    </w:p>
+    <w:p>
+      <w:pPr>
+        <w:rPr>
+          <w:highlight w:val="green"/>
+        </w:rPr>
+      </w:pPr>
+      <w:r>
+        <w:rPr>
+          <w:highlight w:val="green"/>
+        </w:rPr>
         <w:t>====================================================</w:t>
       </w:r>
     </w:p>
     <w:p>
+      <w:pPr>
+        <w:rPr>
+          <w:highlight w:val="green"/>
+        </w:rPr>
+      </w:pPr>
       <w:r>
         <w:rPr>
           <w:rFonts w:ascii="Segoe UI Emoji" w:hAnsi="Segoe UI Emoji" w:cs="Segoe UI Emoji"/>
+          <w:highlight w:val="green"/>
         </w:rPr>
         <w:t>▶</w:t>
       </w:r>
       <w:r>
+        <w:rPr>
+          <w:highlight w:val="green"/>
+        </w:rPr>
         <w:t xml:space="preserve"> Please generate the full article following</w:t>
       </w:r>
     </w:p>
     <w:p>
-      <w:r>
+      <w:pPr>
+        <w:rPr>
+          <w:highlight w:val="green"/>
+        </w:rPr>
+      </w:pPr>
+      <w:r>
+        <w:rPr>
+          <w:highlight w:val="green"/>
+        </w:rPr>
         <w:t xml:space="preserve">  the project instructions.</w:t>
       </w:r>
     </w:p>
     <w:p>
       <w:r>
+        <w:rPr>
+          <w:highlight w:val="green"/>
+        </w:rPr>
         <w:t>====================================================</w:t>
       </w:r>
     </w:p>
     <w:p>
       <w:r>
         <w:pict w14:anchorId="3E8BE153">
-          <v:rect id="_x0000_i1072" style="width:0;height:0" o:hralign="center" o:hrstd="t" o:hr="t" fillcolor="#a0a0a0" stroked="f"/>
+          <v:rect id="_x0000_i1043" style="width:0;height:0" o:hralign="center" o:hrstd="t" o:hr="t" fillcolor="#a0a0a0" stroked="f"/>
         </w:pict>
       </w:r>
     </w:p>
@@ -5815,7 +7714,7 @@
     <w:p>
       <w:r>
         <w:pict w14:anchorId="175006D8">
-          <v:rect id="_x0000_i1073" style="width:0;height:0" o:hralign="center" o:hrstd="t" o:hr="t" fillcolor="#a0a0a0" stroked="f"/>
+          <v:rect id="_x0000_i1044" style="width:0;height:0" o:hralign="center" o:hrstd="t" o:hr="t" fillcolor="#a0a0a0" stroked="f"/>
         </w:pict>
       </w:r>
     </w:p>
@@ -6183,7 +8082,7 @@
     <w:p>
       <w:r>
         <w:pict w14:anchorId="74235033">
-          <v:rect id="_x0000_i1074" style="width:0;height:0" o:hralign="center" o:hrstd="t" o:hr="t" fillcolor="#a0a0a0" stroked="f"/>
+          <v:rect id="_x0000_i1045" style="width:0;height:0" o:hralign="center" o:hrstd="t" o:hr="t" fillcolor="#a0a0a0" stroked="f"/>
         </w:pict>
       </w:r>
     </w:p>
@@ -6548,7 +8447,7 @@
     <w:p>
       <w:r>
         <w:pict w14:anchorId="09C8BC87">
-          <v:rect id="_x0000_i1075" style="width:0;height:0" o:hralign="center" o:hrstd="t" o:hr="t" fillcolor="#a0a0a0" stroked="f"/>
+          <v:rect id="_x0000_i1046" style="width:0;height:0" o:hralign="center" o:hrstd="t" o:hr="t" fillcolor="#a0a0a0" stroked="f"/>
         </w:pict>
       </w:r>
     </w:p>
@@ -6923,7 +8822,7 @@
     <w:p>
       <w:r>
         <w:pict w14:anchorId="74F52E3A">
-          <v:rect id="_x0000_i1076" style="width:0;height:0" o:hralign="center" o:hrstd="t" o:hr="t" fillcolor="#a0a0a0" stroked="f"/>
+          <v:rect id="_x0000_i1047" style="width:0;height:0" o:hralign="center" o:hrstd="t" o:hr="t" fillcolor="#a0a0a0" stroked="f"/>
         </w:pict>
       </w:r>
     </w:p>
@@ -7283,7 +9182,7 @@
     <w:p>
       <w:r>
         <w:pict w14:anchorId="7CFB6732">
-          <v:rect id="_x0000_i1077" style="width:0;height:0" o:hralign="center" o:hrstd="t" o:hr="t" fillcolor="#a0a0a0" stroked="f"/>
+          <v:rect id="_x0000_i1048" style="width:0;height:0" o:hralign="center" o:hrstd="t" o:hr="t" fillcolor="#a0a0a0" stroked="f"/>
         </w:pict>
       </w:r>
     </w:p>
@@ -7313,7 +9212,7 @@
     <w:p>
       <w:r>
         <w:pict w14:anchorId="53B2DA61">
-          <v:rect id="_x0000_i1078" style="width:0;height:0" o:hralign="center" o:hrstd="t" o:hr="t" fillcolor="#a0a0a0" stroked="f"/>
+          <v:rect id="_x0000_i1049" style="width:0;height:0" o:hralign="center" o:hrstd="t" o:hr="t" fillcolor="#a0a0a0" stroked="f"/>
         </w:pict>
       </w:r>
     </w:p>
@@ -7688,7 +9587,7 @@
     <w:p>
       <w:r>
         <w:pict w14:anchorId="0F70A6C3">
-          <v:rect id="_x0000_i1079" style="width:0;height:0" o:hralign="center" o:hrstd="t" o:hr="t" fillcolor="#a0a0a0" stroked="f"/>
+          <v:rect id="_x0000_i1050" style="width:0;height:0" o:hralign="center" o:hrstd="t" o:hr="t" fillcolor="#a0a0a0" stroked="f"/>
         </w:pict>
       </w:r>
     </w:p>
@@ -8073,7 +9972,7 @@
     <w:p>
       <w:r>
         <w:pict w14:anchorId="6FBA536A">
-          <v:rect id="_x0000_i1080" style="width:0;height:0" o:hralign="center" o:hrstd="t" o:hr="t" fillcolor="#a0a0a0" stroked="f"/>
+          <v:rect id="_x0000_i1051" style="width:0;height:0" o:hralign="center" o:hrstd="t" o:hr="t" fillcolor="#a0a0a0" stroked="f"/>
         </w:pict>
       </w:r>
     </w:p>
@@ -8473,7 +10372,7 @@
     <w:p>
       <w:r>
         <w:pict w14:anchorId="5A1EFBC6">
-          <v:rect id="_x0000_i1081" style="width:0;height:0" o:hralign="center" o:hrstd="t" o:hr="t" fillcolor="#a0a0a0" stroked="f"/>
+          <v:rect id="_x0000_i1052" style="width:0;height:0" o:hralign="center" o:hrstd="t" o:hr="t" fillcolor="#a0a0a0" stroked="f"/>
         </w:pict>
       </w:r>
     </w:p>
@@ -8853,7 +10752,7 @@
     <w:p>
       <w:r>
         <w:pict w14:anchorId="71ADB4EA">
-          <v:rect id="_x0000_i1082" style="width:0;height:0" o:hralign="center" o:hrstd="t" o:hr="t" fillcolor="#a0a0a0" stroked="f"/>
+          <v:rect id="_x0000_i1053" style="width:0;height:0" o:hralign="center" o:hrstd="t" o:hr="t" fillcolor="#a0a0a0" stroked="f"/>
         </w:pict>
       </w:r>
     </w:p>
@@ -9231,7 +11130,7 @@
     <w:p>
       <w:r>
         <w:pict w14:anchorId="30027AFB">
-          <v:rect id="_x0000_i1083" style="width:0;height:0" o:hralign="center" o:hrstd="t" o:hr="t" fillcolor="#a0a0a0" stroked="f"/>
+          <v:rect id="_x0000_i1054" style="width:0;height:0" o:hralign="center" o:hrstd="t" o:hr="t" fillcolor="#a0a0a0" stroked="f"/>
         </w:pict>
       </w:r>
     </w:p>
@@ -9612,7 +11511,7 @@
     <w:p>
       <w:r>
         <w:pict w14:anchorId="6A34C054">
-          <v:rect id="_x0000_i1084" style="width:0;height:0" o:hralign="center" o:hrstd="t" o:hr="t" fillcolor="#a0a0a0" stroked="f"/>
+          <v:rect id="_x0000_i1055" style="width:0;height:0" o:hralign="center" o:hrstd="t" o:hr="t" fillcolor="#a0a0a0" stroked="f"/>
         </w:pict>
       </w:r>
     </w:p>
@@ -9642,7 +11541,7 @@
     <w:p>
       <w:r>
         <w:pict w14:anchorId="04C34BDB">
-          <v:rect id="_x0000_i1085" style="width:0;height:0" o:hralign="center" o:hrstd="t" o:hr="t" fillcolor="#a0a0a0" stroked="f"/>
+          <v:rect id="_x0000_i1056" style="width:0;height:0" o:hralign="center" o:hrstd="t" o:hr="t" fillcolor="#a0a0a0" stroked="f"/>
         </w:pict>
       </w:r>
     </w:p>
@@ -10012,7 +11911,7 @@
     <w:p>
       <w:r>
         <w:pict w14:anchorId="5341D544">
-          <v:rect id="_x0000_i1086" style="width:0;height:0" o:hralign="center" o:hrstd="t" o:hr="t" fillcolor="#a0a0a0" stroked="f"/>
+          <v:rect id="_x0000_i1057" style="width:0;height:0" o:hralign="center" o:hrstd="t" o:hr="t" fillcolor="#a0a0a0" stroked="f"/>
         </w:pict>
       </w:r>
     </w:p>
@@ -10375,7 +12274,7 @@
     <w:p>
       <w:r>
         <w:pict w14:anchorId="1F9F8133">
-          <v:rect id="_x0000_i1087" style="width:0;height:0" o:hralign="center" o:hrstd="t" o:hr="t" fillcolor="#a0a0a0" stroked="f"/>
+          <v:rect id="_x0000_i1058" style="width:0;height:0" o:hralign="center" o:hrstd="t" o:hr="t" fillcolor="#a0a0a0" stroked="f"/>
         </w:pict>
       </w:r>
     </w:p>
@@ -10758,7 +12657,7 @@
     <w:p>
       <w:r>
         <w:pict w14:anchorId="452C3FCB">
-          <v:rect id="_x0000_i1088" style="width:0;height:0" o:hralign="center" o:hrstd="t" o:hr="t" fillcolor="#a0a0a0" stroked="f"/>
+          <v:rect id="_x0000_i1059" style="width:0;height:0" o:hralign="center" o:hrstd="t" o:hr="t" fillcolor="#a0a0a0" stroked="f"/>
         </w:pict>
       </w:r>
     </w:p>
@@ -11160,7 +13059,7 @@
     <w:p>
       <w:r>
         <w:pict w14:anchorId="4D982669">
-          <v:rect id="_x0000_i1089" style="width:0;height:0" o:hralign="center" o:hrstd="t" o:hr="t" fillcolor="#a0a0a0" stroked="f"/>
+          <v:rect id="_x0000_i1060" style="width:0;height:0" o:hralign="center" o:hrstd="t" o:hr="t" fillcolor="#a0a0a0" stroked="f"/>
         </w:pict>
       </w:r>
     </w:p>
@@ -11190,7 +13089,7 @@
     <w:p>
       <w:r>
         <w:pict w14:anchorId="610677EA">
-          <v:rect id="_x0000_i1090" style="width:0;height:0" o:hralign="center" o:hrstd="t" o:hr="t" fillcolor="#a0a0a0" stroked="f"/>
+          <v:rect id="_x0000_i1061" style="width:0;height:0" o:hralign="center" o:hrstd="t" o:hr="t" fillcolor="#a0a0a0" stroked="f"/>
         </w:pict>
       </w:r>
     </w:p>
@@ -11560,7 +13459,7 @@
     <w:p>
       <w:r>
         <w:pict w14:anchorId="503329D1">
-          <v:rect id="_x0000_i1091" style="width:0;height:0" o:hralign="center" o:hrstd="t" o:hr="t" fillcolor="#a0a0a0" stroked="f"/>
+          <v:rect id="_x0000_i1062" style="width:0;height:0" o:hralign="center" o:hrstd="t" o:hr="t" fillcolor="#a0a0a0" stroked="f"/>
         </w:pict>
       </w:r>
     </w:p>
@@ -11951,7 +13850,7 @@
     <w:p>
       <w:r>
         <w:pict w14:anchorId="55D820A6">
-          <v:rect id="_x0000_i1092" style="width:0;height:0" o:hralign="center" o:hrstd="t" o:hr="t" fillcolor="#a0a0a0" stroked="f"/>
+          <v:rect id="_x0000_i1063" style="width:0;height:0" o:hralign="center" o:hrstd="t" o:hr="t" fillcolor="#a0a0a0" stroked="f"/>
         </w:pict>
       </w:r>
     </w:p>
@@ -12351,7 +14250,7 @@
     <w:p>
       <w:r>
         <w:pict w14:anchorId="5F696575">
-          <v:rect id="_x0000_i1093" style="width:0;height:0" o:hralign="center" o:hrstd="t" o:hr="t" fillcolor="#a0a0a0" stroked="f"/>
+          <v:rect id="_x0000_i1064" style="width:0;height:0" o:hralign="center" o:hrstd="t" o:hr="t" fillcolor="#a0a0a0" stroked="f"/>
         </w:pict>
       </w:r>
     </w:p>
@@ -12739,7 +14638,7 @@
     <w:p>
       <w:r>
         <w:pict w14:anchorId="69661B95">
-          <v:rect id="_x0000_i1094" style="width:0;height:0" o:hralign="center" o:hrstd="t" o:hr="t" fillcolor="#a0a0a0" stroked="f"/>
+          <v:rect id="_x0000_i1065" style="width:0;height:0" o:hralign="center" o:hrstd="t" o:hr="t" fillcolor="#a0a0a0" stroked="f"/>
         </w:pict>
       </w:r>
     </w:p>
@@ -13147,7 +15046,7 @@
     <w:p>
       <w:r>
         <w:pict w14:anchorId="0D3D1A6B">
-          <v:rect id="_x0000_i1095" style="width:0;height:0" o:hralign="center" o:hrstd="t" o:hr="t" fillcolor="#a0a0a0" stroked="f"/>
+          <v:rect id="_x0000_i1066" style="width:0;height:0" o:hralign="center" o:hrstd="t" o:hr="t" fillcolor="#a0a0a0" stroked="f"/>
         </w:pict>
       </w:r>
     </w:p>
@@ -16775,7 +18674,7 @@
     <w:p>
       <w:r>
         <w:pict w14:anchorId="7C2B34F0">
-          <v:rect id="_x0000_i1096" style="width:0;height:0" o:hralign="center" o:hrstd="t" o:hr="t" fillcolor="#a0a0a0" stroked="f"/>
+          <v:rect id="_x0000_i1067" style="width:0;height:0" o:hralign="center" o:hrstd="t" o:hr="t" fillcolor="#a0a0a0" stroked="f"/>
         </w:pict>
       </w:r>
     </w:p>
@@ -16816,7 +18715,7 @@
     <w:p>
       <w:r>
         <w:pict w14:anchorId="210BE9E7">
-          <v:rect id="_x0000_i1034" style="width:0;height:0" o:hralign="center" o:hrstd="t" o:hrnoshade="t" o:hr="t" fillcolor="#f4f0eb" stroked="f"/>
+          <v:rect id="_x0000_i1068" style="width:0;height:0" o:hralign="center" o:hrstd="t" o:hrnoshade="t" o:hr="t" fillcolor="#f4f0eb" stroked="f"/>
         </w:pict>
       </w:r>
     </w:p>
@@ -17873,6 +19772,7 @@
   <w:style w:type="character" w:default="1" w:styleId="DefaultParagraphFont">
     <w:name w:val="Default Paragraph Font"/>
     <w:uiPriority w:val="1"/>
+    <w:semiHidden/>
     <w:unhideWhenUsed/>
   </w:style>
   <w:style w:type="table" w:default="1" w:styleId="TableNormal">

</xml_diff>

<commit_message>
Newsletter subscription + broadcasting system, CFO diagnostic tool, M&A pipeline, new articles, Arabic translation overhaul, Deloitte links fix, image rename
- Newsletter: subscribe API (name+email modal), draft/campaign tables, cron-based monthly broadcasting
- Shared email transporter (lib/email.ts) via Zoho SMTP (info@visiweal.com)
- CFO Diagnostic Tool: 14 components, PDF report via html2canvas+jspdf
- M&A Methodology Pipeline: 8 updated stages on ma-advisory page
- Two new articles: Feasibility Study MENA, Cross-Border M&A GCC
- Arabic translation overhaul (+1734 lines in ar.json)
- Fixed: renamed image with Unicode ellipsis to underscore
- Fixed: all 4 EY links replaced with Deloitte ME M&A Insight
- vercel.json cron: 0 0 1 * * for monthly newsletter dispatch
</commit_message>
<xml_diff>
--- a/docs/Articles.docx
+++ b/docs/Articles.docx
@@ -11550,361 +11550,865 @@
         <w:rPr>
           <w:b/>
           <w:bCs/>
+          <w:highlight w:val="green"/>
         </w:rPr>
       </w:pPr>
       <w:r>
         <w:rPr>
           <w:b/>
           <w:bCs/>
+          <w:highlight w:val="green"/>
         </w:rPr>
         <w:t>Brief #27</w:t>
       </w:r>
     </w:p>
     <w:p>
-      <w:r>
+      <w:pPr>
+        <w:rPr>
+          <w:highlight w:val="green"/>
+        </w:rPr>
+      </w:pPr>
+      <w:r>
+        <w:rPr>
+          <w:highlight w:val="green"/>
+        </w:rPr>
         <w:t>text</w:t>
       </w:r>
     </w:p>
     <w:p>
-      <w:r>
+      <w:pPr>
+        <w:rPr>
+          <w:highlight w:val="green"/>
+        </w:rPr>
+      </w:pPr>
+      <w:r>
+        <w:rPr>
+          <w:highlight w:val="green"/>
+        </w:rPr>
         <w:t>====================================================</w:t>
       </w:r>
     </w:p>
     <w:p>
+      <w:pPr>
+        <w:rPr>
+          <w:highlight w:val="green"/>
+        </w:rPr>
+      </w:pPr>
       <w:r>
         <w:rPr>
           <w:rFonts w:ascii="Segoe UI Emoji" w:hAnsi="Segoe UI Emoji" w:cs="Segoe UI Emoji"/>
+          <w:highlight w:val="green"/>
         </w:rPr>
         <w:t>📋</w:t>
       </w:r>
       <w:r>
+        <w:rPr>
+          <w:highlight w:val="green"/>
+        </w:rPr>
         <w:t xml:space="preserve"> NEW ARTICLE BRIEF</w:t>
       </w:r>
     </w:p>
     <w:p>
-      <w:r>
+      <w:pPr>
+        <w:rPr>
+          <w:highlight w:val="green"/>
+        </w:rPr>
+      </w:pPr>
+      <w:r>
+        <w:rPr>
+          <w:highlight w:val="green"/>
+        </w:rPr>
         <w:t>====================================================</w:t>
       </w:r>
     </w:p>
-    <w:p/>
-    <w:p>
-      <w:r>
+    <w:p>
+      <w:pPr>
+        <w:rPr>
+          <w:highlight w:val="green"/>
+        </w:rPr>
+      </w:pPr>
+    </w:p>
+    <w:p>
+      <w:pPr>
+        <w:rPr>
+          <w:highlight w:val="green"/>
+        </w:rPr>
+      </w:pPr>
+      <w:r>
+        <w:rPr>
+          <w:highlight w:val="green"/>
+        </w:rPr>
         <w:lastRenderedPageBreak/>
         <w:t xml:space="preserve">Title Idea       </w:t>
       </w:r>
       <w:proofErr w:type="gramStart"/>
       <w:r>
-        <w:t xml:space="preserve">  :</w:t>
-      </w:r>
-      <w:proofErr w:type="gramEnd"/>
-      <w:r>
+        <w:rPr>
+          <w:highlight w:val="green"/>
+        </w:rPr>
+        <w:t xml:space="preserve">  :</w:t>
+      </w:r>
+      <w:proofErr w:type="gramEnd"/>
+      <w:r>
+        <w:rPr>
+          <w:highlight w:val="green"/>
+        </w:rPr>
         <w:t xml:space="preserve"> Why a Feasibility Study Is the</w:t>
       </w:r>
     </w:p>
     <w:p>
-      <w:r>
+      <w:pPr>
+        <w:rPr>
+          <w:highlight w:val="green"/>
+        </w:rPr>
+      </w:pPr>
+      <w:r>
+        <w:rPr>
+          <w:highlight w:val="green"/>
+        </w:rPr>
         <w:t xml:space="preserve">                     Most Important Investment Before</w:t>
       </w:r>
     </w:p>
     <w:p>
-      <w:r>
+      <w:pPr>
+        <w:rPr>
+          <w:highlight w:val="green"/>
+        </w:rPr>
+      </w:pPr>
+      <w:r>
+        <w:rPr>
+          <w:highlight w:val="green"/>
+        </w:rPr>
         <w:t xml:space="preserve">                     Any MENA Market Entry</w:t>
       </w:r>
     </w:p>
-    <w:p/>
-    <w:p>
-      <w:r>
+    <w:p>
+      <w:pPr>
+        <w:rPr>
+          <w:highlight w:val="green"/>
+        </w:rPr>
+      </w:pPr>
+    </w:p>
+    <w:p>
+      <w:pPr>
+        <w:rPr>
+          <w:highlight w:val="green"/>
+        </w:rPr>
+      </w:pPr>
+      <w:r>
+        <w:rPr>
+          <w:highlight w:val="green"/>
+        </w:rPr>
         <w:t xml:space="preserve">Primary Service  </w:t>
       </w:r>
       <w:proofErr w:type="gramStart"/>
       <w:r>
-        <w:t xml:space="preserve">  :</w:t>
-      </w:r>
-      <w:proofErr w:type="gramEnd"/>
-      <w:r>
+        <w:rPr>
+          <w:highlight w:val="green"/>
+        </w:rPr>
+        <w:t xml:space="preserve">  :</w:t>
+      </w:r>
+      <w:proofErr w:type="gramEnd"/>
+      <w:r>
+        <w:rPr>
+          <w:highlight w:val="green"/>
+        </w:rPr>
         <w:t xml:space="preserve"> Feasibility Studies</w:t>
       </w:r>
     </w:p>
-    <w:p/>
-    <w:p>
-      <w:r>
+    <w:p>
+      <w:pPr>
+        <w:rPr>
+          <w:highlight w:val="green"/>
+        </w:rPr>
+      </w:pPr>
+    </w:p>
+    <w:p>
+      <w:pPr>
+        <w:rPr>
+          <w:highlight w:val="green"/>
+        </w:rPr>
+      </w:pPr>
+      <w:r>
+        <w:rPr>
+          <w:highlight w:val="green"/>
+        </w:rPr>
         <w:t xml:space="preserve">Target Audience  </w:t>
       </w:r>
       <w:proofErr w:type="gramStart"/>
       <w:r>
-        <w:t xml:space="preserve">  :</w:t>
-      </w:r>
-      <w:proofErr w:type="gramEnd"/>
-      <w:r>
+        <w:rPr>
+          <w:highlight w:val="green"/>
+        </w:rPr>
+        <w:t xml:space="preserve">  :</w:t>
+      </w:r>
+      <w:proofErr w:type="gramEnd"/>
+      <w:r>
+        <w:rPr>
+          <w:highlight w:val="green"/>
+        </w:rPr>
         <w:t xml:space="preserve"> International investors and</w:t>
       </w:r>
     </w:p>
     <w:p>
-      <w:r>
+      <w:pPr>
+        <w:rPr>
+          <w:highlight w:val="green"/>
+        </w:rPr>
+      </w:pPr>
+      <w:r>
+        <w:rPr>
+          <w:highlight w:val="green"/>
+        </w:rPr>
         <w:t xml:space="preserve">                     regional entrepreneurs planning</w:t>
       </w:r>
     </w:p>
     <w:p>
-      <w:r>
+      <w:pPr>
+        <w:rPr>
+          <w:highlight w:val="green"/>
+        </w:rPr>
+      </w:pPr>
+      <w:r>
+        <w:rPr>
+          <w:highlight w:val="green"/>
+        </w:rPr>
         <w:t xml:space="preserve">                     a new venture or expansion in MENA</w:t>
       </w:r>
     </w:p>
-    <w:p/>
-    <w:p>
-      <w:r>
+    <w:p>
+      <w:pPr>
+        <w:rPr>
+          <w:highlight w:val="green"/>
+        </w:rPr>
+      </w:pPr>
+    </w:p>
+    <w:p>
+      <w:pPr>
+        <w:rPr>
+          <w:highlight w:val="green"/>
+        </w:rPr>
+      </w:pPr>
+      <w:r>
+        <w:rPr>
+          <w:highlight w:val="green"/>
+        </w:rPr>
         <w:t xml:space="preserve">MENA Country </w:t>
       </w:r>
       <w:proofErr w:type="gramStart"/>
       <w:r>
+        <w:rPr>
+          <w:highlight w:val="green"/>
+        </w:rPr>
         <w:t>Focus :</w:t>
       </w:r>
       <w:proofErr w:type="gramEnd"/>
       <w:r>
+        <w:rPr>
+          <w:highlight w:val="green"/>
+        </w:rPr>
         <w:t xml:space="preserve"> Pan-MENA</w:t>
       </w:r>
     </w:p>
-    <w:p/>
-    <w:p>
-      <w:r>
+    <w:p>
+      <w:pPr>
+        <w:rPr>
+          <w:highlight w:val="green"/>
+        </w:rPr>
+      </w:pPr>
+    </w:p>
+    <w:p>
+      <w:pPr>
+        <w:rPr>
+          <w:highlight w:val="green"/>
+        </w:rPr>
+      </w:pPr>
+      <w:r>
+        <w:rPr>
+          <w:highlight w:val="green"/>
+        </w:rPr>
         <w:t xml:space="preserve">Primary Keyword  </w:t>
       </w:r>
       <w:proofErr w:type="gramStart"/>
       <w:r>
-        <w:t xml:space="preserve">  :</w:t>
-      </w:r>
-      <w:proofErr w:type="gramEnd"/>
-      <w:r>
+        <w:rPr>
+          <w:highlight w:val="green"/>
+        </w:rPr>
+        <w:t xml:space="preserve">  :</w:t>
+      </w:r>
+      <w:proofErr w:type="gramEnd"/>
+      <w:r>
+        <w:rPr>
+          <w:highlight w:val="green"/>
+        </w:rPr>
         <w:t xml:space="preserve"> "feasibility study MENA market</w:t>
       </w:r>
     </w:p>
     <w:p>
-      <w:r>
+      <w:pPr>
+        <w:rPr>
+          <w:highlight w:val="green"/>
+        </w:rPr>
+      </w:pPr>
+      <w:r>
+        <w:rPr>
+          <w:highlight w:val="green"/>
+        </w:rPr>
         <w:t xml:space="preserve">                     entry"</w:t>
       </w:r>
     </w:p>
-    <w:p/>
-    <w:p>
-      <w:r>
+    <w:p>
+      <w:pPr>
+        <w:rPr>
+          <w:highlight w:val="green"/>
+        </w:rPr>
+      </w:pPr>
+    </w:p>
+    <w:p>
+      <w:pPr>
+        <w:rPr>
+          <w:highlight w:val="green"/>
+        </w:rPr>
+      </w:pPr>
+      <w:r>
+        <w:rPr>
+          <w:highlight w:val="green"/>
+        </w:rPr>
         <w:t xml:space="preserve">Secondary </w:t>
       </w:r>
       <w:proofErr w:type="gramStart"/>
       <w:r>
+        <w:rPr>
+          <w:highlight w:val="green"/>
+        </w:rPr>
         <w:t>Keywords :</w:t>
       </w:r>
       <w:proofErr w:type="gramEnd"/>
       <w:r>
+        <w:rPr>
+          <w:highlight w:val="green"/>
+        </w:rPr>
         <w:t xml:space="preserve"> market entry strategy Middle East,</w:t>
       </w:r>
     </w:p>
     <w:p>
-      <w:r>
+      <w:pPr>
+        <w:rPr>
+          <w:highlight w:val="green"/>
+        </w:rPr>
+      </w:pPr>
+      <w:r>
+        <w:rPr>
+          <w:highlight w:val="green"/>
+        </w:rPr>
         <w:t xml:space="preserve">                     business feasibility GCC,</w:t>
       </w:r>
     </w:p>
     <w:p>
-      <w:r>
+      <w:pPr>
+        <w:rPr>
+          <w:highlight w:val="green"/>
+        </w:rPr>
+      </w:pPr>
+      <w:r>
+        <w:rPr>
+          <w:highlight w:val="green"/>
+        </w:rPr>
         <w:t xml:space="preserve">                     investment feasibility MENA</w:t>
       </w:r>
     </w:p>
-    <w:p/>
-    <w:p>
-      <w:r>
+    <w:p>
+      <w:pPr>
+        <w:rPr>
+          <w:highlight w:val="green"/>
+        </w:rPr>
+      </w:pPr>
+    </w:p>
+    <w:p>
+      <w:pPr>
+        <w:rPr>
+          <w:highlight w:val="green"/>
+        </w:rPr>
+      </w:pPr>
+      <w:r>
+        <w:rPr>
+          <w:highlight w:val="green"/>
+        </w:rPr>
         <w:t xml:space="preserve">Long-Tail </w:t>
       </w:r>
       <w:proofErr w:type="gramStart"/>
       <w:r>
+        <w:rPr>
+          <w:highlight w:val="green"/>
+        </w:rPr>
         <w:t>Keywords :</w:t>
       </w:r>
       <w:proofErr w:type="gramEnd"/>
       <w:r>
+        <w:rPr>
+          <w:highlight w:val="green"/>
+        </w:rPr>
         <w:t xml:space="preserve"> how to conduct a feasibility study</w:t>
       </w:r>
     </w:p>
     <w:p>
-      <w:r>
+      <w:pPr>
+        <w:rPr>
+          <w:highlight w:val="green"/>
+        </w:rPr>
+      </w:pPr>
+      <w:r>
+        <w:rPr>
+          <w:highlight w:val="green"/>
+        </w:rPr>
         <w:t xml:space="preserve">                     before entering the MENA market,</w:t>
       </w:r>
     </w:p>
     <w:p>
-      <w:r>
+      <w:pPr>
+        <w:rPr>
+          <w:highlight w:val="green"/>
+        </w:rPr>
+      </w:pPr>
+      <w:r>
+        <w:rPr>
+          <w:highlight w:val="green"/>
+        </w:rPr>
         <w:t xml:space="preserve">                     feasibility study benefits for</w:t>
       </w:r>
     </w:p>
     <w:p>
-      <w:r>
+      <w:pPr>
+        <w:rPr>
+          <w:highlight w:val="green"/>
+        </w:rPr>
+      </w:pPr>
+      <w:r>
+        <w:rPr>
+          <w:highlight w:val="green"/>
+        </w:rPr>
         <w:t xml:space="preserve">                     Middle East investment,</w:t>
       </w:r>
     </w:p>
     <w:p>
-      <w:r>
+      <w:pPr>
+        <w:rPr>
+          <w:highlight w:val="green"/>
+        </w:rPr>
+      </w:pPr>
+      <w:r>
+        <w:rPr>
+          <w:highlight w:val="green"/>
+        </w:rPr>
         <w:t xml:space="preserve">                     market entry feasibility analysis</w:t>
       </w:r>
     </w:p>
     <w:p>
-      <w:r>
+      <w:pPr>
+        <w:rPr>
+          <w:highlight w:val="green"/>
+        </w:rPr>
+      </w:pPr>
+      <w:r>
+        <w:rPr>
+          <w:highlight w:val="green"/>
+        </w:rPr>
         <w:t xml:space="preserve">                     UAE Saudi Arabia Egypt</w:t>
       </w:r>
     </w:p>
-    <w:p/>
-    <w:p>
-      <w:r>
+    <w:p>
+      <w:pPr>
+        <w:rPr>
+          <w:highlight w:val="green"/>
+        </w:rPr>
+      </w:pPr>
+    </w:p>
+    <w:p>
+      <w:pPr>
+        <w:rPr>
+          <w:highlight w:val="green"/>
+        </w:rPr>
+      </w:pPr>
+      <w:r>
+        <w:rPr>
+          <w:highlight w:val="green"/>
+        </w:rPr>
         <w:t xml:space="preserve">Article Tone     </w:t>
       </w:r>
       <w:proofErr w:type="gramStart"/>
       <w:r>
-        <w:t xml:space="preserve">  :</w:t>
-      </w:r>
-      <w:proofErr w:type="gramEnd"/>
-      <w:r>
+        <w:rPr>
+          <w:highlight w:val="green"/>
+        </w:rPr>
+        <w:t xml:space="preserve">  :</w:t>
+      </w:r>
+      <w:proofErr w:type="gramEnd"/>
+      <w:r>
+        <w:rPr>
+          <w:highlight w:val="green"/>
+        </w:rPr>
         <w:t xml:space="preserve"> Educational</w:t>
       </w:r>
     </w:p>
-    <w:p/>
-    <w:p>
-      <w:r>
+    <w:p>
+      <w:pPr>
+        <w:rPr>
+          <w:highlight w:val="green"/>
+        </w:rPr>
+      </w:pPr>
+    </w:p>
+    <w:p>
+      <w:pPr>
+        <w:rPr>
+          <w:highlight w:val="green"/>
+        </w:rPr>
+      </w:pPr>
+      <w:r>
+        <w:rPr>
+          <w:highlight w:val="green"/>
+        </w:rPr>
         <w:t xml:space="preserve">Word Count       </w:t>
       </w:r>
       <w:proofErr w:type="gramStart"/>
       <w:r>
-        <w:t xml:space="preserve">  :</w:t>
-      </w:r>
-      <w:proofErr w:type="gramEnd"/>
-      <w:r>
+        <w:rPr>
+          <w:highlight w:val="green"/>
+        </w:rPr>
+        <w:t xml:space="preserve">  :</w:t>
+      </w:r>
+      <w:proofErr w:type="gramEnd"/>
+      <w:r>
+        <w:rPr>
+          <w:highlight w:val="green"/>
+        </w:rPr>
         <w:t xml:space="preserve"> 2,000 words</w:t>
       </w:r>
     </w:p>
-    <w:p/>
-    <w:p>
-      <w:r>
+    <w:p>
+      <w:pPr>
+        <w:rPr>
+          <w:highlight w:val="green"/>
+        </w:rPr>
+      </w:pPr>
+    </w:p>
+    <w:p>
+      <w:pPr>
+        <w:rPr>
+          <w:highlight w:val="green"/>
+        </w:rPr>
+      </w:pPr>
+      <w:r>
+        <w:rPr>
+          <w:highlight w:val="green"/>
+        </w:rPr>
         <w:lastRenderedPageBreak/>
         <w:t xml:space="preserve">Internal Links   </w:t>
       </w:r>
       <w:proofErr w:type="gramStart"/>
       <w:r>
-        <w:t xml:space="preserve">  :</w:t>
-      </w:r>
-      <w:proofErr w:type="gramEnd"/>
-      <w:r>
+        <w:rPr>
+          <w:highlight w:val="green"/>
+        </w:rPr>
+        <w:t xml:space="preserve">  :</w:t>
+      </w:r>
+      <w:proofErr w:type="gramEnd"/>
+      <w:r>
+        <w:rPr>
+          <w:highlight w:val="green"/>
+        </w:rPr>
         <w:t xml:space="preserve"> Feasibility Studies service page,</w:t>
       </w:r>
     </w:p>
     <w:p>
-      <w:r>
+      <w:pPr>
+        <w:rPr>
+          <w:highlight w:val="green"/>
+        </w:rPr>
+      </w:pPr>
+      <w:r>
+        <w:rPr>
+          <w:highlight w:val="green"/>
+        </w:rPr>
         <w:t xml:space="preserve">                     M&amp;A Advisory service page</w:t>
       </w:r>
     </w:p>
-    <w:p/>
-    <w:p>
-      <w:r>
+    <w:p>
+      <w:pPr>
+        <w:rPr>
+          <w:highlight w:val="green"/>
+        </w:rPr>
+      </w:pPr>
+    </w:p>
+    <w:p>
+      <w:pPr>
+        <w:rPr>
+          <w:highlight w:val="green"/>
+        </w:rPr>
+      </w:pPr>
+      <w:r>
+        <w:rPr>
+          <w:highlight w:val="green"/>
+        </w:rPr>
         <w:t xml:space="preserve">CTA Goal         </w:t>
       </w:r>
       <w:proofErr w:type="gramStart"/>
       <w:r>
-        <w:t xml:space="preserve">  :</w:t>
-      </w:r>
-      <w:proofErr w:type="gramEnd"/>
-      <w:r>
+        <w:rPr>
+          <w:highlight w:val="green"/>
+        </w:rPr>
+        <w:t xml:space="preserve">  :</w:t>
+      </w:r>
+      <w:proofErr w:type="gramEnd"/>
+      <w:r>
+        <w:rPr>
+          <w:highlight w:val="green"/>
+        </w:rPr>
         <w:t xml:space="preserve"> Request a market entry feasibility</w:t>
       </w:r>
     </w:p>
     <w:p>
-      <w:r>
+      <w:pPr>
+        <w:rPr>
+          <w:highlight w:val="green"/>
+        </w:rPr>
+      </w:pPr>
+      <w:r>
+        <w:rPr>
+          <w:highlight w:val="green"/>
+        </w:rPr>
         <w:t xml:space="preserve">                     consultation</w:t>
       </w:r>
     </w:p>
-    <w:p/>
-    <w:p>
-      <w:r>
+    <w:p>
+      <w:pPr>
+        <w:rPr>
+          <w:highlight w:val="green"/>
+        </w:rPr>
+      </w:pPr>
+    </w:p>
+    <w:p>
+      <w:pPr>
+        <w:rPr>
+          <w:highlight w:val="green"/>
+        </w:rPr>
+      </w:pPr>
+      <w:r>
+        <w:rPr>
+          <w:highlight w:val="green"/>
+        </w:rPr>
         <w:t xml:space="preserve">Extra Notes      </w:t>
       </w:r>
       <w:proofErr w:type="gramStart"/>
       <w:r>
-        <w:t xml:space="preserve">  :</w:t>
-      </w:r>
-      <w:proofErr w:type="gramEnd"/>
-      <w:r>
+        <w:rPr>
+          <w:highlight w:val="green"/>
+        </w:rPr>
+        <w:t xml:space="preserve">  :</w:t>
+      </w:r>
+      <w:proofErr w:type="gramEnd"/>
+      <w:r>
+        <w:rPr>
+          <w:highlight w:val="green"/>
+        </w:rPr>
         <w:t xml:space="preserve"> Reference the World Bank finding</w:t>
       </w:r>
     </w:p>
     <w:p>
-      <w:r>
+      <w:pPr>
+        <w:rPr>
+          <w:highlight w:val="green"/>
+        </w:rPr>
+      </w:pPr>
+      <w:r>
+        <w:rPr>
+          <w:highlight w:val="green"/>
+        </w:rPr>
         <w:t xml:space="preserve">                     </w:t>
       </w:r>
       <w:proofErr w:type="gramStart"/>
       <w:r>
+        <w:rPr>
+          <w:highlight w:val="green"/>
+        </w:rPr>
         <w:t>that active industrial policies</w:t>
       </w:r>
       <w:proofErr w:type="gramEnd"/>
     </w:p>
     <w:p>
-      <w:r>
+      <w:pPr>
+        <w:rPr>
+          <w:highlight w:val="green"/>
+        </w:rPr>
+      </w:pPr>
+      <w:r>
+        <w:rPr>
+          <w:highlight w:val="green"/>
+        </w:rPr>
         <w:t xml:space="preserve">                     have tripled in MENA over the last</w:t>
       </w:r>
     </w:p>
     <w:p>
-      <w:r>
+      <w:pPr>
+        <w:rPr>
+          <w:highlight w:val="green"/>
+        </w:rPr>
+      </w:pPr>
+      <w:r>
+        <w:rPr>
+          <w:highlight w:val="green"/>
+        </w:rPr>
         <w:t xml:space="preserve">                     decade via SWFs and state-owned</w:t>
       </w:r>
     </w:p>
     <w:p>
-      <w:r>
+      <w:pPr>
+        <w:rPr>
+          <w:highlight w:val="green"/>
+        </w:rPr>
+      </w:pPr>
+      <w:r>
+        <w:rPr>
+          <w:highlight w:val="green"/>
+        </w:rPr>
         <w:t xml:space="preserve">                     enterprises — making proper</w:t>
       </w:r>
     </w:p>
     <w:p>
-      <w:r>
+      <w:pPr>
+        <w:rPr>
+          <w:highlight w:val="green"/>
+        </w:rPr>
+      </w:pPr>
+      <w:r>
+        <w:rPr>
+          <w:highlight w:val="green"/>
+        </w:rPr>
         <w:t xml:space="preserve">                     feasibility work more critical.</w:t>
       </w:r>
     </w:p>
     <w:p>
-      <w:r>
+      <w:pPr>
+        <w:rPr>
+          <w:highlight w:val="green"/>
+        </w:rPr>
+      </w:pPr>
+      <w:r>
+        <w:rPr>
+          <w:highlight w:val="green"/>
+        </w:rPr>
         <w:t xml:space="preserve">                     Highlight common mistakes companies</w:t>
       </w:r>
     </w:p>
     <w:p>
-      <w:r>
+      <w:pPr>
+        <w:rPr>
+          <w:highlight w:val="green"/>
+        </w:rPr>
+      </w:pPr>
+      <w:r>
+        <w:rPr>
+          <w:highlight w:val="green"/>
+        </w:rPr>
         <w:t xml:space="preserve">                     make when skipping feasibility</w:t>
       </w:r>
     </w:p>
     <w:p>
-      <w:r>
+      <w:pPr>
+        <w:rPr>
+          <w:highlight w:val="green"/>
+        </w:rPr>
+      </w:pPr>
+      <w:r>
+        <w:rPr>
+          <w:highlight w:val="green"/>
+        </w:rPr>
         <w:t xml:space="preserve">                     analysis. Cover financial, market,</w:t>
       </w:r>
     </w:p>
     <w:p>
-      <w:r>
+      <w:pPr>
+        <w:rPr>
+          <w:highlight w:val="green"/>
+        </w:rPr>
+      </w:pPr>
+      <w:r>
+        <w:rPr>
+          <w:highlight w:val="green"/>
+        </w:rPr>
         <w:t xml:space="preserve">                     operational, and regulatory</w:t>
       </w:r>
     </w:p>
     <w:p>
-      <w:r>
+      <w:pPr>
+        <w:rPr>
+          <w:highlight w:val="green"/>
+        </w:rPr>
+      </w:pPr>
+      <w:r>
+        <w:rPr>
+          <w:highlight w:val="green"/>
+        </w:rPr>
         <w:t xml:space="preserve">                     feasibility dimensions.</w:t>
       </w:r>
     </w:p>
-    <w:p/>
-    <w:p>
-      <w:r>
+    <w:p>
+      <w:pPr>
+        <w:rPr>
+          <w:highlight w:val="green"/>
+        </w:rPr>
+      </w:pPr>
+    </w:p>
+    <w:p>
+      <w:pPr>
+        <w:rPr>
+          <w:highlight w:val="green"/>
+        </w:rPr>
+      </w:pPr>
+      <w:r>
+        <w:rPr>
+          <w:highlight w:val="green"/>
+        </w:rPr>
         <w:t>====================================================</w:t>
       </w:r>
     </w:p>
     <w:p>
+      <w:pPr>
+        <w:rPr>
+          <w:highlight w:val="green"/>
+        </w:rPr>
+      </w:pPr>
       <w:r>
         <w:rPr>
           <w:rFonts w:ascii="Segoe UI Emoji" w:hAnsi="Segoe UI Emoji" w:cs="Segoe UI Emoji"/>
+          <w:highlight w:val="green"/>
         </w:rPr>
         <w:t>▶</w:t>
       </w:r>
       <w:r>
+        <w:rPr>
+          <w:highlight w:val="green"/>
+        </w:rPr>
         <w:t xml:space="preserve"> Please generate the full article following</w:t>
       </w:r>
     </w:p>
     <w:p>
-      <w:r>
+      <w:pPr>
+        <w:rPr>
+          <w:highlight w:val="green"/>
+        </w:rPr>
+      </w:pPr>
+      <w:r>
+        <w:rPr>
+          <w:highlight w:val="green"/>
+        </w:rPr>
         <w:t xml:space="preserve">  the project instructions.</w:t>
       </w:r>
     </w:p>
     <w:p>
       <w:r>
+        <w:rPr>
+          <w:highlight w:val="green"/>
+        </w:rPr>
         <w:t>====================================================</w:t>
       </w:r>
     </w:p>
@@ -19174,6 +19678,140 @@
         <w:t> as your four foundational "pillar" articles — one per service — then build supporting content around them for SEO clustering.</w:t>
       </w:r>
     </w:p>
+    <w:p>
+      <w:pPr>
+        <w:rPr>
+          <w:i/>
+          <w:iCs/>
+        </w:rPr>
+      </w:pPr>
+    </w:p>
+    <w:p>
+      <w:pPr>
+        <w:rPr>
+          <w:b/>
+          <w:bCs/>
+          <w:i/>
+          <w:iCs/>
+        </w:rPr>
+      </w:pPr>
+      <w:r>
+        <w:rPr>
+          <w:b/>
+          <w:bCs/>
+          <w:i/>
+          <w:iCs/>
+        </w:rPr>
+        <w:t>Additional Topics or Articles:</w:t>
+      </w:r>
+    </w:p>
+    <w:p>
+      <w:pPr>
+        <w:rPr>
+          <w:i/>
+          <w:iCs/>
+        </w:rPr>
+      </w:pPr>
+      <w:r>
+        <w:rPr>
+          <w:i/>
+          <w:iCs/>
+        </w:rPr>
+        <w:t>Fractional CFO vs Full-Time CFO: A Strategic Framework for Growth-Stage Companies</w:t>
+      </w:r>
+    </w:p>
+    <w:p>
+      <w:pPr>
+        <w:rPr>
+          <w:i/>
+          <w:iCs/>
+        </w:rPr>
+      </w:pPr>
+      <w:r>
+        <w:rPr>
+          <w:i/>
+          <w:iCs/>
+        </w:rPr>
+        <w:t>Digital Transformation in MENA Banking: Beyond the hype</w:t>
+      </w:r>
+    </w:p>
+    <w:p>
+      <w:pPr>
+        <w:rPr>
+          <w:i/>
+          <w:iCs/>
+        </w:rPr>
+      </w:pPr>
+      <w:r>
+        <w:rPr>
+          <w:i/>
+          <w:iCs/>
+        </w:rPr>
+        <w:t>Sovereign Wealth Funds: Reshaping Global Capital Flows</w:t>
+      </w:r>
+    </w:p>
+    <w:p>
+      <w:pPr>
+        <w:rPr>
+          <w:i/>
+          <w:iCs/>
+        </w:rPr>
+      </w:pPr>
+      <w:r>
+        <w:rPr>
+          <w:i/>
+          <w:iCs/>
+        </w:rPr>
+        <w:t>saudi-vision-2030-economic-transformation</w:t>
+      </w:r>
+    </w:p>
+    <w:p>
+      <w:pPr>
+        <w:rPr>
+          <w:i/>
+          <w:iCs/>
+        </w:rPr>
+      </w:pPr>
+      <w:r>
+        <w:rPr>
+          <w:i/>
+          <w:iCs/>
+        </w:rPr>
+        <w:t>capital-raising-volatile-markets-guide-</w:t>
+      </w:r>
+      <w:proofErr w:type="spellStart"/>
+      <w:r>
+        <w:rPr>
+          <w:i/>
+          <w:iCs/>
+        </w:rPr>
+        <w:t>cfos</w:t>
+      </w:r>
+      <w:proofErr w:type="spellEnd"/>
+    </w:p>
+    <w:p>
+      <w:pPr>
+        <w:rPr>
+          <w:i/>
+          <w:iCs/>
+        </w:rPr>
+      </w:pPr>
+      <w:r>
+        <w:rPr>
+          <w:i/>
+          <w:iCs/>
+        </w:rPr>
+        <w:t>ai-enterprise-finance-automation-strategic-intelligence</w:t>
+      </w:r>
+    </w:p>
+    <w:p>
+      <w:pPr>
+        <w:rPr>
+          <w:i/>
+          <w:iCs/>
+        </w:rPr>
+      </w:pPr>
+    </w:p>
     <w:sectPr>
       <w:pgSz w:w="12240" w:h="15840"/>
       <w:pgMar w:top="1440" w:right="1440" w:bottom="1440" w:left="1440" w:header="720" w:footer="720" w:gutter="0"/>
@@ -19772,7 +20410,6 @@
   <w:style w:type="character" w:default="1" w:styleId="DefaultParagraphFont">
     <w:name w:val="Default Paragraph Font"/>
     <w:uiPriority w:val="1"/>
-    <w:semiHidden/>
     <w:unhideWhenUsed/>
   </w:style>
   <w:style w:type="table" w:default="1" w:styleId="TableNormal">
@@ -19953,6 +20590,18 @@
     <w:rPr>
       <w:b/>
       <w:bCs/>
+    </w:rPr>
+  </w:style>
+  <w:style w:type="character" w:styleId="FollowedHyperlink">
+    <w:name w:val="FollowedHyperlink"/>
+    <w:basedOn w:val="DefaultParagraphFont"/>
+    <w:uiPriority w:val="99"/>
+    <w:semiHidden/>
+    <w:unhideWhenUsed/>
+    <w:rsid w:val="00997A8D"/>
+    <w:rPr>
+      <w:color w:val="96607D" w:themeColor="followedHyperlink"/>
+      <w:u w:val="single"/>
     </w:rPr>
   </w:style>
 </w:styles>

</xml_diff>

<commit_message>
CFO diagnostic: email template, sender, modal portal, pre-loaded PDF libs
- Changed email sender to info@visiweal.com
- Updated email template with full branded HTML (logo, areas analyzed, CTA)
- Fixed modal positioning via createPortal to document.body
- Pre-loaded html2canvas/jspdf on results screen
- Added loading spinner during PDF generation
</commit_message>
<xml_diff>
--- a/docs/Articles.docx
+++ b/docs/Articles.docx
@@ -4349,355 +4349,856 @@
         <w:rPr>
           <w:b/>
           <w:bCs/>
+          <w:highlight w:val="green"/>
         </w:rPr>
       </w:pPr>
       <w:r>
         <w:rPr>
           <w:b/>
           <w:bCs/>
+          <w:highlight w:val="green"/>
         </w:rPr>
         <w:t>Brief #9</w:t>
       </w:r>
     </w:p>
     <w:p>
-      <w:r>
+      <w:pPr>
+        <w:rPr>
+          <w:highlight w:val="green"/>
+        </w:rPr>
+      </w:pPr>
+      <w:r>
+        <w:rPr>
+          <w:highlight w:val="green"/>
+        </w:rPr>
         <w:t>text</w:t>
       </w:r>
     </w:p>
     <w:p>
-      <w:r>
+      <w:pPr>
+        <w:rPr>
+          <w:highlight w:val="green"/>
+        </w:rPr>
+      </w:pPr>
+      <w:r>
+        <w:rPr>
+          <w:highlight w:val="green"/>
+        </w:rPr>
         <w:t>====================================================</w:t>
       </w:r>
     </w:p>
     <w:p>
+      <w:pPr>
+        <w:rPr>
+          <w:highlight w:val="green"/>
+        </w:rPr>
+      </w:pPr>
       <w:r>
         <w:rPr>
           <w:rFonts w:ascii="Segoe UI Emoji" w:hAnsi="Segoe UI Emoji" w:cs="Segoe UI Emoji"/>
+          <w:highlight w:val="green"/>
         </w:rPr>
         <w:t>📋</w:t>
       </w:r>
       <w:r>
+        <w:rPr>
+          <w:highlight w:val="green"/>
+        </w:rPr>
         <w:t xml:space="preserve"> NEW ARTICLE BRIEF</w:t>
       </w:r>
     </w:p>
     <w:p>
-      <w:r>
+      <w:pPr>
+        <w:rPr>
+          <w:highlight w:val="green"/>
+        </w:rPr>
+      </w:pPr>
+      <w:r>
+        <w:rPr>
+          <w:highlight w:val="green"/>
+        </w:rPr>
         <w:t>====================================================</w:t>
       </w:r>
     </w:p>
-    <w:p/>
-    <w:p>
-      <w:r>
+    <w:p>
+      <w:pPr>
+        <w:rPr>
+          <w:highlight w:val="green"/>
+        </w:rPr>
+      </w:pPr>
+    </w:p>
+    <w:p>
+      <w:pPr>
+        <w:rPr>
+          <w:highlight w:val="green"/>
+        </w:rPr>
+      </w:pPr>
+      <w:r>
+        <w:rPr>
+          <w:highlight w:val="green"/>
+        </w:rPr>
         <w:t xml:space="preserve">Title Idea       </w:t>
       </w:r>
       <w:proofErr w:type="gramStart"/>
       <w:r>
-        <w:t xml:space="preserve">  :</w:t>
-      </w:r>
-      <w:proofErr w:type="gramEnd"/>
-      <w:r>
+        <w:rPr>
+          <w:highlight w:val="green"/>
+        </w:rPr>
+        <w:t xml:space="preserve">  :</w:t>
+      </w:r>
+      <w:proofErr w:type="gramEnd"/>
+      <w:r>
+        <w:rPr>
+          <w:highlight w:val="green"/>
+        </w:rPr>
         <w:t xml:space="preserve"> The CFO's Role in Leading Digital</w:t>
       </w:r>
     </w:p>
     <w:p>
-      <w:r>
+      <w:pPr>
+        <w:rPr>
+          <w:highlight w:val="green"/>
+        </w:rPr>
+      </w:pPr>
+      <w:r>
+        <w:rPr>
+          <w:highlight w:val="green"/>
+        </w:rPr>
         <w:t xml:space="preserve">                     Transformation in Saudi Arabia's</w:t>
       </w:r>
     </w:p>
     <w:p>
-      <w:r>
+      <w:pPr>
+        <w:rPr>
+          <w:highlight w:val="green"/>
+        </w:rPr>
+      </w:pPr>
+      <w:r>
+        <w:rPr>
+          <w:highlight w:val="green"/>
+        </w:rPr>
         <w:t xml:space="preserve">                     Private Sector</w:t>
       </w:r>
     </w:p>
-    <w:p/>
-    <w:p>
-      <w:r>
+    <w:p>
+      <w:pPr>
+        <w:rPr>
+          <w:highlight w:val="green"/>
+        </w:rPr>
+      </w:pPr>
+    </w:p>
+    <w:p>
+      <w:pPr>
+        <w:rPr>
+          <w:highlight w:val="green"/>
+        </w:rPr>
+      </w:pPr>
+      <w:r>
+        <w:rPr>
+          <w:highlight w:val="green"/>
+        </w:rPr>
         <w:t xml:space="preserve">Primary Service  </w:t>
       </w:r>
       <w:proofErr w:type="gramStart"/>
       <w:r>
-        <w:t xml:space="preserve">  :</w:t>
-      </w:r>
-      <w:proofErr w:type="gramEnd"/>
-      <w:r>
+        <w:rPr>
+          <w:highlight w:val="green"/>
+        </w:rPr>
+        <w:t xml:space="preserve">  :</w:t>
+      </w:r>
+      <w:proofErr w:type="gramEnd"/>
+      <w:r>
+        <w:rPr>
+          <w:highlight w:val="green"/>
+        </w:rPr>
         <w:t xml:space="preserve"> Digital Transformation</w:t>
       </w:r>
     </w:p>
-    <w:p/>
-    <w:p>
-      <w:r>
+    <w:p>
+      <w:pPr>
+        <w:rPr>
+          <w:highlight w:val="green"/>
+        </w:rPr>
+      </w:pPr>
+    </w:p>
+    <w:p>
+      <w:pPr>
+        <w:rPr>
+          <w:highlight w:val="green"/>
+        </w:rPr>
+      </w:pPr>
+      <w:r>
+        <w:rPr>
+          <w:highlight w:val="green"/>
+        </w:rPr>
         <w:t xml:space="preserve">Target Audience  </w:t>
       </w:r>
       <w:proofErr w:type="gramStart"/>
       <w:r>
-        <w:t xml:space="preserve">  :</w:t>
-      </w:r>
-      <w:proofErr w:type="gramEnd"/>
-      <w:r>
+        <w:rPr>
+          <w:highlight w:val="green"/>
+        </w:rPr>
+        <w:t xml:space="preserve">  :</w:t>
+      </w:r>
+      <w:proofErr w:type="gramEnd"/>
+      <w:r>
+        <w:rPr>
+          <w:highlight w:val="green"/>
+        </w:rPr>
         <w:t xml:space="preserve"> CFOs and finance directors at</w:t>
       </w:r>
     </w:p>
     <w:p>
-      <w:r>
+      <w:pPr>
+        <w:rPr>
+          <w:highlight w:val="green"/>
+        </w:rPr>
+      </w:pPr>
+      <w:r>
+        <w:rPr>
+          <w:highlight w:val="green"/>
+        </w:rPr>
         <w:t xml:space="preserve">                     mid-to-large Saudi private sector</w:t>
       </w:r>
     </w:p>
     <w:p>
-      <w:r>
+      <w:pPr>
+        <w:rPr>
+          <w:highlight w:val="green"/>
+        </w:rPr>
+      </w:pPr>
+      <w:r>
+        <w:rPr>
+          <w:highlight w:val="green"/>
+        </w:rPr>
         <w:t xml:space="preserve">                     companies</w:t>
       </w:r>
     </w:p>
-    <w:p/>
-    <w:p>
-      <w:r>
+    <w:p>
+      <w:pPr>
+        <w:rPr>
+          <w:highlight w:val="green"/>
+        </w:rPr>
+      </w:pPr>
+    </w:p>
+    <w:p>
+      <w:pPr>
+        <w:rPr>
+          <w:highlight w:val="green"/>
+        </w:rPr>
+      </w:pPr>
+      <w:r>
+        <w:rPr>
+          <w:highlight w:val="green"/>
+        </w:rPr>
         <w:t xml:space="preserve">MENA Country </w:t>
       </w:r>
       <w:proofErr w:type="gramStart"/>
       <w:r>
+        <w:rPr>
+          <w:highlight w:val="green"/>
+        </w:rPr>
         <w:t>Focus :</w:t>
       </w:r>
       <w:proofErr w:type="gramEnd"/>
       <w:r>
+        <w:rPr>
+          <w:highlight w:val="green"/>
+        </w:rPr>
         <w:t xml:space="preserve"> Saudi Arabia</w:t>
       </w:r>
     </w:p>
-    <w:p/>
-    <w:p>
-      <w:r>
+    <w:p>
+      <w:pPr>
+        <w:rPr>
+          <w:highlight w:val="green"/>
+        </w:rPr>
+      </w:pPr>
+    </w:p>
+    <w:p>
+      <w:pPr>
+        <w:rPr>
+          <w:highlight w:val="green"/>
+        </w:rPr>
+      </w:pPr>
+      <w:r>
+        <w:rPr>
+          <w:highlight w:val="green"/>
+        </w:rPr>
         <w:t xml:space="preserve">Primary Keyword  </w:t>
       </w:r>
       <w:proofErr w:type="gramStart"/>
       <w:r>
-        <w:t xml:space="preserve">  :</w:t>
-      </w:r>
-      <w:proofErr w:type="gramEnd"/>
-      <w:r>
+        <w:rPr>
+          <w:highlight w:val="green"/>
+        </w:rPr>
+        <w:t xml:space="preserve">  :</w:t>
+      </w:r>
+      <w:proofErr w:type="gramEnd"/>
+      <w:r>
+        <w:rPr>
+          <w:highlight w:val="green"/>
+        </w:rPr>
         <w:t xml:space="preserve"> "CFO digital transformation</w:t>
       </w:r>
     </w:p>
     <w:p>
-      <w:r>
+      <w:pPr>
+        <w:rPr>
+          <w:highlight w:val="green"/>
+        </w:rPr>
+      </w:pPr>
+      <w:r>
+        <w:rPr>
+          <w:highlight w:val="green"/>
+        </w:rPr>
         <w:t xml:space="preserve">                     Saudi Arabia"</w:t>
       </w:r>
     </w:p>
-    <w:p/>
-    <w:p>
-      <w:r>
+    <w:p>
+      <w:pPr>
+        <w:rPr>
+          <w:highlight w:val="green"/>
+        </w:rPr>
+      </w:pPr>
+    </w:p>
+    <w:p>
+      <w:pPr>
+        <w:rPr>
+          <w:highlight w:val="green"/>
+        </w:rPr>
+      </w:pPr>
+      <w:r>
+        <w:rPr>
+          <w:highlight w:val="green"/>
+        </w:rPr>
         <w:t xml:space="preserve">Secondary </w:t>
       </w:r>
       <w:proofErr w:type="gramStart"/>
       <w:r>
+        <w:rPr>
+          <w:highlight w:val="green"/>
+        </w:rPr>
         <w:t>Keywords :</w:t>
       </w:r>
       <w:proofErr w:type="gramEnd"/>
       <w:r>
+        <w:rPr>
+          <w:highlight w:val="green"/>
+        </w:rPr>
         <w:t xml:space="preserve"> finance function digitalization KSA,</w:t>
       </w:r>
     </w:p>
     <w:p>
-      <w:r>
+      <w:pPr>
+        <w:rPr>
+          <w:highlight w:val="green"/>
+        </w:rPr>
+      </w:pPr>
+      <w:r>
+        <w:rPr>
+          <w:highlight w:val="green"/>
+        </w:rPr>
         <w:t xml:space="preserve">                     CFO technology leadership Vision</w:t>
       </w:r>
     </w:p>
     <w:p>
-      <w:r>
+      <w:pPr>
+        <w:rPr>
+          <w:highlight w:val="green"/>
+        </w:rPr>
+      </w:pPr>
+      <w:r>
+        <w:rPr>
+          <w:highlight w:val="green"/>
+        </w:rPr>
         <w:t xml:space="preserve">                     2030,</w:t>
       </w:r>
     </w:p>
     <w:p>
-      <w:r>
+      <w:pPr>
+        <w:rPr>
+          <w:highlight w:val="green"/>
+        </w:rPr>
+      </w:pPr>
+      <w:r>
+        <w:rPr>
+          <w:highlight w:val="green"/>
+        </w:rPr>
         <w:t xml:space="preserve">                     digital finance Saudi Arabia</w:t>
       </w:r>
     </w:p>
-    <w:p/>
-    <w:p>
-      <w:r>
+    <w:p>
+      <w:pPr>
+        <w:rPr>
+          <w:highlight w:val="green"/>
+        </w:rPr>
+      </w:pPr>
+    </w:p>
+    <w:p>
+      <w:pPr>
+        <w:rPr>
+          <w:highlight w:val="green"/>
+        </w:rPr>
+      </w:pPr>
+      <w:r>
+        <w:rPr>
+          <w:highlight w:val="green"/>
+        </w:rPr>
         <w:t xml:space="preserve">Long-Tail </w:t>
       </w:r>
       <w:proofErr w:type="gramStart"/>
       <w:r>
+        <w:rPr>
+          <w:highlight w:val="green"/>
+        </w:rPr>
         <w:t>Keywords :</w:t>
       </w:r>
       <w:proofErr w:type="gramEnd"/>
       <w:r>
+        <w:rPr>
+          <w:highlight w:val="green"/>
+        </w:rPr>
         <w:t xml:space="preserve"> how CFOs drive digital change in</w:t>
       </w:r>
     </w:p>
     <w:p>
-      <w:r>
+      <w:pPr>
+        <w:rPr>
+          <w:highlight w:val="green"/>
+        </w:rPr>
+      </w:pPr>
+      <w:r>
+        <w:rPr>
+          <w:highlight w:val="green"/>
+        </w:rPr>
         <w:t xml:space="preserve">                     Saudi Arabia's private sector,</w:t>
       </w:r>
     </w:p>
     <w:p>
-      <w:r>
+      <w:pPr>
+        <w:rPr>
+          <w:highlight w:val="green"/>
+        </w:rPr>
+      </w:pPr>
+      <w:r>
+        <w:rPr>
+          <w:highlight w:val="green"/>
+        </w:rPr>
         <w:t xml:space="preserve">                     role of finance in digital</w:t>
       </w:r>
     </w:p>
     <w:p>
-      <w:r>
+      <w:pPr>
+        <w:rPr>
+          <w:highlight w:val="green"/>
+        </w:rPr>
+      </w:pPr>
+      <w:r>
+        <w:rPr>
+          <w:highlight w:val="green"/>
+        </w:rPr>
         <w:lastRenderedPageBreak/>
         <w:t xml:space="preserve">                     transformation KSA,</w:t>
       </w:r>
     </w:p>
     <w:p>
-      <w:r>
+      <w:pPr>
+        <w:rPr>
+          <w:highlight w:val="green"/>
+        </w:rPr>
+      </w:pPr>
+      <w:r>
+        <w:rPr>
+          <w:highlight w:val="green"/>
+        </w:rPr>
         <w:t xml:space="preserve">                     CFO technology strategy Vision</w:t>
       </w:r>
     </w:p>
     <w:p>
-      <w:r>
+      <w:pPr>
+        <w:rPr>
+          <w:highlight w:val="green"/>
+        </w:rPr>
+      </w:pPr>
+      <w:r>
+        <w:rPr>
+          <w:highlight w:val="green"/>
+        </w:rPr>
         <w:t xml:space="preserve">                     2030 companies</w:t>
       </w:r>
     </w:p>
-    <w:p/>
-    <w:p>
-      <w:r>
+    <w:p>
+      <w:pPr>
+        <w:rPr>
+          <w:highlight w:val="green"/>
+        </w:rPr>
+      </w:pPr>
+    </w:p>
+    <w:p>
+      <w:pPr>
+        <w:rPr>
+          <w:highlight w:val="green"/>
+        </w:rPr>
+      </w:pPr>
+      <w:r>
+        <w:rPr>
+          <w:highlight w:val="green"/>
+        </w:rPr>
         <w:t xml:space="preserve">Article Tone     </w:t>
       </w:r>
       <w:proofErr w:type="gramStart"/>
       <w:r>
-        <w:t xml:space="preserve">  :</w:t>
-      </w:r>
-      <w:proofErr w:type="gramEnd"/>
-      <w:r>
+        <w:rPr>
+          <w:highlight w:val="green"/>
+        </w:rPr>
+        <w:t xml:space="preserve">  :</w:t>
+      </w:r>
+      <w:proofErr w:type="gramEnd"/>
+      <w:r>
+        <w:rPr>
+          <w:highlight w:val="green"/>
+        </w:rPr>
         <w:t xml:space="preserve"> Thought Leadership / Educational</w:t>
       </w:r>
     </w:p>
-    <w:p/>
-    <w:p>
-      <w:r>
+    <w:p>
+      <w:pPr>
+        <w:rPr>
+          <w:highlight w:val="green"/>
+        </w:rPr>
+      </w:pPr>
+    </w:p>
+    <w:p>
+      <w:pPr>
+        <w:rPr>
+          <w:highlight w:val="green"/>
+        </w:rPr>
+      </w:pPr>
+      <w:r>
+        <w:rPr>
+          <w:highlight w:val="green"/>
+        </w:rPr>
         <w:t xml:space="preserve">Word Count       </w:t>
       </w:r>
       <w:proofErr w:type="gramStart"/>
       <w:r>
-        <w:t xml:space="preserve">  :</w:t>
-      </w:r>
-      <w:proofErr w:type="gramEnd"/>
-      <w:r>
+        <w:rPr>
+          <w:highlight w:val="green"/>
+        </w:rPr>
+        <w:t xml:space="preserve">  :</w:t>
+      </w:r>
+      <w:proofErr w:type="gramEnd"/>
+      <w:r>
+        <w:rPr>
+          <w:highlight w:val="green"/>
+        </w:rPr>
         <w:t xml:space="preserve"> 1,800 words</w:t>
       </w:r>
     </w:p>
-    <w:p/>
-    <w:p>
-      <w:r>
+    <w:p>
+      <w:pPr>
+        <w:rPr>
+          <w:highlight w:val="green"/>
+        </w:rPr>
+      </w:pPr>
+    </w:p>
+    <w:p>
+      <w:pPr>
+        <w:rPr>
+          <w:highlight w:val="green"/>
+        </w:rPr>
+      </w:pPr>
+      <w:r>
+        <w:rPr>
+          <w:highlight w:val="green"/>
+        </w:rPr>
         <w:t xml:space="preserve">Internal Links   </w:t>
       </w:r>
       <w:proofErr w:type="gramStart"/>
       <w:r>
-        <w:t xml:space="preserve">  :</w:t>
-      </w:r>
-      <w:proofErr w:type="gramEnd"/>
-      <w:r>
+        <w:rPr>
+          <w:highlight w:val="green"/>
+        </w:rPr>
+        <w:t xml:space="preserve">  :</w:t>
+      </w:r>
+      <w:proofErr w:type="gramEnd"/>
+      <w:r>
+        <w:rPr>
+          <w:highlight w:val="green"/>
+        </w:rPr>
         <w:t xml:space="preserve"> Digital Transformation service page,</w:t>
       </w:r>
     </w:p>
     <w:p>
-      <w:r>
+      <w:pPr>
+        <w:rPr>
+          <w:highlight w:val="green"/>
+        </w:rPr>
+      </w:pPr>
+      <w:r>
+        <w:rPr>
+          <w:highlight w:val="green"/>
+        </w:rPr>
         <w:t xml:space="preserve">                     Fractional CFO service page</w:t>
       </w:r>
     </w:p>
-    <w:p/>
-    <w:p>
-      <w:r>
+    <w:p>
+      <w:pPr>
+        <w:rPr>
+          <w:highlight w:val="green"/>
+        </w:rPr>
+      </w:pPr>
+    </w:p>
+    <w:p>
+      <w:pPr>
+        <w:rPr>
+          <w:highlight w:val="green"/>
+        </w:rPr>
+      </w:pPr>
+      <w:r>
+        <w:rPr>
+          <w:highlight w:val="green"/>
+        </w:rPr>
         <w:t xml:space="preserve">CTA Goal         </w:t>
       </w:r>
       <w:proofErr w:type="gramStart"/>
       <w:r>
-        <w:t xml:space="preserve">  :</w:t>
-      </w:r>
-      <w:proofErr w:type="gramEnd"/>
-      <w:r>
+        <w:rPr>
+          <w:highlight w:val="green"/>
+        </w:rPr>
+        <w:t xml:space="preserve">  :</w:t>
+      </w:r>
+      <w:proofErr w:type="gramEnd"/>
+      <w:r>
+        <w:rPr>
+          <w:highlight w:val="green"/>
+        </w:rPr>
         <w:t xml:space="preserve"> Contact us to assess your finance</w:t>
       </w:r>
     </w:p>
     <w:p>
-      <w:r>
+      <w:pPr>
+        <w:rPr>
+          <w:highlight w:val="green"/>
+        </w:rPr>
+      </w:pPr>
+      <w:r>
+        <w:rPr>
+          <w:highlight w:val="green"/>
+        </w:rPr>
         <w:t xml:space="preserve">                     function's digital readiness</w:t>
       </w:r>
     </w:p>
-    <w:p/>
-    <w:p>
-      <w:r>
+    <w:p>
+      <w:pPr>
+        <w:rPr>
+          <w:highlight w:val="green"/>
+        </w:rPr>
+      </w:pPr>
+    </w:p>
+    <w:p>
+      <w:pPr>
+        <w:rPr>
+          <w:highlight w:val="green"/>
+        </w:rPr>
+      </w:pPr>
+      <w:r>
+        <w:rPr>
+          <w:highlight w:val="green"/>
+        </w:rPr>
         <w:t xml:space="preserve">Extra Notes      </w:t>
       </w:r>
       <w:proofErr w:type="gramStart"/>
       <w:r>
-        <w:t xml:space="preserve">  :</w:t>
-      </w:r>
-      <w:proofErr w:type="gramEnd"/>
-      <w:r>
+        <w:rPr>
+          <w:highlight w:val="green"/>
+        </w:rPr>
+        <w:t xml:space="preserve">  :</w:t>
+      </w:r>
+      <w:proofErr w:type="gramEnd"/>
+      <w:r>
+        <w:rPr>
+          <w:highlight w:val="green"/>
+        </w:rPr>
         <w:t xml:space="preserve"> Tie to Vision 2030's push for</w:t>
       </w:r>
     </w:p>
     <w:p>
-      <w:r>
+      <w:pPr>
+        <w:rPr>
+          <w:highlight w:val="green"/>
+        </w:rPr>
+      </w:pPr>
+      <w:r>
+        <w:rPr>
+          <w:highlight w:val="green"/>
+        </w:rPr>
         <w:t xml:space="preserve">                     private sector growth to 65% of</w:t>
       </w:r>
     </w:p>
     <w:p>
-      <w:r>
+      <w:pPr>
+        <w:rPr>
+          <w:highlight w:val="green"/>
+        </w:rPr>
+      </w:pPr>
+      <w:r>
+        <w:rPr>
+          <w:highlight w:val="green"/>
+        </w:rPr>
         <w:t xml:space="preserve">                     GDP. Reference that AI is expected</w:t>
       </w:r>
     </w:p>
     <w:p>
-      <w:r>
+      <w:pPr>
+        <w:rPr>
+          <w:highlight w:val="green"/>
+        </w:rPr>
+      </w:pPr>
+      <w:r>
+        <w:rPr>
+          <w:highlight w:val="green"/>
+        </w:rPr>
         <w:t xml:space="preserve">                     to account for 12.4% of Saudi</w:t>
       </w:r>
     </w:p>
     <w:p>
-      <w:r>
+      <w:pPr>
+        <w:rPr>
+          <w:highlight w:val="green"/>
+        </w:rPr>
+      </w:pPr>
+      <w:r>
+        <w:rPr>
+          <w:highlight w:val="green"/>
+        </w:rPr>
         <w:t xml:space="preserve">                     Arabia's GDP by 2030. Emphasize</w:t>
       </w:r>
     </w:p>
     <w:p>
-      <w:r>
+      <w:pPr>
+        <w:rPr>
+          <w:highlight w:val="green"/>
+        </w:rPr>
+      </w:pPr>
+      <w:r>
+        <w:rPr>
+          <w:highlight w:val="green"/>
+        </w:rPr>
         <w:t xml:space="preserve">                     the CFO's evolving role from</w:t>
       </w:r>
     </w:p>
     <w:p>
-      <w:r>
+      <w:pPr>
+        <w:rPr>
+          <w:highlight w:val="green"/>
+        </w:rPr>
+      </w:pPr>
+      <w:r>
+        <w:rPr>
+          <w:highlight w:val="green"/>
+        </w:rPr>
         <w:t xml:space="preserve">                     financial gatekeeper to digital</w:t>
       </w:r>
     </w:p>
     <w:p>
-      <w:r>
+      <w:pPr>
+        <w:rPr>
+          <w:highlight w:val="green"/>
+        </w:rPr>
+      </w:pPr>
+      <w:r>
+        <w:rPr>
+          <w:highlight w:val="green"/>
+        </w:rPr>
         <w:t xml:space="preserve">                     transformation champion. Include</w:t>
       </w:r>
     </w:p>
     <w:p>
-      <w:r>
+      <w:pPr>
+        <w:rPr>
+          <w:highlight w:val="green"/>
+        </w:rPr>
+      </w:pPr>
+      <w:r>
+        <w:rPr>
+          <w:highlight w:val="green"/>
+        </w:rPr>
         <w:t xml:space="preserve">                     ERP, automation, and data analytics</w:t>
       </w:r>
     </w:p>
     <w:p>
-      <w:r>
+      <w:pPr>
+        <w:rPr>
+          <w:highlight w:val="green"/>
+        </w:rPr>
+      </w:pPr>
+      <w:r>
+        <w:rPr>
+          <w:highlight w:val="green"/>
+        </w:rPr>
         <w:t xml:space="preserve">                     adoption angles.</w:t>
       </w:r>
     </w:p>
-    <w:p/>
-    <w:p>
-      <w:r>
+    <w:p>
+      <w:pPr>
+        <w:rPr>
+          <w:highlight w:val="green"/>
+        </w:rPr>
+      </w:pPr>
+    </w:p>
+    <w:p>
+      <w:pPr>
+        <w:rPr>
+          <w:highlight w:val="green"/>
+        </w:rPr>
+      </w:pPr>
+      <w:r>
+        <w:rPr>
+          <w:highlight w:val="green"/>
+        </w:rPr>
         <w:t>====================================================</w:t>
       </w:r>
     </w:p>
     <w:p>
+      <w:pPr>
+        <w:rPr>
+          <w:highlight w:val="green"/>
+        </w:rPr>
+      </w:pPr>
       <w:r>
         <w:rPr>
           <w:rFonts w:ascii="Segoe UI Emoji" w:hAnsi="Segoe UI Emoji" w:cs="Segoe UI Emoji"/>
+          <w:highlight w:val="green"/>
         </w:rPr>
         <w:t>▶</w:t>
       </w:r>
       <w:r>
+        <w:rPr>
+          <w:highlight w:val="green"/>
+        </w:rPr>
         <w:t xml:space="preserve"> Please generate the full article following</w:t>
       </w:r>
     </w:p>
     <w:p>
-      <w:r>
+      <w:pPr>
+        <w:rPr>
+          <w:highlight w:val="green"/>
+        </w:rPr>
+      </w:pPr>
+      <w:r>
+        <w:rPr>
+          <w:highlight w:val="green"/>
+        </w:rPr>
         <w:t xml:space="preserve">  the project instructions.</w:t>
       </w:r>
     </w:p>
     <w:p>
       <w:r>
+        <w:rPr>
+          <w:highlight w:val="green"/>
+        </w:rPr>
         <w:t>====================================================</w:t>
       </w:r>
     </w:p>
@@ -7405,309 +7906,752 @@
       </w:r>
     </w:p>
     <w:p>
-      <w:r>
+      <w:pPr>
+        <w:rPr>
+          <w:highlight w:val="green"/>
+        </w:rPr>
+      </w:pPr>
+      <w:r>
+        <w:rPr>
+          <w:highlight w:val="green"/>
+        </w:rPr>
         <w:t>====================================================</w:t>
       </w:r>
     </w:p>
     <w:p>
+      <w:pPr>
+        <w:rPr>
+          <w:highlight w:val="green"/>
+        </w:rPr>
+      </w:pPr>
       <w:r>
         <w:rPr>
           <w:rFonts w:ascii="Segoe UI Emoji" w:hAnsi="Segoe UI Emoji" w:cs="Segoe UI Emoji"/>
+          <w:highlight w:val="green"/>
         </w:rPr>
         <w:t>📋</w:t>
       </w:r>
       <w:r>
+        <w:rPr>
+          <w:highlight w:val="green"/>
+        </w:rPr>
         <w:t xml:space="preserve"> NEW ARTICLE BRIEF</w:t>
       </w:r>
     </w:p>
     <w:p>
-      <w:r>
+      <w:pPr>
+        <w:rPr>
+          <w:highlight w:val="green"/>
+        </w:rPr>
+      </w:pPr>
+      <w:r>
+        <w:rPr>
+          <w:highlight w:val="green"/>
+        </w:rPr>
         <w:t>====================================================</w:t>
       </w:r>
     </w:p>
-    <w:p/>
-    <w:p>
-      <w:r>
+    <w:p>
+      <w:pPr>
+        <w:rPr>
+          <w:highlight w:val="green"/>
+        </w:rPr>
+      </w:pPr>
+    </w:p>
+    <w:p>
+      <w:pPr>
+        <w:rPr>
+          <w:highlight w:val="green"/>
+        </w:rPr>
+      </w:pPr>
+      <w:r>
+        <w:rPr>
+          <w:highlight w:val="green"/>
+        </w:rPr>
         <w:t xml:space="preserve">Title Idea       </w:t>
       </w:r>
       <w:proofErr w:type="gramStart"/>
       <w:r>
-        <w:t xml:space="preserve">  :</w:t>
-      </w:r>
-      <w:proofErr w:type="gramEnd"/>
-      <w:r>
+        <w:rPr>
+          <w:highlight w:val="green"/>
+        </w:rPr>
+        <w:t xml:space="preserve">  :</w:t>
+      </w:r>
+      <w:proofErr w:type="gramEnd"/>
+      <w:r>
+        <w:rPr>
+          <w:highlight w:val="green"/>
+        </w:rPr>
         <w:t xml:space="preserve"> 5 Signs Your MENA Business Needs</w:t>
       </w:r>
     </w:p>
     <w:p>
-      <w:r>
+      <w:pPr>
+        <w:rPr>
+          <w:highlight w:val="green"/>
+        </w:rPr>
+      </w:pPr>
+      <w:r>
+        <w:rPr>
+          <w:highlight w:val="green"/>
+        </w:rPr>
         <w:t xml:space="preserve">                     a Fractional CFO Right Now</w:t>
       </w:r>
     </w:p>
-    <w:p/>
-    <w:p>
-      <w:r>
+    <w:p>
+      <w:pPr>
+        <w:rPr>
+          <w:highlight w:val="green"/>
+        </w:rPr>
+      </w:pPr>
+    </w:p>
+    <w:p>
+      <w:pPr>
+        <w:rPr>
+          <w:highlight w:val="green"/>
+        </w:rPr>
+      </w:pPr>
+      <w:r>
+        <w:rPr>
+          <w:highlight w:val="green"/>
+        </w:rPr>
         <w:t xml:space="preserve">Primary Service  </w:t>
       </w:r>
       <w:proofErr w:type="gramStart"/>
       <w:r>
-        <w:t xml:space="preserve">  :</w:t>
-      </w:r>
-      <w:proofErr w:type="gramEnd"/>
-      <w:r>
+        <w:rPr>
+          <w:highlight w:val="green"/>
+        </w:rPr>
+        <w:t xml:space="preserve">  :</w:t>
+      </w:r>
+      <w:proofErr w:type="gramEnd"/>
+      <w:r>
+        <w:rPr>
+          <w:highlight w:val="green"/>
+        </w:rPr>
         <w:t xml:space="preserve"> Fractional CFO</w:t>
       </w:r>
     </w:p>
-    <w:p/>
-    <w:p>
-      <w:r>
+    <w:p>
+      <w:pPr>
+        <w:rPr>
+          <w:highlight w:val="green"/>
+        </w:rPr>
+      </w:pPr>
+    </w:p>
+    <w:p>
+      <w:pPr>
+        <w:rPr>
+          <w:highlight w:val="green"/>
+        </w:rPr>
+      </w:pPr>
+      <w:r>
+        <w:rPr>
+          <w:highlight w:val="green"/>
+        </w:rPr>
         <w:t xml:space="preserve">Target Audience  </w:t>
       </w:r>
       <w:proofErr w:type="gramStart"/>
       <w:r>
-        <w:t xml:space="preserve">  :</w:t>
-      </w:r>
-      <w:proofErr w:type="gramEnd"/>
-      <w:r>
+        <w:rPr>
+          <w:highlight w:val="green"/>
+        </w:rPr>
+        <w:t xml:space="preserve">  :</w:t>
+      </w:r>
+      <w:proofErr w:type="gramEnd"/>
+      <w:r>
+        <w:rPr>
+          <w:highlight w:val="green"/>
+        </w:rPr>
         <w:t xml:space="preserve"> Founders and business owners of</w:t>
       </w:r>
     </w:p>
     <w:p>
-      <w:r>
+      <w:pPr>
+        <w:rPr>
+          <w:highlight w:val="green"/>
+        </w:rPr>
+      </w:pPr>
+      <w:r>
+        <w:rPr>
+          <w:highlight w:val="green"/>
+        </w:rPr>
         <w:t xml:space="preserve">                     SMEs and growth-stage startups</w:t>
       </w:r>
     </w:p>
     <w:p>
-      <w:r>
+      <w:pPr>
+        <w:rPr>
+          <w:highlight w:val="green"/>
+        </w:rPr>
+      </w:pPr>
+      <w:r>
+        <w:rPr>
+          <w:highlight w:val="green"/>
+        </w:rPr>
         <w:t xml:space="preserve">                     in UAE and Egypt</w:t>
       </w:r>
     </w:p>
-    <w:p/>
-    <w:p>
-      <w:r>
+    <w:p>
+      <w:pPr>
+        <w:rPr>
+          <w:highlight w:val="green"/>
+        </w:rPr>
+      </w:pPr>
+    </w:p>
+    <w:p>
+      <w:pPr>
+        <w:rPr>
+          <w:highlight w:val="green"/>
+        </w:rPr>
+      </w:pPr>
+      <w:r>
+        <w:rPr>
+          <w:highlight w:val="green"/>
+        </w:rPr>
         <w:t xml:space="preserve">MENA Country </w:t>
       </w:r>
       <w:proofErr w:type="gramStart"/>
       <w:r>
+        <w:rPr>
+          <w:highlight w:val="green"/>
+        </w:rPr>
         <w:t>Focus :</w:t>
       </w:r>
       <w:proofErr w:type="gramEnd"/>
       <w:r>
+        <w:rPr>
+          <w:highlight w:val="green"/>
+        </w:rPr>
         <w:t xml:space="preserve"> UAE, Egypt</w:t>
       </w:r>
     </w:p>
-    <w:p/>
-    <w:p>
-      <w:r>
+    <w:p>
+      <w:pPr>
+        <w:rPr>
+          <w:highlight w:val="green"/>
+        </w:rPr>
+      </w:pPr>
+    </w:p>
+    <w:p>
+      <w:pPr>
+        <w:rPr>
+          <w:highlight w:val="green"/>
+        </w:rPr>
+      </w:pPr>
+      <w:r>
+        <w:rPr>
+          <w:highlight w:val="green"/>
+        </w:rPr>
         <w:t xml:space="preserve">Primary Keyword  </w:t>
       </w:r>
       <w:proofErr w:type="gramStart"/>
       <w:r>
-        <w:t xml:space="preserve">  :</w:t>
-      </w:r>
-      <w:proofErr w:type="gramEnd"/>
-      <w:r>
+        <w:rPr>
+          <w:highlight w:val="green"/>
+        </w:rPr>
+        <w:t xml:space="preserve">  :</w:t>
+      </w:r>
+      <w:proofErr w:type="gramEnd"/>
+      <w:r>
+        <w:rPr>
+          <w:highlight w:val="green"/>
+        </w:rPr>
         <w:t xml:space="preserve"> "fractional CFO UAE"</w:t>
       </w:r>
     </w:p>
-    <w:p/>
-    <w:p>
-      <w:r>
+    <w:p>
+      <w:pPr>
+        <w:rPr>
+          <w:highlight w:val="green"/>
+        </w:rPr>
+      </w:pPr>
+    </w:p>
+    <w:p>
+      <w:pPr>
+        <w:rPr>
+          <w:highlight w:val="green"/>
+        </w:rPr>
+      </w:pPr>
+      <w:r>
+        <w:rPr>
+          <w:highlight w:val="green"/>
+        </w:rPr>
         <w:t xml:space="preserve">Secondary </w:t>
       </w:r>
       <w:proofErr w:type="gramStart"/>
       <w:r>
+        <w:rPr>
+          <w:highlight w:val="green"/>
+        </w:rPr>
         <w:t>Keywords :</w:t>
       </w:r>
       <w:proofErr w:type="gramEnd"/>
       <w:r>
+        <w:rPr>
+          <w:highlight w:val="green"/>
+        </w:rPr>
         <w:t xml:space="preserve"> outsourced CFO Middle East,</w:t>
       </w:r>
     </w:p>
     <w:p>
-      <w:r>
+      <w:pPr>
+        <w:rPr>
+          <w:highlight w:val="green"/>
+        </w:rPr>
+      </w:pPr>
+      <w:r>
+        <w:rPr>
+          <w:highlight w:val="green"/>
+        </w:rPr>
         <w:t xml:space="preserve">                     part-time CFO for SMEs,</w:t>
       </w:r>
     </w:p>
     <w:p>
-      <w:r>
+      <w:pPr>
+        <w:rPr>
+          <w:highlight w:val="green"/>
+        </w:rPr>
+      </w:pPr>
+      <w:r>
+        <w:rPr>
+          <w:highlight w:val="green"/>
+        </w:rPr>
         <w:t xml:space="preserve">                     financial leadership MENA</w:t>
       </w:r>
     </w:p>
-    <w:p/>
-    <w:p>
-      <w:r>
+    <w:p>
+      <w:pPr>
+        <w:rPr>
+          <w:highlight w:val="green"/>
+        </w:rPr>
+      </w:pPr>
+    </w:p>
+    <w:p>
+      <w:pPr>
+        <w:rPr>
+          <w:highlight w:val="green"/>
+        </w:rPr>
+      </w:pPr>
+      <w:r>
+        <w:rPr>
+          <w:highlight w:val="green"/>
+        </w:rPr>
         <w:t xml:space="preserve">Long-Tail </w:t>
       </w:r>
       <w:proofErr w:type="gramStart"/>
       <w:r>
+        <w:rPr>
+          <w:highlight w:val="green"/>
+        </w:rPr>
         <w:t>Keywords :</w:t>
       </w:r>
       <w:proofErr w:type="gramEnd"/>
       <w:r>
+        <w:rPr>
+          <w:highlight w:val="green"/>
+        </w:rPr>
         <w:t xml:space="preserve"> when does a startup need a CFO</w:t>
       </w:r>
     </w:p>
     <w:p>
-      <w:r>
+      <w:pPr>
+        <w:rPr>
+          <w:highlight w:val="green"/>
+        </w:rPr>
+      </w:pPr>
+      <w:r>
+        <w:rPr>
+          <w:highlight w:val="green"/>
+        </w:rPr>
         <w:t xml:space="preserve">                     in the Middle East,</w:t>
       </w:r>
     </w:p>
     <w:p>
-      <w:r>
+      <w:pPr>
+        <w:rPr>
+          <w:highlight w:val="green"/>
+        </w:rPr>
+      </w:pPr>
+      <w:r>
+        <w:rPr>
+          <w:highlight w:val="green"/>
+        </w:rPr>
         <w:t xml:space="preserve">                     fractional CFO services for small</w:t>
       </w:r>
     </w:p>
     <w:p>
-      <w:r>
+      <w:pPr>
+        <w:rPr>
+          <w:highlight w:val="green"/>
+        </w:rPr>
+      </w:pPr>
+      <w:r>
+        <w:rPr>
+          <w:highlight w:val="green"/>
+        </w:rPr>
         <w:t xml:space="preserve">                     businesses in Dubai,</w:t>
       </w:r>
     </w:p>
     <w:p>
-      <w:r>
+      <w:pPr>
+        <w:rPr>
+          <w:highlight w:val="green"/>
+        </w:rPr>
+      </w:pPr>
+      <w:r>
+        <w:rPr>
+          <w:highlight w:val="green"/>
+        </w:rPr>
         <w:t xml:space="preserve">                     signs you need a CFO Egypt startup</w:t>
       </w:r>
     </w:p>
-    <w:p/>
-    <w:p>
-      <w:r>
+    <w:p>
+      <w:pPr>
+        <w:rPr>
+          <w:highlight w:val="green"/>
+        </w:rPr>
+      </w:pPr>
+    </w:p>
+    <w:p>
+      <w:pPr>
+        <w:rPr>
+          <w:highlight w:val="green"/>
+        </w:rPr>
+      </w:pPr>
+      <w:r>
+        <w:rPr>
+          <w:highlight w:val="green"/>
+        </w:rPr>
         <w:t xml:space="preserve">Article Tone     </w:t>
       </w:r>
       <w:proofErr w:type="gramStart"/>
       <w:r>
-        <w:t xml:space="preserve">  :</w:t>
-      </w:r>
-      <w:proofErr w:type="gramEnd"/>
-      <w:r>
+        <w:rPr>
+          <w:highlight w:val="green"/>
+        </w:rPr>
+        <w:t xml:space="preserve">  :</w:t>
+      </w:r>
+      <w:proofErr w:type="gramEnd"/>
+      <w:r>
+        <w:rPr>
+          <w:highlight w:val="green"/>
+        </w:rPr>
         <w:t xml:space="preserve"> Educational</w:t>
       </w:r>
     </w:p>
-    <w:p/>
-    <w:p>
-      <w:r>
+    <w:p>
+      <w:pPr>
+        <w:rPr>
+          <w:highlight w:val="green"/>
+        </w:rPr>
+      </w:pPr>
+    </w:p>
+    <w:p>
+      <w:pPr>
+        <w:rPr>
+          <w:highlight w:val="green"/>
+        </w:rPr>
+      </w:pPr>
+      <w:r>
+        <w:rPr>
+          <w:highlight w:val="green"/>
+        </w:rPr>
         <w:t xml:space="preserve">Word Count       </w:t>
       </w:r>
       <w:proofErr w:type="gramStart"/>
       <w:r>
-        <w:t xml:space="preserve">  :</w:t>
-      </w:r>
-      <w:proofErr w:type="gramEnd"/>
-      <w:r>
+        <w:rPr>
+          <w:highlight w:val="green"/>
+        </w:rPr>
+        <w:t xml:space="preserve">  :</w:t>
+      </w:r>
+      <w:proofErr w:type="gramEnd"/>
+      <w:r>
+        <w:rPr>
+          <w:highlight w:val="green"/>
+        </w:rPr>
         <w:t xml:space="preserve"> 1,800 words</w:t>
       </w:r>
     </w:p>
-    <w:p/>
-    <w:p>
-      <w:r>
+    <w:p>
+      <w:pPr>
+        <w:rPr>
+          <w:highlight w:val="green"/>
+        </w:rPr>
+      </w:pPr>
+    </w:p>
+    <w:p>
+      <w:pPr>
+        <w:rPr>
+          <w:highlight w:val="green"/>
+        </w:rPr>
+      </w:pPr>
+      <w:r>
+        <w:rPr>
+          <w:highlight w:val="green"/>
+        </w:rPr>
         <w:t xml:space="preserve">Internal Links   </w:t>
       </w:r>
       <w:proofErr w:type="gramStart"/>
       <w:r>
-        <w:t xml:space="preserve">  :</w:t>
-      </w:r>
-      <w:proofErr w:type="gramEnd"/>
-      <w:r>
+        <w:rPr>
+          <w:highlight w:val="green"/>
+        </w:rPr>
+        <w:t xml:space="preserve">  :</w:t>
+      </w:r>
+      <w:proofErr w:type="gramEnd"/>
+      <w:r>
+        <w:rPr>
+          <w:highlight w:val="green"/>
+        </w:rPr>
         <w:t xml:space="preserve"> Fractional CFO service page</w:t>
       </w:r>
     </w:p>
-    <w:p/>
-    <w:p>
-      <w:r>
+    <w:p>
+      <w:pPr>
+        <w:rPr>
+          <w:highlight w:val="green"/>
+        </w:rPr>
+      </w:pPr>
+    </w:p>
+    <w:p>
+      <w:pPr>
+        <w:rPr>
+          <w:highlight w:val="green"/>
+        </w:rPr>
+      </w:pPr>
+      <w:r>
+        <w:rPr>
+          <w:highlight w:val="green"/>
+        </w:rPr>
         <w:t xml:space="preserve">CTA Goal         </w:t>
       </w:r>
       <w:proofErr w:type="gramStart"/>
       <w:r>
-        <w:t xml:space="preserve">  :</w:t>
-      </w:r>
-      <w:proofErr w:type="gramEnd"/>
-      <w:r>
+        <w:rPr>
+          <w:highlight w:val="green"/>
+        </w:rPr>
+        <w:t xml:space="preserve">  :</w:t>
+      </w:r>
+      <w:proofErr w:type="gramEnd"/>
+      <w:r>
+        <w:rPr>
+          <w:highlight w:val="green"/>
+        </w:rPr>
         <w:t xml:space="preserve"> Contact us for a free</w:t>
       </w:r>
     </w:p>
     <w:p>
-      <w:r>
+      <w:pPr>
+        <w:rPr>
+          <w:highlight w:val="green"/>
+        </w:rPr>
+      </w:pPr>
+      <w:r>
+        <w:rPr>
+          <w:highlight w:val="green"/>
+        </w:rPr>
         <w:t xml:space="preserve">                     CFO readiness assessment</w:t>
       </w:r>
     </w:p>
-    <w:p/>
-    <w:p>
-      <w:r>
+    <w:p>
+      <w:pPr>
+        <w:rPr>
+          <w:highlight w:val="green"/>
+        </w:rPr>
+      </w:pPr>
+    </w:p>
+    <w:p>
+      <w:pPr>
+        <w:rPr>
+          <w:highlight w:val="green"/>
+        </w:rPr>
+      </w:pPr>
+      <w:r>
+        <w:rPr>
+          <w:highlight w:val="green"/>
+        </w:rPr>
         <w:t xml:space="preserve">Extra Notes      </w:t>
       </w:r>
       <w:proofErr w:type="gramStart"/>
       <w:r>
-        <w:t xml:space="preserve">  :</w:t>
-      </w:r>
-      <w:proofErr w:type="gramEnd"/>
-      <w:r>
+        <w:rPr>
+          <w:highlight w:val="green"/>
+        </w:rPr>
+        <w:t xml:space="preserve">  :</w:t>
+      </w:r>
+      <w:proofErr w:type="gramEnd"/>
+      <w:r>
+        <w:rPr>
+          <w:highlight w:val="green"/>
+        </w:rPr>
         <w:t xml:space="preserve"> Emphasize cost-efficiency angle</w:t>
       </w:r>
     </w:p>
     <w:p>
-      <w:r>
+      <w:pPr>
+        <w:rPr>
+          <w:highlight w:val="green"/>
+        </w:rPr>
+      </w:pPr>
+      <w:r>
+        <w:rPr>
+          <w:highlight w:val="green"/>
+        </w:rPr>
         <w:t xml:space="preserve">                     vs full-time hire. Cover 5 pain</w:t>
       </w:r>
     </w:p>
     <w:p>
-      <w:r>
+      <w:pPr>
+        <w:rPr>
+          <w:highlight w:val="green"/>
+        </w:rPr>
+      </w:pPr>
+      <w:r>
+        <w:rPr>
+          <w:highlight w:val="green"/>
+        </w:rPr>
         <w:lastRenderedPageBreak/>
         <w:t xml:space="preserve">                     points: cash flow crises, investor</w:t>
       </w:r>
     </w:p>
     <w:p>
-      <w:r>
+      <w:pPr>
+        <w:rPr>
+          <w:highlight w:val="green"/>
+        </w:rPr>
+      </w:pPr>
+      <w:r>
+        <w:rPr>
+          <w:highlight w:val="green"/>
+        </w:rPr>
         <w:t xml:space="preserve">                     readiness gaps, rapid scaling,</w:t>
       </w:r>
     </w:p>
     <w:p>
-      <w:r>
+      <w:pPr>
+        <w:rPr>
+          <w:highlight w:val="green"/>
+        </w:rPr>
+      </w:pPr>
+      <w:r>
+        <w:rPr>
+          <w:highlight w:val="green"/>
+        </w:rPr>
         <w:t xml:space="preserve">                     poor financial visibility, and</w:t>
       </w:r>
     </w:p>
     <w:p>
-      <w:r>
+      <w:pPr>
+        <w:rPr>
+          <w:highlight w:val="green"/>
+        </w:rPr>
+      </w:pPr>
+      <w:r>
+        <w:rPr>
+          <w:highlight w:val="green"/>
+        </w:rPr>
         <w:t xml:space="preserve">                     failed fundraising. Reference</w:t>
       </w:r>
     </w:p>
     <w:p>
-      <w:r>
+      <w:pPr>
+        <w:rPr>
+          <w:highlight w:val="green"/>
+        </w:rPr>
+      </w:pPr>
+      <w:r>
+        <w:rPr>
+          <w:highlight w:val="green"/>
+        </w:rPr>
         <w:t xml:space="preserve">                     Egypt's growing fintech/startup</w:t>
       </w:r>
     </w:p>
     <w:p>
-      <w:r>
+      <w:pPr>
+        <w:rPr>
+          <w:highlight w:val="green"/>
+        </w:rPr>
+      </w:pPr>
+      <w:r>
+        <w:rPr>
+          <w:highlight w:val="green"/>
+        </w:rPr>
         <w:t xml:space="preserve">                     scene and UAE's expanding SME</w:t>
       </w:r>
     </w:p>
     <w:p>
-      <w:r>
+      <w:pPr>
+        <w:rPr>
+          <w:highlight w:val="green"/>
+        </w:rPr>
+      </w:pPr>
+      <w:r>
+        <w:rPr>
+          <w:highlight w:val="green"/>
+        </w:rPr>
         <w:t xml:space="preserve">                     ecosystem as market context.</w:t>
       </w:r>
     </w:p>
-    <w:p/>
-    <w:p>
-      <w:r>
+    <w:p>
+      <w:pPr>
+        <w:rPr>
+          <w:highlight w:val="green"/>
+        </w:rPr>
+      </w:pPr>
+    </w:p>
+    <w:p>
+      <w:pPr>
+        <w:rPr>
+          <w:highlight w:val="green"/>
+        </w:rPr>
+      </w:pPr>
+      <w:r>
+        <w:rPr>
+          <w:highlight w:val="green"/>
+        </w:rPr>
         <w:t>====================================================</w:t>
       </w:r>
     </w:p>
     <w:p>
+      <w:pPr>
+        <w:rPr>
+          <w:highlight w:val="green"/>
+        </w:rPr>
+      </w:pPr>
       <w:r>
         <w:rPr>
           <w:rFonts w:ascii="Segoe UI Emoji" w:hAnsi="Segoe UI Emoji" w:cs="Segoe UI Emoji"/>
+          <w:highlight w:val="green"/>
         </w:rPr>
         <w:t>▶</w:t>
       </w:r>
       <w:r>
+        <w:rPr>
+          <w:highlight w:val="green"/>
+        </w:rPr>
         <w:t xml:space="preserve"> Please generate the full article following</w:t>
       </w:r>
     </w:p>
     <w:p>
-      <w:r>
+      <w:pPr>
+        <w:rPr>
+          <w:highlight w:val="green"/>
+        </w:rPr>
+      </w:pPr>
+      <w:r>
+        <w:rPr>
+          <w:highlight w:val="green"/>
+        </w:rPr>
         <w:t xml:space="preserve">  the project instructions.</w:t>
       </w:r>
     </w:p>
     <w:p>
       <w:r>
+        <w:rPr>
+          <w:highlight w:val="green"/>
+        </w:rPr>
         <w:t>====================================================</w:t>
       </w:r>
     </w:p>
@@ -20410,6 +21354,7 @@
   <w:style w:type="character" w:default="1" w:styleId="DefaultParagraphFont">
     <w:name w:val="Default Paragraph Font"/>
     <w:uiPriority w:val="1"/>
+    <w:semiHidden/>
     <w:unhideWhenUsed/>
   </w:style>
   <w:style w:type="table" w:default="1" w:styleId="TableNormal">

</xml_diff>

<commit_message>
feat: testimonial with avatar photo + flexible grid (Marwan Diab)
</commit_message>
<xml_diff>
--- a/docs/Articles.docx
+++ b/docs/Articles.docx
@@ -13384,338 +13384,819 @@
       </w:r>
     </w:p>
     <w:p>
-      <w:r>
+      <w:pPr>
+        <w:rPr>
+          <w:highlight w:val="green"/>
+        </w:rPr>
+      </w:pPr>
+      <w:r>
+        <w:rPr>
+          <w:highlight w:val="green"/>
+        </w:rPr>
         <w:t>====================================================</w:t>
       </w:r>
     </w:p>
     <w:p>
+      <w:pPr>
+        <w:rPr>
+          <w:highlight w:val="green"/>
+        </w:rPr>
+      </w:pPr>
       <w:r>
         <w:rPr>
           <w:rFonts w:ascii="Segoe UI Emoji" w:hAnsi="Segoe UI Emoji" w:cs="Segoe UI Emoji"/>
+          <w:highlight w:val="green"/>
         </w:rPr>
         <w:t>📋</w:t>
       </w:r>
       <w:r>
+        <w:rPr>
+          <w:highlight w:val="green"/>
+        </w:rPr>
         <w:t xml:space="preserve"> NEW ARTICLE BRIEF</w:t>
       </w:r>
     </w:p>
     <w:p>
-      <w:r>
+      <w:pPr>
+        <w:rPr>
+          <w:highlight w:val="green"/>
+        </w:rPr>
+      </w:pPr>
+      <w:r>
+        <w:rPr>
+          <w:highlight w:val="green"/>
+        </w:rPr>
         <w:t>====================================================</w:t>
       </w:r>
     </w:p>
-    <w:p/>
-    <w:p>
-      <w:r>
+    <w:p>
+      <w:pPr>
+        <w:rPr>
+          <w:highlight w:val="green"/>
+        </w:rPr>
+      </w:pPr>
+    </w:p>
+    <w:p>
+      <w:pPr>
+        <w:rPr>
+          <w:highlight w:val="green"/>
+        </w:rPr>
+      </w:pPr>
+      <w:r>
+        <w:rPr>
+          <w:highlight w:val="green"/>
+        </w:rPr>
         <w:t xml:space="preserve">Title Idea       </w:t>
       </w:r>
       <w:proofErr w:type="gramStart"/>
       <w:r>
-        <w:t xml:space="preserve">  :</w:t>
-      </w:r>
-      <w:proofErr w:type="gramEnd"/>
-      <w:r>
+        <w:rPr>
+          <w:highlight w:val="green"/>
+        </w:rPr>
+        <w:t xml:space="preserve">  :</w:t>
+      </w:r>
+      <w:proofErr w:type="gramEnd"/>
+      <w:r>
+        <w:rPr>
+          <w:highlight w:val="green"/>
+        </w:rPr>
         <w:t xml:space="preserve"> Feasibility Studies for Real</w:t>
       </w:r>
     </w:p>
     <w:p>
-      <w:r>
+      <w:pPr>
+        <w:rPr>
+          <w:highlight w:val="green"/>
+        </w:rPr>
+      </w:pPr>
+      <w:r>
+        <w:rPr>
+          <w:highlight w:val="green"/>
+        </w:rPr>
         <w:lastRenderedPageBreak/>
         <w:t xml:space="preserve">                     Estate Projects in the UAE:</w:t>
       </w:r>
     </w:p>
     <w:p>
-      <w:r>
+      <w:pPr>
+        <w:rPr>
+          <w:highlight w:val="green"/>
+        </w:rPr>
+      </w:pPr>
+      <w:r>
+        <w:rPr>
+          <w:highlight w:val="green"/>
+        </w:rPr>
         <w:t xml:space="preserve">                     What Investors Must Know</w:t>
       </w:r>
     </w:p>
-    <w:p/>
-    <w:p>
-      <w:r>
+    <w:p>
+      <w:pPr>
+        <w:rPr>
+          <w:highlight w:val="green"/>
+        </w:rPr>
+      </w:pPr>
+    </w:p>
+    <w:p>
+      <w:pPr>
+        <w:rPr>
+          <w:highlight w:val="green"/>
+        </w:rPr>
+      </w:pPr>
+      <w:r>
+        <w:rPr>
+          <w:highlight w:val="green"/>
+        </w:rPr>
         <w:t xml:space="preserve">Primary Service  </w:t>
       </w:r>
       <w:proofErr w:type="gramStart"/>
       <w:r>
-        <w:t xml:space="preserve">  :</w:t>
-      </w:r>
-      <w:proofErr w:type="gramEnd"/>
-      <w:r>
+        <w:rPr>
+          <w:highlight w:val="green"/>
+        </w:rPr>
+        <w:t xml:space="preserve">  :</w:t>
+      </w:r>
+      <w:proofErr w:type="gramEnd"/>
+      <w:r>
+        <w:rPr>
+          <w:highlight w:val="green"/>
+        </w:rPr>
         <w:t xml:space="preserve"> Feasibility Studies</w:t>
       </w:r>
     </w:p>
-    <w:p/>
-    <w:p>
-      <w:r>
+    <w:p>
+      <w:pPr>
+        <w:rPr>
+          <w:highlight w:val="green"/>
+        </w:rPr>
+      </w:pPr>
+    </w:p>
+    <w:p>
+      <w:pPr>
+        <w:rPr>
+          <w:highlight w:val="green"/>
+        </w:rPr>
+      </w:pPr>
+      <w:r>
+        <w:rPr>
+          <w:highlight w:val="green"/>
+        </w:rPr>
         <w:t xml:space="preserve">Target Audience  </w:t>
       </w:r>
       <w:proofErr w:type="gramStart"/>
       <w:r>
-        <w:t xml:space="preserve">  :</w:t>
-      </w:r>
-      <w:proofErr w:type="gramEnd"/>
-      <w:r>
+        <w:rPr>
+          <w:highlight w:val="green"/>
+        </w:rPr>
+        <w:t xml:space="preserve">  :</w:t>
+      </w:r>
+      <w:proofErr w:type="gramEnd"/>
+      <w:r>
+        <w:rPr>
+          <w:highlight w:val="green"/>
+        </w:rPr>
         <w:t xml:space="preserve"> Real estate developers, investors,</w:t>
       </w:r>
     </w:p>
     <w:p>
-      <w:r>
+      <w:pPr>
+        <w:rPr>
+          <w:highlight w:val="green"/>
+        </w:rPr>
+      </w:pPr>
+      <w:r>
+        <w:rPr>
+          <w:highlight w:val="green"/>
+        </w:rPr>
         <w:t xml:space="preserve">                     and project owners in the UAE</w:t>
       </w:r>
     </w:p>
     <w:p>
-      <w:r>
+      <w:pPr>
+        <w:rPr>
+          <w:highlight w:val="green"/>
+        </w:rPr>
+      </w:pPr>
+      <w:r>
+        <w:rPr>
+          <w:highlight w:val="green"/>
+        </w:rPr>
         <w:t xml:space="preserve">                     evaluating new property projects</w:t>
       </w:r>
     </w:p>
-    <w:p/>
-    <w:p>
-      <w:r>
+    <w:p>
+      <w:pPr>
+        <w:rPr>
+          <w:highlight w:val="green"/>
+        </w:rPr>
+      </w:pPr>
+    </w:p>
+    <w:p>
+      <w:pPr>
+        <w:rPr>
+          <w:highlight w:val="green"/>
+        </w:rPr>
+      </w:pPr>
+      <w:r>
+        <w:rPr>
+          <w:highlight w:val="green"/>
+        </w:rPr>
         <w:t xml:space="preserve">MENA Country </w:t>
       </w:r>
       <w:proofErr w:type="gramStart"/>
       <w:r>
+        <w:rPr>
+          <w:highlight w:val="green"/>
+        </w:rPr>
         <w:t>Focus :</w:t>
       </w:r>
       <w:proofErr w:type="gramEnd"/>
       <w:r>
+        <w:rPr>
+          <w:highlight w:val="green"/>
+        </w:rPr>
         <w:t xml:space="preserve"> UAE</w:t>
       </w:r>
     </w:p>
-    <w:p/>
-    <w:p>
-      <w:r>
+    <w:p>
+      <w:pPr>
+        <w:rPr>
+          <w:highlight w:val="green"/>
+        </w:rPr>
+      </w:pPr>
+    </w:p>
+    <w:p>
+      <w:pPr>
+        <w:rPr>
+          <w:highlight w:val="green"/>
+        </w:rPr>
+      </w:pPr>
+      <w:r>
+        <w:rPr>
+          <w:highlight w:val="green"/>
+        </w:rPr>
         <w:t xml:space="preserve">Primary Keyword  </w:t>
       </w:r>
       <w:proofErr w:type="gramStart"/>
       <w:r>
-        <w:t xml:space="preserve">  :</w:t>
-      </w:r>
-      <w:proofErr w:type="gramEnd"/>
-      <w:r>
+        <w:rPr>
+          <w:highlight w:val="green"/>
+        </w:rPr>
+        <w:t xml:space="preserve">  :</w:t>
+      </w:r>
+      <w:proofErr w:type="gramEnd"/>
+      <w:r>
+        <w:rPr>
+          <w:highlight w:val="green"/>
+        </w:rPr>
         <w:t xml:space="preserve"> "real estate feasibility study UAE"</w:t>
       </w:r>
     </w:p>
-    <w:p/>
-    <w:p>
-      <w:r>
+    <w:p>
+      <w:pPr>
+        <w:rPr>
+          <w:highlight w:val="green"/>
+        </w:rPr>
+      </w:pPr>
+    </w:p>
+    <w:p>
+      <w:pPr>
+        <w:rPr>
+          <w:highlight w:val="green"/>
+        </w:rPr>
+      </w:pPr>
+      <w:r>
+        <w:rPr>
+          <w:highlight w:val="green"/>
+        </w:rPr>
         <w:t xml:space="preserve">Secondary </w:t>
       </w:r>
       <w:proofErr w:type="gramStart"/>
       <w:r>
+        <w:rPr>
+          <w:highlight w:val="green"/>
+        </w:rPr>
         <w:t>Keywords :</w:t>
       </w:r>
       <w:proofErr w:type="gramEnd"/>
       <w:r>
+        <w:rPr>
+          <w:highlight w:val="green"/>
+        </w:rPr>
         <w:t xml:space="preserve"> property investment analysis Dubai,</w:t>
       </w:r>
     </w:p>
     <w:p>
-      <w:r>
+      <w:pPr>
+        <w:rPr>
+          <w:highlight w:val="green"/>
+        </w:rPr>
+      </w:pPr>
+      <w:r>
+        <w:rPr>
+          <w:highlight w:val="green"/>
+        </w:rPr>
         <w:t xml:space="preserve">                     real estate ROI assessment UAE,</w:t>
       </w:r>
     </w:p>
     <w:p>
-      <w:r>
+      <w:pPr>
+        <w:rPr>
+          <w:highlight w:val="green"/>
+        </w:rPr>
+      </w:pPr>
+      <w:r>
+        <w:rPr>
+          <w:highlight w:val="green"/>
+        </w:rPr>
         <w:t xml:space="preserve">                     development feasibility Abu Dhabi</w:t>
       </w:r>
     </w:p>
-    <w:p/>
-    <w:p>
-      <w:r>
+    <w:p>
+      <w:pPr>
+        <w:rPr>
+          <w:highlight w:val="green"/>
+        </w:rPr>
+      </w:pPr>
+    </w:p>
+    <w:p>
+      <w:pPr>
+        <w:rPr>
+          <w:highlight w:val="green"/>
+        </w:rPr>
+      </w:pPr>
+      <w:r>
+        <w:rPr>
+          <w:highlight w:val="green"/>
+        </w:rPr>
         <w:t xml:space="preserve">Long-Tail </w:t>
       </w:r>
       <w:proofErr w:type="gramStart"/>
       <w:r>
+        <w:rPr>
+          <w:highlight w:val="green"/>
+        </w:rPr>
         <w:t>Keywords :</w:t>
       </w:r>
       <w:proofErr w:type="gramEnd"/>
       <w:r>
+        <w:rPr>
+          <w:highlight w:val="green"/>
+        </w:rPr>
         <w:t xml:space="preserve"> how to conduct a feasibility study</w:t>
       </w:r>
     </w:p>
     <w:p>
-      <w:r>
+      <w:pPr>
+        <w:rPr>
+          <w:highlight w:val="green"/>
+        </w:rPr>
+      </w:pPr>
+      <w:r>
+        <w:rPr>
+          <w:highlight w:val="green"/>
+        </w:rPr>
         <w:t xml:space="preserve">                     for a real estate project in Dubai,</w:t>
       </w:r>
     </w:p>
     <w:p>
-      <w:r>
+      <w:pPr>
+        <w:rPr>
+          <w:highlight w:val="green"/>
+        </w:rPr>
+      </w:pPr>
+      <w:r>
+        <w:rPr>
+          <w:highlight w:val="green"/>
+        </w:rPr>
         <w:t xml:space="preserve">                     real estate investment analysis</w:t>
       </w:r>
     </w:p>
     <w:p>
-      <w:r>
+      <w:pPr>
+        <w:rPr>
+          <w:highlight w:val="green"/>
+        </w:rPr>
+      </w:pPr>
+      <w:r>
+        <w:rPr>
+          <w:highlight w:val="green"/>
+        </w:rPr>
         <w:t xml:space="preserve">                     Abu Dhabi 2025,</w:t>
       </w:r>
     </w:p>
     <w:p>
-      <w:r>
+      <w:pPr>
+        <w:rPr>
+          <w:highlight w:val="green"/>
+        </w:rPr>
+      </w:pPr>
+      <w:r>
+        <w:rPr>
+          <w:highlight w:val="green"/>
+        </w:rPr>
         <w:t xml:space="preserve">                     feasibility assessment for off-plan</w:t>
       </w:r>
     </w:p>
     <w:p>
-      <w:r>
+      <w:pPr>
+        <w:rPr>
+          <w:highlight w:val="green"/>
+        </w:rPr>
+      </w:pPr>
+      <w:r>
+        <w:rPr>
+          <w:highlight w:val="green"/>
+        </w:rPr>
         <w:t xml:space="preserve">                     development UAE</w:t>
       </w:r>
     </w:p>
-    <w:p/>
-    <w:p>
-      <w:r>
+    <w:p>
+      <w:pPr>
+        <w:rPr>
+          <w:highlight w:val="green"/>
+        </w:rPr>
+      </w:pPr>
+    </w:p>
+    <w:p>
+      <w:pPr>
+        <w:rPr>
+          <w:highlight w:val="green"/>
+        </w:rPr>
+      </w:pPr>
+      <w:r>
+        <w:rPr>
+          <w:highlight w:val="green"/>
+        </w:rPr>
         <w:t xml:space="preserve">Article Tone     </w:t>
       </w:r>
       <w:proofErr w:type="gramStart"/>
       <w:r>
-        <w:t xml:space="preserve">  :</w:t>
-      </w:r>
-      <w:proofErr w:type="gramEnd"/>
-      <w:r>
+        <w:rPr>
+          <w:highlight w:val="green"/>
+        </w:rPr>
+        <w:t xml:space="preserve">  :</w:t>
+      </w:r>
+      <w:proofErr w:type="gramEnd"/>
+      <w:r>
+        <w:rPr>
+          <w:highlight w:val="green"/>
+        </w:rPr>
         <w:t xml:space="preserve"> Educational / Practical</w:t>
       </w:r>
     </w:p>
-    <w:p/>
-    <w:p>
-      <w:r>
+    <w:p>
+      <w:pPr>
+        <w:rPr>
+          <w:highlight w:val="green"/>
+        </w:rPr>
+      </w:pPr>
+    </w:p>
+    <w:p>
+      <w:pPr>
+        <w:rPr>
+          <w:highlight w:val="green"/>
+        </w:rPr>
+      </w:pPr>
+      <w:r>
+        <w:rPr>
+          <w:highlight w:val="green"/>
+        </w:rPr>
         <w:t xml:space="preserve">Word Count       </w:t>
       </w:r>
       <w:proofErr w:type="gramStart"/>
       <w:r>
-        <w:t xml:space="preserve">  :</w:t>
-      </w:r>
-      <w:proofErr w:type="gramEnd"/>
-      <w:r>
+        <w:rPr>
+          <w:highlight w:val="green"/>
+        </w:rPr>
+        <w:t xml:space="preserve">  :</w:t>
+      </w:r>
+      <w:proofErr w:type="gramEnd"/>
+      <w:r>
+        <w:rPr>
+          <w:highlight w:val="green"/>
+        </w:rPr>
         <w:t xml:space="preserve"> 2,000 words</w:t>
       </w:r>
     </w:p>
-    <w:p/>
-    <w:p>
-      <w:r>
+    <w:p>
+      <w:pPr>
+        <w:rPr>
+          <w:highlight w:val="green"/>
+        </w:rPr>
+      </w:pPr>
+    </w:p>
+    <w:p>
+      <w:pPr>
+        <w:rPr>
+          <w:highlight w:val="green"/>
+        </w:rPr>
+      </w:pPr>
+      <w:r>
+        <w:rPr>
+          <w:highlight w:val="green"/>
+        </w:rPr>
         <w:t xml:space="preserve">Internal Links   </w:t>
       </w:r>
       <w:proofErr w:type="gramStart"/>
       <w:r>
-        <w:t xml:space="preserve">  :</w:t>
-      </w:r>
-      <w:proofErr w:type="gramEnd"/>
-      <w:r>
+        <w:rPr>
+          <w:highlight w:val="green"/>
+        </w:rPr>
+        <w:t xml:space="preserve">  :</w:t>
+      </w:r>
+      <w:proofErr w:type="gramEnd"/>
+      <w:r>
+        <w:rPr>
+          <w:highlight w:val="green"/>
+        </w:rPr>
         <w:t xml:space="preserve"> Feasibility Studies service page</w:t>
       </w:r>
     </w:p>
-    <w:p/>
-    <w:p>
-      <w:r>
+    <w:p>
+      <w:pPr>
+        <w:rPr>
+          <w:highlight w:val="green"/>
+        </w:rPr>
+      </w:pPr>
+    </w:p>
+    <w:p>
+      <w:pPr>
+        <w:rPr>
+          <w:highlight w:val="green"/>
+        </w:rPr>
+      </w:pPr>
+      <w:r>
+        <w:rPr>
+          <w:highlight w:val="green"/>
+        </w:rPr>
         <w:lastRenderedPageBreak/>
         <w:t xml:space="preserve">CTA Goal         </w:t>
       </w:r>
       <w:proofErr w:type="gramStart"/>
       <w:r>
-        <w:t xml:space="preserve">  :</w:t>
-      </w:r>
-      <w:proofErr w:type="gramEnd"/>
-      <w:r>
+        <w:rPr>
+          <w:highlight w:val="green"/>
+        </w:rPr>
+        <w:t xml:space="preserve">  :</w:t>
+      </w:r>
+      <w:proofErr w:type="gramEnd"/>
+      <w:r>
+        <w:rPr>
+          <w:highlight w:val="green"/>
+        </w:rPr>
         <w:t xml:space="preserve"> Request a real estate feasibility</w:t>
       </w:r>
     </w:p>
     <w:p>
-      <w:r>
+      <w:pPr>
+        <w:rPr>
+          <w:highlight w:val="green"/>
+        </w:rPr>
+      </w:pPr>
+      <w:r>
+        <w:rPr>
+          <w:highlight w:val="green"/>
+        </w:rPr>
         <w:t xml:space="preserve">                     study from our advisory team</w:t>
       </w:r>
     </w:p>
-    <w:p/>
-    <w:p>
-      <w:r>
+    <w:p>
+      <w:pPr>
+        <w:rPr>
+          <w:highlight w:val="green"/>
+        </w:rPr>
+      </w:pPr>
+    </w:p>
+    <w:p>
+      <w:pPr>
+        <w:rPr>
+          <w:highlight w:val="green"/>
+        </w:rPr>
+      </w:pPr>
+      <w:r>
+        <w:rPr>
+          <w:highlight w:val="green"/>
+        </w:rPr>
         <w:t xml:space="preserve">Extra Notes      </w:t>
       </w:r>
       <w:proofErr w:type="gramStart"/>
       <w:r>
-        <w:t xml:space="preserve">  :</w:t>
-      </w:r>
-      <w:proofErr w:type="gramEnd"/>
-      <w:r>
+        <w:rPr>
+          <w:highlight w:val="green"/>
+        </w:rPr>
+        <w:t xml:space="preserve">  :</w:t>
+      </w:r>
+      <w:proofErr w:type="gramEnd"/>
+      <w:r>
+        <w:rPr>
+          <w:highlight w:val="green"/>
+        </w:rPr>
         <w:t xml:space="preserve"> Reference that UAE real estate and</w:t>
       </w:r>
     </w:p>
     <w:p>
-      <w:r>
+      <w:pPr>
+        <w:rPr>
+          <w:highlight w:val="green"/>
+        </w:rPr>
+      </w:pPr>
+      <w:r>
+        <w:rPr>
+          <w:highlight w:val="green"/>
+        </w:rPr>
         <w:t xml:space="preserve">                     hospitality sectors accounted for</w:t>
       </w:r>
     </w:p>
     <w:p>
-      <w:r>
+      <w:pPr>
+        <w:rPr>
+          <w:highlight w:val="green"/>
+        </w:rPr>
+      </w:pPr>
+      <w:r>
+        <w:rPr>
+          <w:highlight w:val="green"/>
+        </w:rPr>
         <w:t xml:space="preserve">                     part of the 55% domestic M&amp;A value</w:t>
       </w:r>
     </w:p>
     <w:p>
-      <w:r>
+      <w:pPr>
+        <w:rPr>
+          <w:highlight w:val="green"/>
+        </w:rPr>
+      </w:pPr>
+      <w:r>
+        <w:rPr>
+          <w:highlight w:val="green"/>
+        </w:rPr>
         <w:t xml:space="preserve">                     per EY 2025 data. Cover key</w:t>
       </w:r>
     </w:p>
     <w:p>
-      <w:r>
+      <w:pPr>
+        <w:rPr>
+          <w:highlight w:val="green"/>
+        </w:rPr>
+      </w:pPr>
+      <w:r>
+        <w:rPr>
+          <w:highlight w:val="green"/>
+        </w:rPr>
         <w:t xml:space="preserve">                     feasibility components: location</w:t>
       </w:r>
     </w:p>
     <w:p>
-      <w:r>
+      <w:pPr>
+        <w:rPr>
+          <w:highlight w:val="green"/>
+        </w:rPr>
+      </w:pPr>
+      <w:r>
+        <w:rPr>
+          <w:highlight w:val="green"/>
+        </w:rPr>
         <w:t xml:space="preserve">                     analysis, demand assessment,</w:t>
       </w:r>
     </w:p>
     <w:p>
-      <w:r>
+      <w:pPr>
+        <w:rPr>
+          <w:highlight w:val="green"/>
+        </w:rPr>
+      </w:pPr>
+      <w:r>
+        <w:rPr>
+          <w:highlight w:val="green"/>
+        </w:rPr>
         <w:t xml:space="preserve">                     financial modeling (IRR, NPV),</w:t>
       </w:r>
     </w:p>
     <w:p>
-      <w:r>
+      <w:pPr>
+        <w:rPr>
+          <w:highlight w:val="green"/>
+        </w:rPr>
+      </w:pPr>
+      <w:r>
+        <w:rPr>
+          <w:highlight w:val="green"/>
+        </w:rPr>
         <w:t xml:space="preserve">                     regulatory approvals (DLD, RERA,</w:t>
       </w:r>
     </w:p>
     <w:p>
-      <w:r>
+      <w:pPr>
+        <w:rPr>
+          <w:highlight w:val="green"/>
+        </w:rPr>
+      </w:pPr>
+      <w:r>
+        <w:rPr>
+          <w:highlight w:val="green"/>
+        </w:rPr>
         <w:t xml:space="preserve">                     Abu Dhabi </w:t>
       </w:r>
       <w:proofErr w:type="spellStart"/>
       <w:r>
+        <w:rPr>
+          <w:highlight w:val="green"/>
+        </w:rPr>
         <w:t>DoM</w:t>
       </w:r>
       <w:proofErr w:type="spellEnd"/>
       <w:r>
+        <w:rPr>
+          <w:highlight w:val="green"/>
+        </w:rPr>
         <w:t>), and competitive</w:t>
       </w:r>
     </w:p>
     <w:p>
-      <w:r>
+      <w:pPr>
+        <w:rPr>
+          <w:highlight w:val="green"/>
+        </w:rPr>
+      </w:pPr>
+      <w:r>
+        <w:rPr>
+          <w:highlight w:val="green"/>
+        </w:rPr>
         <w:t xml:space="preserve">                     landscape. Include a checklist</w:t>
       </w:r>
     </w:p>
     <w:p>
-      <w:r>
+      <w:pPr>
+        <w:rPr>
+          <w:highlight w:val="green"/>
+        </w:rPr>
+      </w:pPr>
+      <w:r>
+        <w:rPr>
+          <w:highlight w:val="green"/>
+        </w:rPr>
         <w:t xml:space="preserve">                     for investors.</w:t>
       </w:r>
     </w:p>
-    <w:p/>
-    <w:p>
-      <w:r>
+    <w:p>
+      <w:pPr>
+        <w:rPr>
+          <w:highlight w:val="green"/>
+        </w:rPr>
+      </w:pPr>
+    </w:p>
+    <w:p>
+      <w:pPr>
+        <w:rPr>
+          <w:highlight w:val="green"/>
+        </w:rPr>
+      </w:pPr>
+      <w:r>
+        <w:rPr>
+          <w:highlight w:val="green"/>
+        </w:rPr>
         <w:t>====================================================</w:t>
       </w:r>
     </w:p>
     <w:p>
+      <w:pPr>
+        <w:rPr>
+          <w:highlight w:val="green"/>
+        </w:rPr>
+      </w:pPr>
       <w:r>
         <w:rPr>
           <w:rFonts w:ascii="Segoe UI Emoji" w:hAnsi="Segoe UI Emoji" w:cs="Segoe UI Emoji"/>
+          <w:highlight w:val="green"/>
         </w:rPr>
         <w:t>▶</w:t>
       </w:r>
       <w:r>
+        <w:rPr>
+          <w:highlight w:val="green"/>
+        </w:rPr>
         <w:t xml:space="preserve"> Please generate the full article following</w:t>
       </w:r>
     </w:p>
     <w:p>
-      <w:r>
+      <w:pPr>
+        <w:rPr>
+          <w:highlight w:val="green"/>
+        </w:rPr>
+      </w:pPr>
+      <w:r>
+        <w:rPr>
+          <w:highlight w:val="green"/>
+        </w:rPr>
         <w:t xml:space="preserve">  the project instructions.</w:t>
       </w:r>
     </w:p>
     <w:p>
       <w:r>
+        <w:rPr>
+          <w:highlight w:val="green"/>
+        </w:rPr>
         <w:t>====================================================</w:t>
       </w:r>
     </w:p>

</xml_diff>